<commit_message>
docs: condense DANH_MUC_KY_HIEU_VA_CHU_VIET_TAT.docx to 21 core terms used in report
</commit_message>
<xml_diff>
--- a/03_Tai_Lieu_Do_An/06_Bao_Cao_Ket_Qua_Do_An/DANH_MUC_KY_HIEU_VA_CHU_VIET_TAT.docx
+++ b/03_Tai_Lieu_Do_An/06_Bao_Cao_Ket_Qua_Do_An/DANH_MUC_KY_HIEU_VA_CHU_VIET_TAT.docx
@@ -4,7 +4,7 @@
   <w:body>
     <w:p>
       <w:pPr>
-        <w:spacing w:before="240" w:after="360" w:line="312" w:lineRule="auto"/>
+        <w:spacing w:before="160" w:after="240" w:line="312" w:lineRule="auto"/>
         <w:ind w:firstLine="0"/>
         <w:jc w:val="center"/>
       </w:pPr>
@@ -38,10 +38,10 @@
           <w:tcPr>
             <w:tcW w:type="dxa" w:w="1417"/>
             <w:tcMar>
-              <w:top w:w="100" w:type="dxa"/>
-              <w:bottom w:w="100" w:type="dxa"/>
-              <w:left w:w="120" w:type="dxa"/>
-              <w:right w:w="120" w:type="dxa"/>
+              <w:top w:w="70" w:type="dxa"/>
+              <w:bottom w:w="70" w:type="dxa"/>
+              <w:left w:w="100" w:type="dxa"/>
+              <w:right w:w="100" w:type="dxa"/>
             </w:tcMar>
             <w:tcBorders>
               <w:top w:val="single" w:sz="4" w:space="0" w:color="000000"/>
@@ -52,7 +52,7 @@
           </w:tcPr>
           <w:p>
             <w:pPr>
-              <w:spacing w:line="312" w:lineRule="auto" w:before="0" w:after="0"/>
+              <w:spacing w:line="288" w:lineRule="auto" w:before="0" w:after="0"/>
               <w:ind w:firstLine="0"/>
               <w:jc w:val="center"/>
             </w:pPr>
@@ -71,10 +71,10 @@
           <w:tcPr>
             <w:tcW w:type="dxa" w:w="3118"/>
             <w:tcMar>
-              <w:top w:w="100" w:type="dxa"/>
-              <w:bottom w:w="100" w:type="dxa"/>
-              <w:left w:w="120" w:type="dxa"/>
-              <w:right w:w="120" w:type="dxa"/>
+              <w:top w:w="70" w:type="dxa"/>
+              <w:bottom w:w="70" w:type="dxa"/>
+              <w:left w:w="100" w:type="dxa"/>
+              <w:right w:w="100" w:type="dxa"/>
             </w:tcMar>
             <w:tcBorders>
               <w:top w:val="single" w:sz="4" w:space="0" w:color="000000"/>
@@ -85,7 +85,7 @@
           </w:tcPr>
           <w:p>
             <w:pPr>
-              <w:spacing w:line="312" w:lineRule="auto" w:before="0" w:after="0"/>
+              <w:spacing w:line="288" w:lineRule="auto" w:before="0" w:after="0"/>
               <w:ind w:firstLine="0"/>
               <w:jc w:val="center"/>
             </w:pPr>
@@ -104,10 +104,10 @@
           <w:tcPr>
             <w:tcW w:type="dxa" w:w="3969"/>
             <w:tcMar>
-              <w:top w:w="100" w:type="dxa"/>
-              <w:bottom w:w="100" w:type="dxa"/>
-              <w:left w:w="120" w:type="dxa"/>
-              <w:right w:w="120" w:type="dxa"/>
+              <w:top w:w="70" w:type="dxa"/>
+              <w:bottom w:w="70" w:type="dxa"/>
+              <w:left w:w="100" w:type="dxa"/>
+              <w:right w:w="100" w:type="dxa"/>
             </w:tcMar>
             <w:tcBorders>
               <w:top w:val="single" w:sz="4" w:space="0" w:color="000000"/>
@@ -118,7 +118,7 @@
           </w:tcPr>
           <w:p>
             <w:pPr>
-              <w:spacing w:line="312" w:lineRule="auto" w:before="0" w:after="0"/>
+              <w:spacing w:line="288" w:lineRule="auto" w:before="0" w:after="0"/>
               <w:ind w:firstLine="0"/>
               <w:jc w:val="center"/>
             </w:pPr>
@@ -142,10 +142,10 @@
           <w:tcPr>
             <w:tcW w:type="dxa" w:w="1417"/>
             <w:tcMar>
-              <w:top w:w="80" w:type="dxa"/>
-              <w:bottom w:w="80" w:type="dxa"/>
-              <w:left w:w="120" w:type="dxa"/>
-              <w:right w:w="120" w:type="dxa"/>
+              <w:top w:w="50" w:type="dxa"/>
+              <w:bottom w:w="50" w:type="dxa"/>
+              <w:left w:w="100" w:type="dxa"/>
+              <w:right w:w="100" w:type="dxa"/>
             </w:tcMar>
             <w:tcBorders>
               <w:top w:val="single" w:sz="4" w:space="0" w:color="000000"/>
@@ -156,7 +156,7 @@
           </w:tcPr>
           <w:p>
             <w:pPr>
-              <w:spacing w:line="312" w:lineRule="auto" w:before="0" w:after="0"/>
+              <w:spacing w:line="288" w:lineRule="auto" w:before="0" w:after="0"/>
               <w:ind w:firstLine="0"/>
               <w:jc w:val="center"/>
             </w:pPr>
@@ -165,7 +165,7 @@
                 <w:rFonts w:ascii="Times New Roman" w:hAnsi="Times New Roman"/>
                 <w:b/>
                 <w:color w:val="000000"/>
-                <w:sz w:val="24"/>
+                <w:sz w:val="23"/>
               </w:rPr>
               <w:t>ACID</w:t>
             </w:r>
@@ -175,10 +175,10 @@
           <w:tcPr>
             <w:tcW w:type="dxa" w:w="3118"/>
             <w:tcMar>
-              <w:top w:w="80" w:type="dxa"/>
-              <w:bottom w:w="80" w:type="dxa"/>
-              <w:left w:w="120" w:type="dxa"/>
-              <w:right w:w="120" w:type="dxa"/>
+              <w:top w:w="50" w:type="dxa"/>
+              <w:bottom w:w="50" w:type="dxa"/>
+              <w:left w:w="100" w:type="dxa"/>
+              <w:right w:w="100" w:type="dxa"/>
             </w:tcMar>
             <w:tcBorders>
               <w:top w:val="single" w:sz="4" w:space="0" w:color="000000"/>
@@ -189,7 +189,7 @@
           </w:tcPr>
           <w:p>
             <w:pPr>
-              <w:spacing w:line="312" w:lineRule="auto" w:before="0" w:after="0"/>
+              <w:spacing w:line="288" w:lineRule="auto" w:before="0" w:after="0"/>
               <w:ind w:firstLine="0"/>
               <w:jc w:val="left"/>
             </w:pPr>
@@ -197,7 +197,7 @@
               <w:rPr>
                 <w:rFonts w:ascii="Times New Roman" w:hAnsi="Times New Roman"/>
                 <w:color w:val="000000"/>
-                <w:sz w:val="24"/>
+                <w:sz w:val="23"/>
               </w:rPr>
               <w:t>Atomicity, Consistency, Isolation, Durability</w:t>
             </w:r>
@@ -207,10 +207,10 @@
           <w:tcPr>
             <w:tcW w:type="dxa" w:w="3969"/>
             <w:tcMar>
-              <w:top w:w="80" w:type="dxa"/>
-              <w:bottom w:w="80" w:type="dxa"/>
-              <w:left w:w="120" w:type="dxa"/>
-              <w:right w:w="120" w:type="dxa"/>
+              <w:top w:w="50" w:type="dxa"/>
+              <w:bottom w:w="50" w:type="dxa"/>
+              <w:left w:w="100" w:type="dxa"/>
+              <w:right w:w="100" w:type="dxa"/>
             </w:tcMar>
             <w:tcBorders>
               <w:top w:val="single" w:sz="4" w:space="0" w:color="000000"/>
@@ -221,7 +221,7 @@
           </w:tcPr>
           <w:p>
             <w:pPr>
-              <w:spacing w:line="312" w:lineRule="auto" w:before="0" w:after="0"/>
+              <w:spacing w:line="288" w:lineRule="auto" w:before="0" w:after="0"/>
               <w:ind w:firstLine="0"/>
               <w:jc w:val="left"/>
             </w:pPr>
@@ -229,9 +229,9 @@
               <w:rPr>
                 <w:rFonts w:ascii="Times New Roman" w:hAnsi="Times New Roman"/>
                 <w:color w:val="000000"/>
-                <w:sz w:val="24"/>
+                <w:sz w:val="23"/>
               </w:rPr>
-              <w:t>Bốn thuộc tính giao dịch cơ sở dữ liệu truyền thống (Nguyên tử, Nhất quán, Cô lập, Bền vững)</w:t>
+              <w:t>Bốn thuộc tính giao dịch cơ sở dữ liệu truyền thống</w:t>
             </w:r>
           </w:p>
         </w:tc>
@@ -244,10 +244,10 @@
           <w:tcPr>
             <w:tcW w:type="dxa" w:w="1417"/>
             <w:tcMar>
-              <w:top w:w="80" w:type="dxa"/>
-              <w:bottom w:w="80" w:type="dxa"/>
-              <w:left w:w="120" w:type="dxa"/>
-              <w:right w:w="120" w:type="dxa"/>
+              <w:top w:w="50" w:type="dxa"/>
+              <w:bottom w:w="50" w:type="dxa"/>
+              <w:left w:w="100" w:type="dxa"/>
+              <w:right w:w="100" w:type="dxa"/>
             </w:tcMar>
             <w:tcBorders>
               <w:top w:val="single" w:sz="4" w:space="0" w:color="000000"/>
@@ -258,7 +258,7 @@
           </w:tcPr>
           <w:p>
             <w:pPr>
-              <w:spacing w:line="312" w:lineRule="auto" w:before="0" w:after="0"/>
+              <w:spacing w:line="288" w:lineRule="auto" w:before="0" w:after="0"/>
               <w:ind w:firstLine="0"/>
               <w:jc w:val="center"/>
             </w:pPr>
@@ -267,9 +267,9 @@
                 <w:rFonts w:ascii="Times New Roman" w:hAnsi="Times New Roman"/>
                 <w:b/>
                 <w:color w:val="000000"/>
-                <w:sz w:val="24"/>
+                <w:sz w:val="23"/>
               </w:rPr>
-              <w:t>AOF</w:t>
+              <w:t>AP</w:t>
             </w:r>
           </w:p>
         </w:tc>
@@ -277,10 +277,10 @@
           <w:tcPr>
             <w:tcW w:type="dxa" w:w="3118"/>
             <w:tcMar>
-              <w:top w:w="80" w:type="dxa"/>
-              <w:bottom w:w="80" w:type="dxa"/>
-              <w:left w:w="120" w:type="dxa"/>
-              <w:right w:w="120" w:type="dxa"/>
+              <w:top w:w="50" w:type="dxa"/>
+              <w:bottom w:w="50" w:type="dxa"/>
+              <w:left w:w="100" w:type="dxa"/>
+              <w:right w:w="100" w:type="dxa"/>
             </w:tcMar>
             <w:tcBorders>
               <w:top w:val="single" w:sz="4" w:space="0" w:color="000000"/>
@@ -291,7 +291,7 @@
           </w:tcPr>
           <w:p>
             <w:pPr>
-              <w:spacing w:line="312" w:lineRule="auto" w:before="0" w:after="0"/>
+              <w:spacing w:line="288" w:lineRule="auto" w:before="0" w:after="0"/>
               <w:ind w:firstLine="0"/>
               <w:jc w:val="left"/>
             </w:pPr>
@@ -299,9 +299,9 @@
               <w:rPr>
                 <w:rFonts w:ascii="Times New Roman" w:hAnsi="Times New Roman"/>
                 <w:color w:val="000000"/>
-                <w:sz w:val="24"/>
+                <w:sz w:val="23"/>
               </w:rPr>
-              <w:t>Append Only File</w:t>
+              <w:t>Access Pattern</w:t>
             </w:r>
           </w:p>
         </w:tc>
@@ -309,10 +309,10 @@
           <w:tcPr>
             <w:tcW w:type="dxa" w:w="3969"/>
             <w:tcMar>
-              <w:top w:w="80" w:type="dxa"/>
-              <w:bottom w:w="80" w:type="dxa"/>
-              <w:left w:w="120" w:type="dxa"/>
-              <w:right w:w="120" w:type="dxa"/>
+              <w:top w:w="50" w:type="dxa"/>
+              <w:bottom w:w="50" w:type="dxa"/>
+              <w:left w:w="100" w:type="dxa"/>
+              <w:right w:w="100" w:type="dxa"/>
             </w:tcMar>
             <w:tcBorders>
               <w:top w:val="single" w:sz="4" w:space="0" w:color="000000"/>
@@ -323,7 +323,7 @@
           </w:tcPr>
           <w:p>
             <w:pPr>
-              <w:spacing w:line="312" w:lineRule="auto" w:before="0" w:after="0"/>
+              <w:spacing w:line="288" w:lineRule="auto" w:before="0" w:after="0"/>
               <w:ind w:firstLine="0"/>
               <w:jc w:val="left"/>
             </w:pPr>
@@ -331,9 +331,9 @@
               <w:rPr>
                 <w:rFonts w:ascii="Times New Roman" w:hAnsi="Times New Roman"/>
                 <w:color w:val="000000"/>
-                <w:sz w:val="24"/>
+                <w:sz w:val="23"/>
               </w:rPr>
-              <w:t>Cơ chế ghi nhật ký thay đổi tuần tự trên đĩa của Redis</w:t>
+              <w:t>Mẫu truy cập dữ liệu (câu hỏi ứng dụng đặt ra cho CSDL)</w:t>
             </w:r>
           </w:p>
         </w:tc>
@@ -346,10 +346,10 @@
           <w:tcPr>
             <w:tcW w:type="dxa" w:w="1417"/>
             <w:tcMar>
-              <w:top w:w="80" w:type="dxa"/>
-              <w:bottom w:w="80" w:type="dxa"/>
-              <w:left w:w="120" w:type="dxa"/>
-              <w:right w:w="120" w:type="dxa"/>
+              <w:top w:w="50" w:type="dxa"/>
+              <w:bottom w:w="50" w:type="dxa"/>
+              <w:left w:w="100" w:type="dxa"/>
+              <w:right w:w="100" w:type="dxa"/>
             </w:tcMar>
             <w:tcBorders>
               <w:top w:val="single" w:sz="4" w:space="0" w:color="000000"/>
@@ -360,7 +360,7 @@
           </w:tcPr>
           <w:p>
             <w:pPr>
-              <w:spacing w:line="312" w:lineRule="auto" w:before="0" w:after="0"/>
+              <w:spacing w:line="288" w:lineRule="auto" w:before="0" w:after="0"/>
               <w:ind w:firstLine="0"/>
               <w:jc w:val="center"/>
             </w:pPr>
@@ -369,9 +369,9 @@
                 <w:rFonts w:ascii="Times New Roman" w:hAnsi="Times New Roman"/>
                 <w:b/>
                 <w:color w:val="000000"/>
-                <w:sz w:val="24"/>
+                <w:sz w:val="23"/>
               </w:rPr>
-              <w:t>AP</w:t>
+              <w:t>API</w:t>
             </w:r>
           </w:p>
         </w:tc>
@@ -379,10 +379,10 @@
           <w:tcPr>
             <w:tcW w:type="dxa" w:w="3118"/>
             <w:tcMar>
-              <w:top w:w="80" w:type="dxa"/>
-              <w:bottom w:w="80" w:type="dxa"/>
-              <w:left w:w="120" w:type="dxa"/>
-              <w:right w:w="120" w:type="dxa"/>
+              <w:top w:w="50" w:type="dxa"/>
+              <w:bottom w:w="50" w:type="dxa"/>
+              <w:left w:w="100" w:type="dxa"/>
+              <w:right w:w="100" w:type="dxa"/>
             </w:tcMar>
             <w:tcBorders>
               <w:top w:val="single" w:sz="4" w:space="0" w:color="000000"/>
@@ -393,7 +393,7 @@
           </w:tcPr>
           <w:p>
             <w:pPr>
-              <w:spacing w:line="312" w:lineRule="auto" w:before="0" w:after="0"/>
+              <w:spacing w:line="288" w:lineRule="auto" w:before="0" w:after="0"/>
               <w:ind w:firstLine="0"/>
               <w:jc w:val="left"/>
             </w:pPr>
@@ -401,9 +401,9 @@
               <w:rPr>
                 <w:rFonts w:ascii="Times New Roman" w:hAnsi="Times New Roman"/>
                 <w:color w:val="000000"/>
-                <w:sz w:val="24"/>
+                <w:sz w:val="23"/>
               </w:rPr>
-              <w:t>Access Pattern</w:t>
+              <w:t>Application Programming Interface</w:t>
             </w:r>
           </w:p>
         </w:tc>
@@ -411,10 +411,10 @@
           <w:tcPr>
             <w:tcW w:type="dxa" w:w="3969"/>
             <w:tcMar>
-              <w:top w:w="80" w:type="dxa"/>
-              <w:bottom w:w="80" w:type="dxa"/>
-              <w:left w:w="120" w:type="dxa"/>
-              <w:right w:w="120" w:type="dxa"/>
+              <w:top w:w="50" w:type="dxa"/>
+              <w:bottom w:w="50" w:type="dxa"/>
+              <w:left w:w="100" w:type="dxa"/>
+              <w:right w:w="100" w:type="dxa"/>
             </w:tcMar>
             <w:tcBorders>
               <w:top w:val="single" w:sz="4" w:space="0" w:color="000000"/>
@@ -425,7 +425,7 @@
           </w:tcPr>
           <w:p>
             <w:pPr>
-              <w:spacing w:line="312" w:lineRule="auto" w:before="0" w:after="0"/>
+              <w:spacing w:line="288" w:lineRule="auto" w:before="0" w:after="0"/>
               <w:ind w:firstLine="0"/>
               <w:jc w:val="left"/>
             </w:pPr>
@@ -433,109 +433,7 @@
               <w:rPr>
                 <w:rFonts w:ascii="Times New Roman" w:hAnsi="Times New Roman"/>
                 <w:color w:val="000000"/>
-                <w:sz w:val="24"/>
-              </w:rPr>
-              <w:t>Mẫu truy cập dữ liệu (mẫu câu hỏi ứng dụng đặt ra cho CSDL)</w:t>
-            </w:r>
-          </w:p>
-        </w:tc>
-      </w:tr>
-      <w:tr>
-        <w:trPr>
-          <w:cantSplit/>
-        </w:trPr>
-        <w:tc>
-          <w:tcPr>
-            <w:tcW w:type="dxa" w:w="1417"/>
-            <w:tcMar>
-              <w:top w:w="80" w:type="dxa"/>
-              <w:bottom w:w="80" w:type="dxa"/>
-              <w:left w:w="120" w:type="dxa"/>
-              <w:right w:w="120" w:type="dxa"/>
-            </w:tcMar>
-            <w:tcBorders>
-              <w:top w:val="single" w:sz="4" w:space="0" w:color="000000"/>
-              <w:left w:val="single" w:sz="4" w:space="0" w:color="000000"/>
-              <w:bottom w:val="single" w:sz="4" w:space="0" w:color="000000"/>
-              <w:right w:val="single" w:sz="4" w:space="0" w:color="000000"/>
-            </w:tcBorders>
-          </w:tcPr>
-          <w:p>
-            <w:pPr>
-              <w:spacing w:line="312" w:lineRule="auto" w:before="0" w:after="0"/>
-              <w:ind w:firstLine="0"/>
-              <w:jc w:val="center"/>
-            </w:pPr>
-            <w:r>
-              <w:rPr>
-                <w:rFonts w:ascii="Times New Roman" w:hAnsi="Times New Roman"/>
-                <w:b/>
-                <w:color w:val="000000"/>
-                <w:sz w:val="24"/>
-              </w:rPr>
-              <w:t>API</w:t>
-            </w:r>
-          </w:p>
-        </w:tc>
-        <w:tc>
-          <w:tcPr>
-            <w:tcW w:type="dxa" w:w="3118"/>
-            <w:tcMar>
-              <w:top w:w="80" w:type="dxa"/>
-              <w:bottom w:w="80" w:type="dxa"/>
-              <w:left w:w="120" w:type="dxa"/>
-              <w:right w:w="120" w:type="dxa"/>
-            </w:tcMar>
-            <w:tcBorders>
-              <w:top w:val="single" w:sz="4" w:space="0" w:color="000000"/>
-              <w:left w:val="single" w:sz="4" w:space="0" w:color="000000"/>
-              <w:bottom w:val="single" w:sz="4" w:space="0" w:color="000000"/>
-              <w:right w:val="single" w:sz="4" w:space="0" w:color="000000"/>
-            </w:tcBorders>
-          </w:tcPr>
-          <w:p>
-            <w:pPr>
-              <w:spacing w:line="312" w:lineRule="auto" w:before="0" w:after="0"/>
-              <w:ind w:firstLine="0"/>
-              <w:jc w:val="left"/>
-            </w:pPr>
-            <w:r>
-              <w:rPr>
-                <w:rFonts w:ascii="Times New Roman" w:hAnsi="Times New Roman"/>
-                <w:color w:val="000000"/>
-                <w:sz w:val="24"/>
-              </w:rPr>
-              <w:t>Application Programming Interface</w:t>
-            </w:r>
-          </w:p>
-        </w:tc>
-        <w:tc>
-          <w:tcPr>
-            <w:tcW w:type="dxa" w:w="3969"/>
-            <w:tcMar>
-              <w:top w:w="80" w:type="dxa"/>
-              <w:bottom w:w="80" w:type="dxa"/>
-              <w:left w:w="120" w:type="dxa"/>
-              <w:right w:w="120" w:type="dxa"/>
-            </w:tcMar>
-            <w:tcBorders>
-              <w:top w:val="single" w:sz="4" w:space="0" w:color="000000"/>
-              <w:left w:val="single" w:sz="4" w:space="0" w:color="000000"/>
-              <w:bottom w:val="single" w:sz="4" w:space="0" w:color="000000"/>
-              <w:right w:val="single" w:sz="4" w:space="0" w:color="000000"/>
-            </w:tcBorders>
-          </w:tcPr>
-          <w:p>
-            <w:pPr>
-              <w:spacing w:line="312" w:lineRule="auto" w:before="0" w:after="0"/>
-              <w:ind w:firstLine="0"/>
-              <w:jc w:val="left"/>
-            </w:pPr>
-            <w:r>
-              <w:rPr>
-                <w:rFonts w:ascii="Times New Roman" w:hAnsi="Times New Roman"/>
-                <w:color w:val="000000"/>
-                <w:sz w:val="24"/>
+                <w:sz w:val="23"/>
               </w:rPr>
               <w:t>Giao diện lập trình ứng dụng</w:t>
             </w:r>
@@ -550,10 +448,10 @@
           <w:tcPr>
             <w:tcW w:type="dxa" w:w="1417"/>
             <w:tcMar>
-              <w:top w:w="80" w:type="dxa"/>
-              <w:bottom w:w="80" w:type="dxa"/>
-              <w:left w:w="120" w:type="dxa"/>
-              <w:right w:w="120" w:type="dxa"/>
+              <w:top w:w="50" w:type="dxa"/>
+              <w:bottom w:w="50" w:type="dxa"/>
+              <w:left w:w="100" w:type="dxa"/>
+              <w:right w:w="100" w:type="dxa"/>
             </w:tcMar>
             <w:tcBorders>
               <w:top w:val="single" w:sz="4" w:space="0" w:color="000000"/>
@@ -564,7 +462,7 @@
           </w:tcPr>
           <w:p>
             <w:pPr>
-              <w:spacing w:line="312" w:lineRule="auto" w:before="0" w:after="0"/>
+              <w:spacing w:line="288" w:lineRule="auto" w:before="0" w:after="0"/>
               <w:ind w:firstLine="0"/>
               <w:jc w:val="center"/>
             </w:pPr>
@@ -573,7 +471,7 @@
                 <w:rFonts w:ascii="Times New Roman" w:hAnsi="Times New Roman"/>
                 <w:b/>
                 <w:color w:val="000000"/>
-                <w:sz w:val="24"/>
+                <w:sz w:val="23"/>
               </w:rPr>
               <w:t>BASE</w:t>
             </w:r>
@@ -583,10 +481,10 @@
           <w:tcPr>
             <w:tcW w:type="dxa" w:w="3118"/>
             <w:tcMar>
-              <w:top w:w="80" w:type="dxa"/>
-              <w:bottom w:w="80" w:type="dxa"/>
-              <w:left w:w="120" w:type="dxa"/>
-              <w:right w:w="120" w:type="dxa"/>
+              <w:top w:w="50" w:type="dxa"/>
+              <w:bottom w:w="50" w:type="dxa"/>
+              <w:left w:w="100" w:type="dxa"/>
+              <w:right w:w="100" w:type="dxa"/>
             </w:tcMar>
             <w:tcBorders>
               <w:top w:val="single" w:sz="4" w:space="0" w:color="000000"/>
@@ -597,7 +495,7 @@
           </w:tcPr>
           <w:p>
             <w:pPr>
-              <w:spacing w:line="312" w:lineRule="auto" w:before="0" w:after="0"/>
+              <w:spacing w:line="288" w:lineRule="auto" w:before="0" w:after="0"/>
               <w:ind w:firstLine="0"/>
               <w:jc w:val="left"/>
             </w:pPr>
@@ -605,7 +503,7 @@
               <w:rPr>
                 <w:rFonts w:ascii="Times New Roman" w:hAnsi="Times New Roman"/>
                 <w:color w:val="000000"/>
-                <w:sz w:val="24"/>
+                <w:sz w:val="23"/>
               </w:rPr>
               <w:t>Basically Available, Soft-state, Eventual consistency</w:t>
             </w:r>
@@ -615,10 +513,10 @@
           <w:tcPr>
             <w:tcW w:type="dxa" w:w="3969"/>
             <w:tcMar>
-              <w:top w:w="80" w:type="dxa"/>
-              <w:bottom w:w="80" w:type="dxa"/>
-              <w:left w:w="120" w:type="dxa"/>
-              <w:right w:w="120" w:type="dxa"/>
+              <w:top w:w="50" w:type="dxa"/>
+              <w:bottom w:w="50" w:type="dxa"/>
+              <w:left w:w="100" w:type="dxa"/>
+              <w:right w:w="100" w:type="dxa"/>
             </w:tcMar>
             <w:tcBorders>
               <w:top w:val="single" w:sz="4" w:space="0" w:color="000000"/>
@@ -629,7 +527,7 @@
           </w:tcPr>
           <w:p>
             <w:pPr>
-              <w:spacing w:line="312" w:lineRule="auto" w:before="0" w:after="0"/>
+              <w:spacing w:line="288" w:lineRule="auto" w:before="0" w:after="0"/>
               <w:ind w:firstLine="0"/>
               <w:jc w:val="left"/>
             </w:pPr>
@@ -637,9 +535,9 @@
               <w:rPr>
                 <w:rFonts w:ascii="Times New Roman" w:hAnsi="Times New Roman"/>
                 <w:color w:val="000000"/>
-                <w:sz w:val="24"/>
+                <w:sz w:val="23"/>
               </w:rPr>
-              <w:t>Mô hình đảm bảo tính sẵn sàng cơ bản và nhất quán cuối cùng của hệ phân tán NoSQL</w:t>
+              <w:t>Mô hình nhất quán cuối cùng của hệ phân tán NoSQL</w:t>
             </w:r>
           </w:p>
         </w:tc>
@@ -652,10 +550,10 @@
           <w:tcPr>
             <w:tcW w:type="dxa" w:w="1417"/>
             <w:tcMar>
-              <w:top w:w="80" w:type="dxa"/>
-              <w:bottom w:w="80" w:type="dxa"/>
-              <w:left w:w="120" w:type="dxa"/>
-              <w:right w:w="120" w:type="dxa"/>
+              <w:top w:w="50" w:type="dxa"/>
+              <w:bottom w:w="50" w:type="dxa"/>
+              <w:left w:w="100" w:type="dxa"/>
+              <w:right w:w="100" w:type="dxa"/>
             </w:tcMar>
             <w:tcBorders>
               <w:top w:val="single" w:sz="4" w:space="0" w:color="000000"/>
@@ -666,7 +564,7 @@
           </w:tcPr>
           <w:p>
             <w:pPr>
-              <w:spacing w:line="312" w:lineRule="auto" w:before="0" w:after="0"/>
+              <w:spacing w:line="288" w:lineRule="auto" w:before="0" w:after="0"/>
               <w:ind w:firstLine="0"/>
               <w:jc w:val="center"/>
             </w:pPr>
@@ -675,7 +573,7 @@
                 <w:rFonts w:ascii="Times New Roman" w:hAnsi="Times New Roman"/>
                 <w:b/>
                 <w:color w:val="000000"/>
-                <w:sz w:val="24"/>
+                <w:sz w:val="23"/>
               </w:rPr>
               <w:t>BPMN</w:t>
             </w:r>
@@ -685,10 +583,10 @@
           <w:tcPr>
             <w:tcW w:type="dxa" w:w="3118"/>
             <w:tcMar>
-              <w:top w:w="80" w:type="dxa"/>
-              <w:bottom w:w="80" w:type="dxa"/>
-              <w:left w:w="120" w:type="dxa"/>
-              <w:right w:w="120" w:type="dxa"/>
+              <w:top w:w="50" w:type="dxa"/>
+              <w:bottom w:w="50" w:type="dxa"/>
+              <w:left w:w="100" w:type="dxa"/>
+              <w:right w:w="100" w:type="dxa"/>
             </w:tcMar>
             <w:tcBorders>
               <w:top w:val="single" w:sz="4" w:space="0" w:color="000000"/>
@@ -699,7 +597,7 @@
           </w:tcPr>
           <w:p>
             <w:pPr>
-              <w:spacing w:line="312" w:lineRule="auto" w:before="0" w:after="0"/>
+              <w:spacing w:line="288" w:lineRule="auto" w:before="0" w:after="0"/>
               <w:ind w:firstLine="0"/>
               <w:jc w:val="left"/>
             </w:pPr>
@@ -707,7 +605,7 @@
               <w:rPr>
                 <w:rFonts w:ascii="Times New Roman" w:hAnsi="Times New Roman"/>
                 <w:color w:val="000000"/>
-                <w:sz w:val="24"/>
+                <w:sz w:val="23"/>
               </w:rPr>
               <w:t>Business Process Model and Notation</w:t>
             </w:r>
@@ -717,10 +615,10 @@
           <w:tcPr>
             <w:tcW w:type="dxa" w:w="3969"/>
             <w:tcMar>
-              <w:top w:w="80" w:type="dxa"/>
-              <w:bottom w:w="80" w:type="dxa"/>
-              <w:left w:w="120" w:type="dxa"/>
-              <w:right w:w="120" w:type="dxa"/>
+              <w:top w:w="50" w:type="dxa"/>
+              <w:bottom w:w="50" w:type="dxa"/>
+              <w:left w:w="100" w:type="dxa"/>
+              <w:right w:w="100" w:type="dxa"/>
             </w:tcMar>
             <w:tcBorders>
               <w:top w:val="single" w:sz="4" w:space="0" w:color="000000"/>
@@ -731,7 +629,7 @@
           </w:tcPr>
           <w:p>
             <w:pPr>
-              <w:spacing w:line="312" w:lineRule="auto" w:before="0" w:after="0"/>
+              <w:spacing w:line="288" w:lineRule="auto" w:before="0" w:after="0"/>
               <w:ind w:firstLine="0"/>
               <w:jc w:val="left"/>
             </w:pPr>
@@ -739,9 +637,9 @@
               <w:rPr>
                 <w:rFonts w:ascii="Times New Roman" w:hAnsi="Times New Roman"/>
                 <w:color w:val="000000"/>
-                <w:sz w:val="24"/>
+                <w:sz w:val="23"/>
               </w:rPr>
-              <w:t>Ký hiệu và mô hình hóa quy trình nghiệp vụ chuẩn quốc tế</w:t>
+              <w:t>Ký hiệu và mô hình hóa quy trình nghiệp vụ</w:t>
             </w:r>
           </w:p>
         </w:tc>
@@ -754,10 +652,10 @@
           <w:tcPr>
             <w:tcW w:type="dxa" w:w="1417"/>
             <w:tcMar>
-              <w:top w:w="80" w:type="dxa"/>
-              <w:bottom w:w="80" w:type="dxa"/>
-              <w:left w:w="120" w:type="dxa"/>
-              <w:right w:w="120" w:type="dxa"/>
+              <w:top w:w="50" w:type="dxa"/>
+              <w:bottom w:w="50" w:type="dxa"/>
+              <w:left w:w="100" w:type="dxa"/>
+              <w:right w:w="100" w:type="dxa"/>
             </w:tcMar>
             <w:tcBorders>
               <w:top w:val="single" w:sz="4" w:space="0" w:color="000000"/>
@@ -768,7 +666,7 @@
           </w:tcPr>
           <w:p>
             <w:pPr>
-              <w:spacing w:line="312" w:lineRule="auto" w:before="0" w:after="0"/>
+              <w:spacing w:line="288" w:lineRule="auto" w:before="0" w:after="0"/>
               <w:ind w:firstLine="0"/>
               <w:jc w:val="center"/>
             </w:pPr>
@@ -777,9 +675,9 @@
                 <w:rFonts w:ascii="Times New Roman" w:hAnsi="Times New Roman"/>
                 <w:b/>
                 <w:color w:val="000000"/>
-                <w:sz w:val="24"/>
+                <w:sz w:val="23"/>
               </w:rPr>
-              <w:t>BSON</w:t>
+              <w:t>CAP</w:t>
             </w:r>
           </w:p>
         </w:tc>
@@ -787,10 +685,10 @@
           <w:tcPr>
             <w:tcW w:type="dxa" w:w="3118"/>
             <w:tcMar>
-              <w:top w:w="80" w:type="dxa"/>
-              <w:bottom w:w="80" w:type="dxa"/>
-              <w:left w:w="120" w:type="dxa"/>
-              <w:right w:w="120" w:type="dxa"/>
+              <w:top w:w="50" w:type="dxa"/>
+              <w:bottom w:w="50" w:type="dxa"/>
+              <w:left w:w="100" w:type="dxa"/>
+              <w:right w:w="100" w:type="dxa"/>
             </w:tcMar>
             <w:tcBorders>
               <w:top w:val="single" w:sz="4" w:space="0" w:color="000000"/>
@@ -801,7 +699,7 @@
           </w:tcPr>
           <w:p>
             <w:pPr>
-              <w:spacing w:line="312" w:lineRule="auto" w:before="0" w:after="0"/>
+              <w:spacing w:line="288" w:lineRule="auto" w:before="0" w:after="0"/>
               <w:ind w:firstLine="0"/>
               <w:jc w:val="left"/>
             </w:pPr>
@@ -809,9 +707,9 @@
               <w:rPr>
                 <w:rFonts w:ascii="Times New Roman" w:hAnsi="Times New Roman"/>
                 <w:color w:val="000000"/>
-                <w:sz w:val="24"/>
+                <w:sz w:val="23"/>
               </w:rPr>
-              <w:t>Binary JSON</w:t>
+              <w:t>Consistency, Availability, Partition tolerance</w:t>
             </w:r>
           </w:p>
         </w:tc>
@@ -819,10 +717,10 @@
           <w:tcPr>
             <w:tcW w:type="dxa" w:w="3969"/>
             <w:tcMar>
-              <w:top w:w="80" w:type="dxa"/>
-              <w:bottom w:w="80" w:type="dxa"/>
-              <w:left w:w="120" w:type="dxa"/>
-              <w:right w:w="120" w:type="dxa"/>
+              <w:top w:w="50" w:type="dxa"/>
+              <w:bottom w:w="50" w:type="dxa"/>
+              <w:left w:w="100" w:type="dxa"/>
+              <w:right w:w="100" w:type="dxa"/>
             </w:tcMar>
             <w:tcBorders>
               <w:top w:val="single" w:sz="4" w:space="0" w:color="000000"/>
@@ -833,7 +731,7 @@
           </w:tcPr>
           <w:p>
             <w:pPr>
-              <w:spacing w:line="312" w:lineRule="auto" w:before="0" w:after="0"/>
+              <w:spacing w:line="288" w:lineRule="auto" w:before="0" w:after="0"/>
               <w:ind w:firstLine="0"/>
               <w:jc w:val="left"/>
             </w:pPr>
@@ -841,9 +739,9 @@
               <w:rPr>
                 <w:rFonts w:ascii="Times New Roman" w:hAnsi="Times New Roman"/>
                 <w:color w:val="000000"/>
-                <w:sz w:val="24"/>
+                <w:sz w:val="23"/>
               </w:rPr>
-              <w:t>Định dạng biểu diễn nhị phân của tài liệu JSON trong MongoDB</w:t>
+              <w:t>Định lý đánh đổi giữa Nhất quán, Sẵn sàng và Phân vùng mạng</w:t>
             </w:r>
           </w:p>
         </w:tc>
@@ -856,10 +754,10 @@
           <w:tcPr>
             <w:tcW w:type="dxa" w:w="1417"/>
             <w:tcMar>
-              <w:top w:w="80" w:type="dxa"/>
-              <w:bottom w:w="80" w:type="dxa"/>
-              <w:left w:w="120" w:type="dxa"/>
-              <w:right w:w="120" w:type="dxa"/>
+              <w:top w:w="50" w:type="dxa"/>
+              <w:bottom w:w="50" w:type="dxa"/>
+              <w:left w:w="100" w:type="dxa"/>
+              <w:right w:w="100" w:type="dxa"/>
             </w:tcMar>
             <w:tcBorders>
               <w:top w:val="single" w:sz="4" w:space="0" w:color="000000"/>
@@ -870,7 +768,7 @@
           </w:tcPr>
           <w:p>
             <w:pPr>
-              <w:spacing w:line="312" w:lineRule="auto" w:before="0" w:after="0"/>
+              <w:spacing w:line="288" w:lineRule="auto" w:before="0" w:after="0"/>
               <w:ind w:firstLine="0"/>
               <w:jc w:val="center"/>
             </w:pPr>
@@ -879,9 +777,9 @@
                 <w:rFonts w:ascii="Times New Roman" w:hAnsi="Times New Roman"/>
                 <w:b/>
                 <w:color w:val="000000"/>
-                <w:sz w:val="24"/>
+                <w:sz w:val="23"/>
               </w:rPr>
-              <w:t>CAP</w:t>
+              <w:t>CMS</w:t>
             </w:r>
           </w:p>
         </w:tc>
@@ -889,10 +787,10 @@
           <w:tcPr>
             <w:tcW w:type="dxa" w:w="3118"/>
             <w:tcMar>
-              <w:top w:w="80" w:type="dxa"/>
-              <w:bottom w:w="80" w:type="dxa"/>
-              <w:left w:w="120" w:type="dxa"/>
-              <w:right w:w="120" w:type="dxa"/>
+              <w:top w:w="50" w:type="dxa"/>
+              <w:bottom w:w="50" w:type="dxa"/>
+              <w:left w:w="100" w:type="dxa"/>
+              <w:right w:w="100" w:type="dxa"/>
             </w:tcMar>
             <w:tcBorders>
               <w:top w:val="single" w:sz="4" w:space="0" w:color="000000"/>
@@ -903,7 +801,7 @@
           </w:tcPr>
           <w:p>
             <w:pPr>
-              <w:spacing w:line="312" w:lineRule="auto" w:before="0" w:after="0"/>
+              <w:spacing w:line="288" w:lineRule="auto" w:before="0" w:after="0"/>
               <w:ind w:firstLine="0"/>
               <w:jc w:val="left"/>
             </w:pPr>
@@ -911,9 +809,9 @@
               <w:rPr>
                 <w:rFonts w:ascii="Times New Roman" w:hAnsi="Times New Roman"/>
                 <w:color w:val="000000"/>
-                <w:sz w:val="24"/>
+                <w:sz w:val="23"/>
               </w:rPr>
-              <w:t>Consistency, Availability, Partition tolerance</w:t>
+              <w:t>Content Management System</w:t>
             </w:r>
           </w:p>
         </w:tc>
@@ -921,10 +819,10 @@
           <w:tcPr>
             <w:tcW w:type="dxa" w:w="3969"/>
             <w:tcMar>
-              <w:top w:w="80" w:type="dxa"/>
-              <w:bottom w:w="80" w:type="dxa"/>
-              <w:left w:w="120" w:type="dxa"/>
-              <w:right w:w="120" w:type="dxa"/>
+              <w:top w:w="50" w:type="dxa"/>
+              <w:bottom w:w="50" w:type="dxa"/>
+              <w:left w:w="100" w:type="dxa"/>
+              <w:right w:w="100" w:type="dxa"/>
             </w:tcMar>
             <w:tcBorders>
               <w:top w:val="single" w:sz="4" w:space="0" w:color="000000"/>
@@ -935,7 +833,7 @@
           </w:tcPr>
           <w:p>
             <w:pPr>
-              <w:spacing w:line="312" w:lineRule="auto" w:before="0" w:after="0"/>
+              <w:spacing w:line="288" w:lineRule="auto" w:before="0" w:after="0"/>
               <w:ind w:firstLine="0"/>
               <w:jc w:val="left"/>
             </w:pPr>
@@ -943,9 +841,9 @@
               <w:rPr>
                 <w:rFonts w:ascii="Times New Roman" w:hAnsi="Times New Roman"/>
                 <w:color w:val="000000"/>
-                <w:sz w:val="24"/>
+                <w:sz w:val="23"/>
               </w:rPr>
-              <w:t>Định lý về sự đánh đổi giữa tính Nhất quán, Sẵn sàng và Chịu lỗi phân vùng mạng</w:t>
+              <w:t>Hệ thống quản trị nội dung khóa học và đề thi</w:t>
             </w:r>
           </w:p>
         </w:tc>
@@ -958,10 +856,10 @@
           <w:tcPr>
             <w:tcW w:type="dxa" w:w="1417"/>
             <w:tcMar>
-              <w:top w:w="80" w:type="dxa"/>
-              <w:bottom w:w="80" w:type="dxa"/>
-              <w:left w:w="120" w:type="dxa"/>
-              <w:right w:w="120" w:type="dxa"/>
+              <w:top w:w="50" w:type="dxa"/>
+              <w:bottom w:w="50" w:type="dxa"/>
+              <w:left w:w="100" w:type="dxa"/>
+              <w:right w:w="100" w:type="dxa"/>
             </w:tcMar>
             <w:tcBorders>
               <w:top w:val="single" w:sz="4" w:space="0" w:color="000000"/>
@@ -972,7 +870,7 @@
           </w:tcPr>
           <w:p>
             <w:pPr>
-              <w:spacing w:line="312" w:lineRule="auto" w:before="0" w:after="0"/>
+              <w:spacing w:line="288" w:lineRule="auto" w:before="0" w:after="0"/>
               <w:ind w:firstLine="0"/>
               <w:jc w:val="center"/>
             </w:pPr>
@@ -981,9 +879,9 @@
                 <w:rFonts w:ascii="Times New Roman" w:hAnsi="Times New Roman"/>
                 <w:b/>
                 <w:color w:val="000000"/>
-                <w:sz w:val="24"/>
+                <w:sz w:val="23"/>
               </w:rPr>
-              <w:t>CEFR</w:t>
+              <w:t>CQL</w:t>
             </w:r>
           </w:p>
         </w:tc>
@@ -991,10 +889,10 @@
           <w:tcPr>
             <w:tcW w:type="dxa" w:w="3118"/>
             <w:tcMar>
-              <w:top w:w="80" w:type="dxa"/>
-              <w:bottom w:w="80" w:type="dxa"/>
-              <w:left w:w="120" w:type="dxa"/>
-              <w:right w:w="120" w:type="dxa"/>
+              <w:top w:w="50" w:type="dxa"/>
+              <w:bottom w:w="50" w:type="dxa"/>
+              <w:left w:w="100" w:type="dxa"/>
+              <w:right w:w="100" w:type="dxa"/>
             </w:tcMar>
             <w:tcBorders>
               <w:top w:val="single" w:sz="4" w:space="0" w:color="000000"/>
@@ -1005,7 +903,7 @@
           </w:tcPr>
           <w:p>
             <w:pPr>
-              <w:spacing w:line="312" w:lineRule="auto" w:before="0" w:after="0"/>
+              <w:spacing w:line="288" w:lineRule="auto" w:before="0" w:after="0"/>
               <w:ind w:firstLine="0"/>
               <w:jc w:val="left"/>
             </w:pPr>
@@ -1013,9 +911,9 @@
               <w:rPr>
                 <w:rFonts w:ascii="Times New Roman" w:hAnsi="Times New Roman"/>
                 <w:color w:val="000000"/>
-                <w:sz w:val="24"/>
+                <w:sz w:val="23"/>
               </w:rPr>
-              <w:t>Common European Framework of Reference for Languages</w:t>
+              <w:t>Cassandra Query Language</w:t>
             </w:r>
           </w:p>
         </w:tc>
@@ -1023,10 +921,10 @@
           <w:tcPr>
             <w:tcW w:type="dxa" w:w="3969"/>
             <w:tcMar>
-              <w:top w:w="80" w:type="dxa"/>
-              <w:bottom w:w="80" w:type="dxa"/>
-              <w:left w:w="120" w:type="dxa"/>
-              <w:right w:w="120" w:type="dxa"/>
+              <w:top w:w="50" w:type="dxa"/>
+              <w:bottom w:w="50" w:type="dxa"/>
+              <w:left w:w="100" w:type="dxa"/>
+              <w:right w:w="100" w:type="dxa"/>
             </w:tcMar>
             <w:tcBorders>
               <w:top w:val="single" w:sz="4" w:space="0" w:color="000000"/>
@@ -1037,7 +935,7 @@
           </w:tcPr>
           <w:p>
             <w:pPr>
-              <w:spacing w:line="312" w:lineRule="auto" w:before="0" w:after="0"/>
+              <w:spacing w:line="288" w:lineRule="auto" w:before="0" w:after="0"/>
               <w:ind w:firstLine="0"/>
               <w:jc w:val="left"/>
             </w:pPr>
@@ -1045,9 +943,9 @@
               <w:rPr>
                 <w:rFonts w:ascii="Times New Roman" w:hAnsi="Times New Roman"/>
                 <w:color w:val="000000"/>
-                <w:sz w:val="24"/>
+                <w:sz w:val="23"/>
               </w:rPr>
-              <w:t>Khung tham chiếu trình độ ngôn ngữ chung của châu Âu (A1-C2)</w:t>
+              <w:t>Ngôn ngữ truy vấn dạng bảng của Apache Cassandra</w:t>
             </w:r>
           </w:p>
         </w:tc>
@@ -1060,10 +958,10 @@
           <w:tcPr>
             <w:tcW w:type="dxa" w:w="1417"/>
             <w:tcMar>
-              <w:top w:w="80" w:type="dxa"/>
-              <w:bottom w:w="80" w:type="dxa"/>
-              <w:left w:w="120" w:type="dxa"/>
-              <w:right w:w="120" w:type="dxa"/>
+              <w:top w:w="50" w:type="dxa"/>
+              <w:bottom w:w="50" w:type="dxa"/>
+              <w:left w:w="100" w:type="dxa"/>
+              <w:right w:w="100" w:type="dxa"/>
             </w:tcMar>
             <w:tcBorders>
               <w:top w:val="single" w:sz="4" w:space="0" w:color="000000"/>
@@ -1074,7 +972,7 @@
           </w:tcPr>
           <w:p>
             <w:pPr>
-              <w:spacing w:line="312" w:lineRule="auto" w:before="0" w:after="0"/>
+              <w:spacing w:line="288" w:lineRule="auto" w:before="0" w:after="0"/>
               <w:ind w:firstLine="0"/>
               <w:jc w:val="center"/>
             </w:pPr>
@@ -1083,9 +981,9 @@
                 <w:rFonts w:ascii="Times New Roman" w:hAnsi="Times New Roman"/>
                 <w:b/>
                 <w:color w:val="000000"/>
-                <w:sz w:val="24"/>
+                <w:sz w:val="23"/>
               </w:rPr>
-              <w:t>CMS</w:t>
+              <w:t>DBMS</w:t>
             </w:r>
           </w:p>
         </w:tc>
@@ -1093,10 +991,10 @@
           <w:tcPr>
             <w:tcW w:type="dxa" w:w="3118"/>
             <w:tcMar>
-              <w:top w:w="80" w:type="dxa"/>
-              <w:bottom w:w="80" w:type="dxa"/>
-              <w:left w:w="120" w:type="dxa"/>
-              <w:right w:w="120" w:type="dxa"/>
+              <w:top w:w="50" w:type="dxa"/>
+              <w:bottom w:w="50" w:type="dxa"/>
+              <w:left w:w="100" w:type="dxa"/>
+              <w:right w:w="100" w:type="dxa"/>
             </w:tcMar>
             <w:tcBorders>
               <w:top w:val="single" w:sz="4" w:space="0" w:color="000000"/>
@@ -1107,7 +1005,7 @@
           </w:tcPr>
           <w:p>
             <w:pPr>
-              <w:spacing w:line="312" w:lineRule="auto" w:before="0" w:after="0"/>
+              <w:spacing w:line="288" w:lineRule="auto" w:before="0" w:after="0"/>
               <w:ind w:firstLine="0"/>
               <w:jc w:val="left"/>
             </w:pPr>
@@ -1115,9 +1013,9 @@
               <w:rPr>
                 <w:rFonts w:ascii="Times New Roman" w:hAnsi="Times New Roman"/>
                 <w:color w:val="000000"/>
-                <w:sz w:val="24"/>
+                <w:sz w:val="23"/>
               </w:rPr>
-              <w:t>Content Management System</w:t>
+              <w:t>Database Management System</w:t>
             </w:r>
           </w:p>
         </w:tc>
@@ -1125,10 +1023,10 @@
           <w:tcPr>
             <w:tcW w:type="dxa" w:w="3969"/>
             <w:tcMar>
-              <w:top w:w="80" w:type="dxa"/>
-              <w:bottom w:w="80" w:type="dxa"/>
-              <w:left w:w="120" w:type="dxa"/>
-              <w:right w:w="120" w:type="dxa"/>
+              <w:top w:w="50" w:type="dxa"/>
+              <w:bottom w:w="50" w:type="dxa"/>
+              <w:left w:w="100" w:type="dxa"/>
+              <w:right w:w="100" w:type="dxa"/>
             </w:tcMar>
             <w:tcBorders>
               <w:top w:val="single" w:sz="4" w:space="0" w:color="000000"/>
@@ -1139,7 +1037,7 @@
           </w:tcPr>
           <w:p>
             <w:pPr>
-              <w:spacing w:line="312" w:lineRule="auto" w:before="0" w:after="0"/>
+              <w:spacing w:line="288" w:lineRule="auto" w:before="0" w:after="0"/>
               <w:ind w:firstLine="0"/>
               <w:jc w:val="left"/>
             </w:pPr>
@@ -1147,313 +1045,7 @@
               <w:rPr>
                 <w:rFonts w:ascii="Times New Roman" w:hAnsi="Times New Roman"/>
                 <w:color w:val="000000"/>
-                <w:sz w:val="24"/>
-              </w:rPr>
-              <w:t>Hệ thống quản trị nội dung dành cho Giảng viên và Quản trị viên</w:t>
-            </w:r>
-          </w:p>
-        </w:tc>
-      </w:tr>
-      <w:tr>
-        <w:trPr>
-          <w:cantSplit/>
-        </w:trPr>
-        <w:tc>
-          <w:tcPr>
-            <w:tcW w:type="dxa" w:w="1417"/>
-            <w:tcMar>
-              <w:top w:w="80" w:type="dxa"/>
-              <w:bottom w:w="80" w:type="dxa"/>
-              <w:left w:w="120" w:type="dxa"/>
-              <w:right w:w="120" w:type="dxa"/>
-            </w:tcMar>
-            <w:tcBorders>
-              <w:top w:val="single" w:sz="4" w:space="0" w:color="000000"/>
-              <w:left w:val="single" w:sz="4" w:space="0" w:color="000000"/>
-              <w:bottom w:val="single" w:sz="4" w:space="0" w:color="000000"/>
-              <w:right w:val="single" w:sz="4" w:space="0" w:color="000000"/>
-            </w:tcBorders>
-          </w:tcPr>
-          <w:p>
-            <w:pPr>
-              <w:spacing w:line="312" w:lineRule="auto" w:before="0" w:after="0"/>
-              <w:ind w:firstLine="0"/>
-              <w:jc w:val="center"/>
-            </w:pPr>
-            <w:r>
-              <w:rPr>
-                <w:rFonts w:ascii="Times New Roman" w:hAnsi="Times New Roman"/>
-                <w:b/>
-                <w:color w:val="000000"/>
-                <w:sz w:val="24"/>
-              </w:rPr>
-              <w:t>CQL</w:t>
-            </w:r>
-          </w:p>
-        </w:tc>
-        <w:tc>
-          <w:tcPr>
-            <w:tcW w:type="dxa" w:w="3118"/>
-            <w:tcMar>
-              <w:top w:w="80" w:type="dxa"/>
-              <w:bottom w:w="80" w:type="dxa"/>
-              <w:left w:w="120" w:type="dxa"/>
-              <w:right w:w="120" w:type="dxa"/>
-            </w:tcMar>
-            <w:tcBorders>
-              <w:top w:val="single" w:sz="4" w:space="0" w:color="000000"/>
-              <w:left w:val="single" w:sz="4" w:space="0" w:color="000000"/>
-              <w:bottom w:val="single" w:sz="4" w:space="0" w:color="000000"/>
-              <w:right w:val="single" w:sz="4" w:space="0" w:color="000000"/>
-            </w:tcBorders>
-          </w:tcPr>
-          <w:p>
-            <w:pPr>
-              <w:spacing w:line="312" w:lineRule="auto" w:before="0" w:after="0"/>
-              <w:ind w:firstLine="0"/>
-              <w:jc w:val="left"/>
-            </w:pPr>
-            <w:r>
-              <w:rPr>
-                <w:rFonts w:ascii="Times New Roman" w:hAnsi="Times New Roman"/>
-                <w:color w:val="000000"/>
-                <w:sz w:val="24"/>
-              </w:rPr>
-              <w:t>Cassandra Query Language</w:t>
-            </w:r>
-          </w:p>
-        </w:tc>
-        <w:tc>
-          <w:tcPr>
-            <w:tcW w:type="dxa" w:w="3969"/>
-            <w:tcMar>
-              <w:top w:w="80" w:type="dxa"/>
-              <w:bottom w:w="80" w:type="dxa"/>
-              <w:left w:w="120" w:type="dxa"/>
-              <w:right w:w="120" w:type="dxa"/>
-            </w:tcMar>
-            <w:tcBorders>
-              <w:top w:val="single" w:sz="4" w:space="0" w:color="000000"/>
-              <w:left w:val="single" w:sz="4" w:space="0" w:color="000000"/>
-              <w:bottom w:val="single" w:sz="4" w:space="0" w:color="000000"/>
-              <w:right w:val="single" w:sz="4" w:space="0" w:color="000000"/>
-            </w:tcBorders>
-          </w:tcPr>
-          <w:p>
-            <w:pPr>
-              <w:spacing w:line="312" w:lineRule="auto" w:before="0" w:after="0"/>
-              <w:ind w:firstLine="0"/>
-              <w:jc w:val="left"/>
-            </w:pPr>
-            <w:r>
-              <w:rPr>
-                <w:rFonts w:ascii="Times New Roman" w:hAnsi="Times New Roman"/>
-                <w:color w:val="000000"/>
-                <w:sz w:val="24"/>
-              </w:rPr>
-              <w:t>Ngôn ngữ truy vấn dạng bảng của hệ quản trị Apache Cassandra</w:t>
-            </w:r>
-          </w:p>
-        </w:tc>
-      </w:tr>
-      <w:tr>
-        <w:trPr>
-          <w:cantSplit/>
-        </w:trPr>
-        <w:tc>
-          <w:tcPr>
-            <w:tcW w:type="dxa" w:w="1417"/>
-            <w:tcMar>
-              <w:top w:w="80" w:type="dxa"/>
-              <w:bottom w:w="80" w:type="dxa"/>
-              <w:left w:w="120" w:type="dxa"/>
-              <w:right w:w="120" w:type="dxa"/>
-            </w:tcMar>
-            <w:tcBorders>
-              <w:top w:val="single" w:sz="4" w:space="0" w:color="000000"/>
-              <w:left w:val="single" w:sz="4" w:space="0" w:color="000000"/>
-              <w:bottom w:val="single" w:sz="4" w:space="0" w:color="000000"/>
-              <w:right w:val="single" w:sz="4" w:space="0" w:color="000000"/>
-            </w:tcBorders>
-          </w:tcPr>
-          <w:p>
-            <w:pPr>
-              <w:spacing w:line="312" w:lineRule="auto" w:before="0" w:after="0"/>
-              <w:ind w:firstLine="0"/>
-              <w:jc w:val="center"/>
-            </w:pPr>
-            <w:r>
-              <w:rPr>
-                <w:rFonts w:ascii="Times New Roman" w:hAnsi="Times New Roman"/>
-                <w:b/>
-                <w:color w:val="000000"/>
-                <w:sz w:val="24"/>
-              </w:rPr>
-              <w:t>CRUD</w:t>
-            </w:r>
-          </w:p>
-        </w:tc>
-        <w:tc>
-          <w:tcPr>
-            <w:tcW w:type="dxa" w:w="3118"/>
-            <w:tcMar>
-              <w:top w:w="80" w:type="dxa"/>
-              <w:bottom w:w="80" w:type="dxa"/>
-              <w:left w:w="120" w:type="dxa"/>
-              <w:right w:w="120" w:type="dxa"/>
-            </w:tcMar>
-            <w:tcBorders>
-              <w:top w:val="single" w:sz="4" w:space="0" w:color="000000"/>
-              <w:left w:val="single" w:sz="4" w:space="0" w:color="000000"/>
-              <w:bottom w:val="single" w:sz="4" w:space="0" w:color="000000"/>
-              <w:right w:val="single" w:sz="4" w:space="0" w:color="000000"/>
-            </w:tcBorders>
-          </w:tcPr>
-          <w:p>
-            <w:pPr>
-              <w:spacing w:line="312" w:lineRule="auto" w:before="0" w:after="0"/>
-              <w:ind w:firstLine="0"/>
-              <w:jc w:val="left"/>
-            </w:pPr>
-            <w:r>
-              <w:rPr>
-                <w:rFonts w:ascii="Times New Roman" w:hAnsi="Times New Roman"/>
-                <w:color w:val="000000"/>
-                <w:sz w:val="24"/>
-              </w:rPr>
-              <w:t>Create, Read, Update, Delete</w:t>
-            </w:r>
-          </w:p>
-        </w:tc>
-        <w:tc>
-          <w:tcPr>
-            <w:tcW w:type="dxa" w:w="3969"/>
-            <w:tcMar>
-              <w:top w:w="80" w:type="dxa"/>
-              <w:bottom w:w="80" w:type="dxa"/>
-              <w:left w:w="120" w:type="dxa"/>
-              <w:right w:w="120" w:type="dxa"/>
-            </w:tcMar>
-            <w:tcBorders>
-              <w:top w:val="single" w:sz="4" w:space="0" w:color="000000"/>
-              <w:left w:val="single" w:sz="4" w:space="0" w:color="000000"/>
-              <w:bottom w:val="single" w:sz="4" w:space="0" w:color="000000"/>
-              <w:right w:val="single" w:sz="4" w:space="0" w:color="000000"/>
-            </w:tcBorders>
-          </w:tcPr>
-          <w:p>
-            <w:pPr>
-              <w:spacing w:line="312" w:lineRule="auto" w:before="0" w:after="0"/>
-              <w:ind w:firstLine="0"/>
-              <w:jc w:val="left"/>
-            </w:pPr>
-            <w:r>
-              <w:rPr>
-                <w:rFonts w:ascii="Times New Roman" w:hAnsi="Times New Roman"/>
-                <w:color w:val="000000"/>
-                <w:sz w:val="24"/>
-              </w:rPr>
-              <w:t>Bốn thao tác cơ bản trên dữ liệu: Tạo mới, Đọc, Cập nhật và Xóa</w:t>
-            </w:r>
-          </w:p>
-        </w:tc>
-      </w:tr>
-      <w:tr>
-        <w:trPr>
-          <w:cantSplit/>
-        </w:trPr>
-        <w:tc>
-          <w:tcPr>
-            <w:tcW w:type="dxa" w:w="1417"/>
-            <w:tcMar>
-              <w:top w:w="80" w:type="dxa"/>
-              <w:bottom w:w="80" w:type="dxa"/>
-              <w:left w:w="120" w:type="dxa"/>
-              <w:right w:w="120" w:type="dxa"/>
-            </w:tcMar>
-            <w:tcBorders>
-              <w:top w:val="single" w:sz="4" w:space="0" w:color="000000"/>
-              <w:left w:val="single" w:sz="4" w:space="0" w:color="000000"/>
-              <w:bottom w:val="single" w:sz="4" w:space="0" w:color="000000"/>
-              <w:right w:val="single" w:sz="4" w:space="0" w:color="000000"/>
-            </w:tcBorders>
-          </w:tcPr>
-          <w:p>
-            <w:pPr>
-              <w:spacing w:line="312" w:lineRule="auto" w:before="0" w:after="0"/>
-              <w:ind w:firstLine="0"/>
-              <w:jc w:val="center"/>
-            </w:pPr>
-            <w:r>
-              <w:rPr>
-                <w:rFonts w:ascii="Times New Roman" w:hAnsi="Times New Roman"/>
-                <w:b/>
-                <w:color w:val="000000"/>
-                <w:sz w:val="24"/>
-              </w:rPr>
-              <w:t>DBMS</w:t>
-            </w:r>
-          </w:p>
-        </w:tc>
-        <w:tc>
-          <w:tcPr>
-            <w:tcW w:type="dxa" w:w="3118"/>
-            <w:tcMar>
-              <w:top w:w="80" w:type="dxa"/>
-              <w:bottom w:w="80" w:type="dxa"/>
-              <w:left w:w="120" w:type="dxa"/>
-              <w:right w:w="120" w:type="dxa"/>
-            </w:tcMar>
-            <w:tcBorders>
-              <w:top w:val="single" w:sz="4" w:space="0" w:color="000000"/>
-              <w:left w:val="single" w:sz="4" w:space="0" w:color="000000"/>
-              <w:bottom w:val="single" w:sz="4" w:space="0" w:color="000000"/>
-              <w:right w:val="single" w:sz="4" w:space="0" w:color="000000"/>
-            </w:tcBorders>
-          </w:tcPr>
-          <w:p>
-            <w:pPr>
-              <w:spacing w:line="312" w:lineRule="auto" w:before="0" w:after="0"/>
-              <w:ind w:firstLine="0"/>
-              <w:jc w:val="left"/>
-            </w:pPr>
-            <w:r>
-              <w:rPr>
-                <w:rFonts w:ascii="Times New Roman" w:hAnsi="Times New Roman"/>
-                <w:color w:val="000000"/>
-                <w:sz w:val="24"/>
-              </w:rPr>
-              <w:t>Database Management System</w:t>
-            </w:r>
-          </w:p>
-        </w:tc>
-        <w:tc>
-          <w:tcPr>
-            <w:tcW w:type="dxa" w:w="3969"/>
-            <w:tcMar>
-              <w:top w:w="80" w:type="dxa"/>
-              <w:bottom w:w="80" w:type="dxa"/>
-              <w:left w:w="120" w:type="dxa"/>
-              <w:right w:w="120" w:type="dxa"/>
-            </w:tcMar>
-            <w:tcBorders>
-              <w:top w:val="single" w:sz="4" w:space="0" w:color="000000"/>
-              <w:left w:val="single" w:sz="4" w:space="0" w:color="000000"/>
-              <w:bottom w:val="single" w:sz="4" w:space="0" w:color="000000"/>
-              <w:right w:val="single" w:sz="4" w:space="0" w:color="000000"/>
-            </w:tcBorders>
-          </w:tcPr>
-          <w:p>
-            <w:pPr>
-              <w:spacing w:line="312" w:lineRule="auto" w:before="0" w:after="0"/>
-              <w:ind w:firstLine="0"/>
-              <w:jc w:val="left"/>
-            </w:pPr>
-            <w:r>
-              <w:rPr>
-                <w:rFonts w:ascii="Times New Roman" w:hAnsi="Times New Roman"/>
-                <w:color w:val="000000"/>
-                <w:sz w:val="24"/>
+                <w:sz w:val="23"/>
               </w:rPr>
               <w:t>Hệ quản trị cơ sở dữ liệu</w:t>
             </w:r>
@@ -1468,10 +1060,10 @@
           <w:tcPr>
             <w:tcW w:type="dxa" w:w="1417"/>
             <w:tcMar>
-              <w:top w:w="80" w:type="dxa"/>
-              <w:bottom w:w="80" w:type="dxa"/>
-              <w:left w:w="120" w:type="dxa"/>
-              <w:right w:w="120" w:type="dxa"/>
+              <w:top w:w="50" w:type="dxa"/>
+              <w:bottom w:w="50" w:type="dxa"/>
+              <w:left w:w="100" w:type="dxa"/>
+              <w:right w:w="100" w:type="dxa"/>
             </w:tcMar>
             <w:tcBorders>
               <w:top w:val="single" w:sz="4" w:space="0" w:color="000000"/>
@@ -1482,7 +1074,7 @@
           </w:tcPr>
           <w:p>
             <w:pPr>
-              <w:spacing w:line="312" w:lineRule="auto" w:before="0" w:after="0"/>
+              <w:spacing w:line="288" w:lineRule="auto" w:before="0" w:after="0"/>
               <w:ind w:firstLine="0"/>
               <w:jc w:val="center"/>
             </w:pPr>
@@ -1491,7 +1083,7 @@
                 <w:rFonts w:ascii="Times New Roman" w:hAnsi="Times New Roman"/>
                 <w:b/>
                 <w:color w:val="000000"/>
-                <w:sz w:val="24"/>
+                <w:sz w:val="23"/>
               </w:rPr>
               <w:t>DFD</w:t>
             </w:r>
@@ -1501,10 +1093,10 @@
           <w:tcPr>
             <w:tcW w:type="dxa" w:w="3118"/>
             <w:tcMar>
-              <w:top w:w="80" w:type="dxa"/>
-              <w:bottom w:w="80" w:type="dxa"/>
-              <w:left w:w="120" w:type="dxa"/>
-              <w:right w:w="120" w:type="dxa"/>
+              <w:top w:w="50" w:type="dxa"/>
+              <w:bottom w:w="50" w:type="dxa"/>
+              <w:left w:w="100" w:type="dxa"/>
+              <w:right w:w="100" w:type="dxa"/>
             </w:tcMar>
             <w:tcBorders>
               <w:top w:val="single" w:sz="4" w:space="0" w:color="000000"/>
@@ -1515,7 +1107,7 @@
           </w:tcPr>
           <w:p>
             <w:pPr>
-              <w:spacing w:line="312" w:lineRule="auto" w:before="0" w:after="0"/>
+              <w:spacing w:line="288" w:lineRule="auto" w:before="0" w:after="0"/>
               <w:ind w:firstLine="0"/>
               <w:jc w:val="left"/>
             </w:pPr>
@@ -1523,7 +1115,7 @@
               <w:rPr>
                 <w:rFonts w:ascii="Times New Roman" w:hAnsi="Times New Roman"/>
                 <w:color w:val="000000"/>
-                <w:sz w:val="24"/>
+                <w:sz w:val="23"/>
               </w:rPr>
               <w:t>Data Flow Diagram</w:t>
             </w:r>
@@ -1533,10 +1125,10 @@
           <w:tcPr>
             <w:tcW w:type="dxa" w:w="3969"/>
             <w:tcMar>
-              <w:top w:w="80" w:type="dxa"/>
-              <w:bottom w:w="80" w:type="dxa"/>
-              <w:left w:w="120" w:type="dxa"/>
-              <w:right w:w="120" w:type="dxa"/>
+              <w:top w:w="50" w:type="dxa"/>
+              <w:bottom w:w="50" w:type="dxa"/>
+              <w:left w:w="100" w:type="dxa"/>
+              <w:right w:w="100" w:type="dxa"/>
             </w:tcMar>
             <w:tcBorders>
               <w:top w:val="single" w:sz="4" w:space="0" w:color="000000"/>
@@ -1547,7 +1139,7 @@
           </w:tcPr>
           <w:p>
             <w:pPr>
-              <w:spacing w:line="312" w:lineRule="auto" w:before="0" w:after="0"/>
+              <w:spacing w:line="288" w:lineRule="auto" w:before="0" w:after="0"/>
               <w:ind w:firstLine="0"/>
               <w:jc w:val="left"/>
             </w:pPr>
@@ -1555,9 +1147,9 @@
               <w:rPr>
                 <w:rFonts w:ascii="Times New Roman" w:hAnsi="Times New Roman"/>
                 <w:color w:val="000000"/>
-                <w:sz w:val="24"/>
+                <w:sz w:val="23"/>
               </w:rPr>
-              <w:t>Sơ đồ luồng dữ liệu mô tả sự chuyển dịch thông tin trong hệ thống</w:t>
+              <w:t>Sơ đồ luồng dữ liệu của hệ thống</w:t>
             </w:r>
           </w:p>
         </w:tc>
@@ -1570,10 +1162,10 @@
           <w:tcPr>
             <w:tcW w:type="dxa" w:w="1417"/>
             <w:tcMar>
-              <w:top w:w="80" w:type="dxa"/>
-              <w:bottom w:w="80" w:type="dxa"/>
-              <w:left w:w="120" w:type="dxa"/>
-              <w:right w:w="120" w:type="dxa"/>
+              <w:top w:w="50" w:type="dxa"/>
+              <w:bottom w:w="50" w:type="dxa"/>
+              <w:left w:w="100" w:type="dxa"/>
+              <w:right w:w="100" w:type="dxa"/>
             </w:tcMar>
             <w:tcBorders>
               <w:top w:val="single" w:sz="4" w:space="0" w:color="000000"/>
@@ -1584,7 +1176,7 @@
           </w:tcPr>
           <w:p>
             <w:pPr>
-              <w:spacing w:line="312" w:lineRule="auto" w:before="0" w:after="0"/>
+              <w:spacing w:line="288" w:lineRule="auto" w:before="0" w:after="0"/>
               <w:ind w:firstLine="0"/>
               <w:jc w:val="center"/>
             </w:pPr>
@@ -1593,9 +1185,9 @@
                 <w:rFonts w:ascii="Times New Roman" w:hAnsi="Times New Roman"/>
                 <w:b/>
                 <w:color w:val="000000"/>
-                <w:sz w:val="24"/>
+                <w:sz w:val="23"/>
               </w:rPr>
-              <w:t>ERD</w:t>
+              <w:t>FR</w:t>
             </w:r>
           </w:p>
         </w:tc>
@@ -1603,10 +1195,10 @@
           <w:tcPr>
             <w:tcW w:type="dxa" w:w="3118"/>
             <w:tcMar>
-              <w:top w:w="80" w:type="dxa"/>
-              <w:bottom w:w="80" w:type="dxa"/>
-              <w:left w:w="120" w:type="dxa"/>
-              <w:right w:w="120" w:type="dxa"/>
+              <w:top w:w="50" w:type="dxa"/>
+              <w:bottom w:w="50" w:type="dxa"/>
+              <w:left w:w="100" w:type="dxa"/>
+              <w:right w:w="100" w:type="dxa"/>
             </w:tcMar>
             <w:tcBorders>
               <w:top w:val="single" w:sz="4" w:space="0" w:color="000000"/>
@@ -1617,7 +1209,7 @@
           </w:tcPr>
           <w:p>
             <w:pPr>
-              <w:spacing w:line="312" w:lineRule="auto" w:before="0" w:after="0"/>
+              <w:spacing w:line="288" w:lineRule="auto" w:before="0" w:after="0"/>
               <w:ind w:firstLine="0"/>
               <w:jc w:val="left"/>
             </w:pPr>
@@ -1625,9 +1217,9 @@
               <w:rPr>
                 <w:rFonts w:ascii="Times New Roman" w:hAnsi="Times New Roman"/>
                 <w:color w:val="000000"/>
-                <w:sz w:val="24"/>
+                <w:sz w:val="23"/>
               </w:rPr>
-              <w:t>Entity Relationship Diagram</w:t>
+              <w:t>Functional Requirement</w:t>
             </w:r>
           </w:p>
         </w:tc>
@@ -1635,10 +1227,10 @@
           <w:tcPr>
             <w:tcW w:type="dxa" w:w="3969"/>
             <w:tcMar>
-              <w:top w:w="80" w:type="dxa"/>
-              <w:bottom w:w="80" w:type="dxa"/>
-              <w:left w:w="120" w:type="dxa"/>
-              <w:right w:w="120" w:type="dxa"/>
+              <w:top w:w="50" w:type="dxa"/>
+              <w:bottom w:w="50" w:type="dxa"/>
+              <w:left w:w="100" w:type="dxa"/>
+              <w:right w:w="100" w:type="dxa"/>
             </w:tcMar>
             <w:tcBorders>
               <w:top w:val="single" w:sz="4" w:space="0" w:color="000000"/>
@@ -1649,7 +1241,7 @@
           </w:tcPr>
           <w:p>
             <w:pPr>
-              <w:spacing w:line="312" w:lineRule="auto" w:before="0" w:after="0"/>
+              <w:spacing w:line="288" w:lineRule="auto" w:before="0" w:after="0"/>
               <w:ind w:firstLine="0"/>
               <w:jc w:val="left"/>
             </w:pPr>
@@ -1657,9 +1249,9 @@
               <w:rPr>
                 <w:rFonts w:ascii="Times New Roman" w:hAnsi="Times New Roman"/>
                 <w:color w:val="000000"/>
-                <w:sz w:val="24"/>
+                <w:sz w:val="23"/>
               </w:rPr>
-              <w:t>Sơ đồ quan hệ thực thể</w:t>
+              <w:t>Yêu cầu chức năng của phần mềm (Chuẩn IEEE 830)</w:t>
             </w:r>
           </w:p>
         </w:tc>
@@ -1672,10 +1264,10 @@
           <w:tcPr>
             <w:tcW w:type="dxa" w:w="1417"/>
             <w:tcMar>
-              <w:top w:w="80" w:type="dxa"/>
-              <w:bottom w:w="80" w:type="dxa"/>
-              <w:left w:w="120" w:type="dxa"/>
-              <w:right w:w="120" w:type="dxa"/>
+              <w:top w:w="50" w:type="dxa"/>
+              <w:bottom w:w="50" w:type="dxa"/>
+              <w:left w:w="100" w:type="dxa"/>
+              <w:right w:w="100" w:type="dxa"/>
             </w:tcMar>
             <w:tcBorders>
               <w:top w:val="single" w:sz="4" w:space="0" w:color="000000"/>
@@ -1686,7 +1278,7 @@
           </w:tcPr>
           <w:p>
             <w:pPr>
-              <w:spacing w:line="312" w:lineRule="auto" w:before="0" w:after="0"/>
+              <w:spacing w:line="288" w:lineRule="auto" w:before="0" w:after="0"/>
               <w:ind w:firstLine="0"/>
               <w:jc w:val="center"/>
             </w:pPr>
@@ -1695,9 +1287,9 @@
                 <w:rFonts w:ascii="Times New Roman" w:hAnsi="Times New Roman"/>
                 <w:b/>
                 <w:color w:val="000000"/>
-                <w:sz w:val="24"/>
+                <w:sz w:val="23"/>
               </w:rPr>
-              <w:t>ESR</w:t>
+              <w:t>IT</w:t>
             </w:r>
           </w:p>
         </w:tc>
@@ -1705,10 +1297,10 @@
           <w:tcPr>
             <w:tcW w:type="dxa" w:w="3118"/>
             <w:tcMar>
-              <w:top w:w="80" w:type="dxa"/>
-              <w:bottom w:w="80" w:type="dxa"/>
-              <w:left w:w="120" w:type="dxa"/>
-              <w:right w:w="120" w:type="dxa"/>
+              <w:top w:w="50" w:type="dxa"/>
+              <w:bottom w:w="50" w:type="dxa"/>
+              <w:left w:w="100" w:type="dxa"/>
+              <w:right w:w="100" w:type="dxa"/>
             </w:tcMar>
             <w:tcBorders>
               <w:top w:val="single" w:sz="4" w:space="0" w:color="000000"/>
@@ -1719,7 +1311,7 @@
           </w:tcPr>
           <w:p>
             <w:pPr>
-              <w:spacing w:line="312" w:lineRule="auto" w:before="0" w:after="0"/>
+              <w:spacing w:line="288" w:lineRule="auto" w:before="0" w:after="0"/>
               <w:ind w:firstLine="0"/>
               <w:jc w:val="left"/>
             </w:pPr>
@@ -1727,9 +1319,9 @@
               <w:rPr>
                 <w:rFonts w:ascii="Times New Roman" w:hAnsi="Times New Roman"/>
                 <w:color w:val="000000"/>
-                <w:sz w:val="24"/>
+                <w:sz w:val="23"/>
               </w:rPr>
-              <w:t>Equality, Sort, Range</w:t>
+              <w:t>Information Technology</w:t>
             </w:r>
           </w:p>
         </w:tc>
@@ -1737,10 +1329,10 @@
           <w:tcPr>
             <w:tcW w:type="dxa" w:w="3969"/>
             <w:tcMar>
-              <w:top w:w="80" w:type="dxa"/>
-              <w:bottom w:w="80" w:type="dxa"/>
-              <w:left w:w="120" w:type="dxa"/>
-              <w:right w:w="120" w:type="dxa"/>
+              <w:top w:w="50" w:type="dxa"/>
+              <w:bottom w:w="50" w:type="dxa"/>
+              <w:left w:w="100" w:type="dxa"/>
+              <w:right w:w="100" w:type="dxa"/>
             </w:tcMar>
             <w:tcBorders>
               <w:top w:val="single" w:sz="4" w:space="0" w:color="000000"/>
@@ -1751,7 +1343,7 @@
           </w:tcPr>
           <w:p>
             <w:pPr>
-              <w:spacing w:line="312" w:lineRule="auto" w:before="0" w:after="0"/>
+              <w:spacing w:line="288" w:lineRule="auto" w:before="0" w:after="0"/>
               <w:ind w:firstLine="0"/>
               <w:jc w:val="left"/>
             </w:pPr>
@@ -1759,517 +1351,7 @@
               <w:rPr>
                 <w:rFonts w:ascii="Times New Roman" w:hAnsi="Times New Roman"/>
                 <w:color w:val="000000"/>
-                <w:sz w:val="24"/>
-              </w:rPr>
-              <w:t>Quy tắc vàng thiết kế chỉ mục kết hợp tối ưu trên MongoDB</w:t>
-            </w:r>
-          </w:p>
-        </w:tc>
-      </w:tr>
-      <w:tr>
-        <w:trPr>
-          <w:cantSplit/>
-        </w:trPr>
-        <w:tc>
-          <w:tcPr>
-            <w:tcW w:type="dxa" w:w="1417"/>
-            <w:tcMar>
-              <w:top w:w="80" w:type="dxa"/>
-              <w:bottom w:w="80" w:type="dxa"/>
-              <w:left w:w="120" w:type="dxa"/>
-              <w:right w:w="120" w:type="dxa"/>
-            </w:tcMar>
-            <w:tcBorders>
-              <w:top w:val="single" w:sz="4" w:space="0" w:color="000000"/>
-              <w:left w:val="single" w:sz="4" w:space="0" w:color="000000"/>
-              <w:bottom w:val="single" w:sz="4" w:space="0" w:color="000000"/>
-              <w:right w:val="single" w:sz="4" w:space="0" w:color="000000"/>
-            </w:tcBorders>
-          </w:tcPr>
-          <w:p>
-            <w:pPr>
-              <w:spacing w:line="312" w:lineRule="auto" w:before="0" w:after="0"/>
-              <w:ind w:firstLine="0"/>
-              <w:jc w:val="center"/>
-            </w:pPr>
-            <w:r>
-              <w:rPr>
-                <w:rFonts w:ascii="Times New Roman" w:hAnsi="Times New Roman"/>
-                <w:b/>
-                <w:color w:val="000000"/>
-                <w:sz w:val="24"/>
-              </w:rPr>
-              <w:t>FR</w:t>
-            </w:r>
-          </w:p>
-        </w:tc>
-        <w:tc>
-          <w:tcPr>
-            <w:tcW w:type="dxa" w:w="3118"/>
-            <w:tcMar>
-              <w:top w:w="80" w:type="dxa"/>
-              <w:bottom w:w="80" w:type="dxa"/>
-              <w:left w:w="120" w:type="dxa"/>
-              <w:right w:w="120" w:type="dxa"/>
-            </w:tcMar>
-            <w:tcBorders>
-              <w:top w:val="single" w:sz="4" w:space="0" w:color="000000"/>
-              <w:left w:val="single" w:sz="4" w:space="0" w:color="000000"/>
-              <w:bottom w:val="single" w:sz="4" w:space="0" w:color="000000"/>
-              <w:right w:val="single" w:sz="4" w:space="0" w:color="000000"/>
-            </w:tcBorders>
-          </w:tcPr>
-          <w:p>
-            <w:pPr>
-              <w:spacing w:line="312" w:lineRule="auto" w:before="0" w:after="0"/>
-              <w:ind w:firstLine="0"/>
-              <w:jc w:val="left"/>
-            </w:pPr>
-            <w:r>
-              <w:rPr>
-                <w:rFonts w:ascii="Times New Roman" w:hAnsi="Times New Roman"/>
-                <w:color w:val="000000"/>
-                <w:sz w:val="24"/>
-              </w:rPr>
-              <w:t>Functional Requirement</w:t>
-            </w:r>
-          </w:p>
-        </w:tc>
-        <w:tc>
-          <w:tcPr>
-            <w:tcW w:type="dxa" w:w="3969"/>
-            <w:tcMar>
-              <w:top w:w="80" w:type="dxa"/>
-              <w:bottom w:w="80" w:type="dxa"/>
-              <w:left w:w="120" w:type="dxa"/>
-              <w:right w:w="120" w:type="dxa"/>
-            </w:tcMar>
-            <w:tcBorders>
-              <w:top w:val="single" w:sz="4" w:space="0" w:color="000000"/>
-              <w:left w:val="single" w:sz="4" w:space="0" w:color="000000"/>
-              <w:bottom w:val="single" w:sz="4" w:space="0" w:color="000000"/>
-              <w:right w:val="single" w:sz="4" w:space="0" w:color="000000"/>
-            </w:tcBorders>
-          </w:tcPr>
-          <w:p>
-            <w:pPr>
-              <w:spacing w:line="312" w:lineRule="auto" w:before="0" w:after="0"/>
-              <w:ind w:firstLine="0"/>
-              <w:jc w:val="left"/>
-            </w:pPr>
-            <w:r>
-              <w:rPr>
-                <w:rFonts w:ascii="Times New Roman" w:hAnsi="Times New Roman"/>
-                <w:color w:val="000000"/>
-                <w:sz w:val="24"/>
-              </w:rPr>
-              <w:t>Yêu cầu chức năng của hệ thống phần mềm</w:t>
-            </w:r>
-          </w:p>
-        </w:tc>
-      </w:tr>
-      <w:tr>
-        <w:trPr>
-          <w:cantSplit/>
-        </w:trPr>
-        <w:tc>
-          <w:tcPr>
-            <w:tcW w:type="dxa" w:w="1417"/>
-            <w:tcMar>
-              <w:top w:w="80" w:type="dxa"/>
-              <w:bottom w:w="80" w:type="dxa"/>
-              <w:left w:w="120" w:type="dxa"/>
-              <w:right w:w="120" w:type="dxa"/>
-            </w:tcMar>
-            <w:tcBorders>
-              <w:top w:val="single" w:sz="4" w:space="0" w:color="000000"/>
-              <w:left w:val="single" w:sz="4" w:space="0" w:color="000000"/>
-              <w:bottom w:val="single" w:sz="4" w:space="0" w:color="000000"/>
-              <w:right w:val="single" w:sz="4" w:space="0" w:color="000000"/>
-            </w:tcBorders>
-          </w:tcPr>
-          <w:p>
-            <w:pPr>
-              <w:spacing w:line="312" w:lineRule="auto" w:before="0" w:after="0"/>
-              <w:ind w:firstLine="0"/>
-              <w:jc w:val="center"/>
-            </w:pPr>
-            <w:r>
-              <w:rPr>
-                <w:rFonts w:ascii="Times New Roman" w:hAnsi="Times New Roman"/>
-                <w:b/>
-                <w:color w:val="000000"/>
-                <w:sz w:val="24"/>
-              </w:rPr>
-              <w:t>GUI</w:t>
-            </w:r>
-          </w:p>
-        </w:tc>
-        <w:tc>
-          <w:tcPr>
-            <w:tcW w:type="dxa" w:w="3118"/>
-            <w:tcMar>
-              <w:top w:w="80" w:type="dxa"/>
-              <w:bottom w:w="80" w:type="dxa"/>
-              <w:left w:w="120" w:type="dxa"/>
-              <w:right w:w="120" w:type="dxa"/>
-            </w:tcMar>
-            <w:tcBorders>
-              <w:top w:val="single" w:sz="4" w:space="0" w:color="000000"/>
-              <w:left w:val="single" w:sz="4" w:space="0" w:color="000000"/>
-              <w:bottom w:val="single" w:sz="4" w:space="0" w:color="000000"/>
-              <w:right w:val="single" w:sz="4" w:space="0" w:color="000000"/>
-            </w:tcBorders>
-          </w:tcPr>
-          <w:p>
-            <w:pPr>
-              <w:spacing w:line="312" w:lineRule="auto" w:before="0" w:after="0"/>
-              <w:ind w:firstLine="0"/>
-              <w:jc w:val="left"/>
-            </w:pPr>
-            <w:r>
-              <w:rPr>
-                <w:rFonts w:ascii="Times New Roman" w:hAnsi="Times New Roman"/>
-                <w:color w:val="000000"/>
-                <w:sz w:val="24"/>
-              </w:rPr>
-              <w:t>Graphical User Interface</w:t>
-            </w:r>
-          </w:p>
-        </w:tc>
-        <w:tc>
-          <w:tcPr>
-            <w:tcW w:type="dxa" w:w="3969"/>
-            <w:tcMar>
-              <w:top w:w="80" w:type="dxa"/>
-              <w:bottom w:w="80" w:type="dxa"/>
-              <w:left w:w="120" w:type="dxa"/>
-              <w:right w:w="120" w:type="dxa"/>
-            </w:tcMar>
-            <w:tcBorders>
-              <w:top w:val="single" w:sz="4" w:space="0" w:color="000000"/>
-              <w:left w:val="single" w:sz="4" w:space="0" w:color="000000"/>
-              <w:bottom w:val="single" w:sz="4" w:space="0" w:color="000000"/>
-              <w:right w:val="single" w:sz="4" w:space="0" w:color="000000"/>
-            </w:tcBorders>
-          </w:tcPr>
-          <w:p>
-            <w:pPr>
-              <w:spacing w:line="312" w:lineRule="auto" w:before="0" w:after="0"/>
-              <w:ind w:firstLine="0"/>
-              <w:jc w:val="left"/>
-            </w:pPr>
-            <w:r>
-              <w:rPr>
-                <w:rFonts w:ascii="Times New Roman" w:hAnsi="Times New Roman"/>
-                <w:color w:val="000000"/>
-                <w:sz w:val="24"/>
-              </w:rPr>
-              <w:t>Giao diện người dùng đồ họa</w:t>
-            </w:r>
-          </w:p>
-        </w:tc>
-      </w:tr>
-      <w:tr>
-        <w:trPr>
-          <w:cantSplit/>
-        </w:trPr>
-        <w:tc>
-          <w:tcPr>
-            <w:tcW w:type="dxa" w:w="1417"/>
-            <w:tcMar>
-              <w:top w:w="80" w:type="dxa"/>
-              <w:bottom w:w="80" w:type="dxa"/>
-              <w:left w:w="120" w:type="dxa"/>
-              <w:right w:w="120" w:type="dxa"/>
-            </w:tcMar>
-            <w:tcBorders>
-              <w:top w:val="single" w:sz="4" w:space="0" w:color="000000"/>
-              <w:left w:val="single" w:sz="4" w:space="0" w:color="000000"/>
-              <w:bottom w:val="single" w:sz="4" w:space="0" w:color="000000"/>
-              <w:right w:val="single" w:sz="4" w:space="0" w:color="000000"/>
-            </w:tcBorders>
-          </w:tcPr>
-          <w:p>
-            <w:pPr>
-              <w:spacing w:line="312" w:lineRule="auto" w:before="0" w:after="0"/>
-              <w:ind w:firstLine="0"/>
-              <w:jc w:val="center"/>
-            </w:pPr>
-            <w:r>
-              <w:rPr>
-                <w:rFonts w:ascii="Times New Roman" w:hAnsi="Times New Roman"/>
-                <w:b/>
-                <w:color w:val="000000"/>
-                <w:sz w:val="24"/>
-              </w:rPr>
-              <w:t>HUIT</w:t>
-            </w:r>
-          </w:p>
-        </w:tc>
-        <w:tc>
-          <w:tcPr>
-            <w:tcW w:type="dxa" w:w="3118"/>
-            <w:tcMar>
-              <w:top w:w="80" w:type="dxa"/>
-              <w:bottom w:w="80" w:type="dxa"/>
-              <w:left w:w="120" w:type="dxa"/>
-              <w:right w:w="120" w:type="dxa"/>
-            </w:tcMar>
-            <w:tcBorders>
-              <w:top w:val="single" w:sz="4" w:space="0" w:color="000000"/>
-              <w:left w:val="single" w:sz="4" w:space="0" w:color="000000"/>
-              <w:bottom w:val="single" w:sz="4" w:space="0" w:color="000000"/>
-              <w:right w:val="single" w:sz="4" w:space="0" w:color="000000"/>
-            </w:tcBorders>
-          </w:tcPr>
-          <w:p>
-            <w:pPr>
-              <w:spacing w:line="312" w:lineRule="auto" w:before="0" w:after="0"/>
-              <w:ind w:firstLine="0"/>
-              <w:jc w:val="left"/>
-            </w:pPr>
-            <w:r>
-              <w:rPr>
-                <w:rFonts w:ascii="Times New Roman" w:hAnsi="Times New Roman"/>
-                <w:color w:val="000000"/>
-                <w:sz w:val="24"/>
-              </w:rPr>
-              <w:t>Ho Chi Minh City University of Industry and Trade</w:t>
-            </w:r>
-          </w:p>
-        </w:tc>
-        <w:tc>
-          <w:tcPr>
-            <w:tcW w:type="dxa" w:w="3969"/>
-            <w:tcMar>
-              <w:top w:w="80" w:type="dxa"/>
-              <w:bottom w:w="80" w:type="dxa"/>
-              <w:left w:w="120" w:type="dxa"/>
-              <w:right w:w="120" w:type="dxa"/>
-            </w:tcMar>
-            <w:tcBorders>
-              <w:top w:val="single" w:sz="4" w:space="0" w:color="000000"/>
-              <w:left w:val="single" w:sz="4" w:space="0" w:color="000000"/>
-              <w:bottom w:val="single" w:sz="4" w:space="0" w:color="000000"/>
-              <w:right w:val="single" w:sz="4" w:space="0" w:color="000000"/>
-            </w:tcBorders>
-          </w:tcPr>
-          <w:p>
-            <w:pPr>
-              <w:spacing w:line="312" w:lineRule="auto" w:before="0" w:after="0"/>
-              <w:ind w:firstLine="0"/>
-              <w:jc w:val="left"/>
-            </w:pPr>
-            <w:r>
-              <w:rPr>
-                <w:rFonts w:ascii="Times New Roman" w:hAnsi="Times New Roman"/>
-                <w:color w:val="000000"/>
-                <w:sz w:val="24"/>
-              </w:rPr>
-              <w:t>Trường Đại học Công Thương Thành phố Hồ Chí Minh</w:t>
-            </w:r>
-          </w:p>
-        </w:tc>
-      </w:tr>
-      <w:tr>
-        <w:trPr>
-          <w:cantSplit/>
-        </w:trPr>
-        <w:tc>
-          <w:tcPr>
-            <w:tcW w:type="dxa" w:w="1417"/>
-            <w:tcMar>
-              <w:top w:w="80" w:type="dxa"/>
-              <w:bottom w:w="80" w:type="dxa"/>
-              <w:left w:w="120" w:type="dxa"/>
-              <w:right w:w="120" w:type="dxa"/>
-            </w:tcMar>
-            <w:tcBorders>
-              <w:top w:val="single" w:sz="4" w:space="0" w:color="000000"/>
-              <w:left w:val="single" w:sz="4" w:space="0" w:color="000000"/>
-              <w:bottom w:val="single" w:sz="4" w:space="0" w:color="000000"/>
-              <w:right w:val="single" w:sz="4" w:space="0" w:color="000000"/>
-            </w:tcBorders>
-          </w:tcPr>
-          <w:p>
-            <w:pPr>
-              <w:spacing w:line="312" w:lineRule="auto" w:before="0" w:after="0"/>
-              <w:ind w:firstLine="0"/>
-              <w:jc w:val="center"/>
-            </w:pPr>
-            <w:r>
-              <w:rPr>
-                <w:rFonts w:ascii="Times New Roman" w:hAnsi="Times New Roman"/>
-                <w:b/>
-                <w:color w:val="000000"/>
-                <w:sz w:val="24"/>
-              </w:rPr>
-              <w:t>IELTS</w:t>
-            </w:r>
-          </w:p>
-        </w:tc>
-        <w:tc>
-          <w:tcPr>
-            <w:tcW w:type="dxa" w:w="3118"/>
-            <w:tcMar>
-              <w:top w:w="80" w:type="dxa"/>
-              <w:bottom w:w="80" w:type="dxa"/>
-              <w:left w:w="120" w:type="dxa"/>
-              <w:right w:w="120" w:type="dxa"/>
-            </w:tcMar>
-            <w:tcBorders>
-              <w:top w:val="single" w:sz="4" w:space="0" w:color="000000"/>
-              <w:left w:val="single" w:sz="4" w:space="0" w:color="000000"/>
-              <w:bottom w:val="single" w:sz="4" w:space="0" w:color="000000"/>
-              <w:right w:val="single" w:sz="4" w:space="0" w:color="000000"/>
-            </w:tcBorders>
-          </w:tcPr>
-          <w:p>
-            <w:pPr>
-              <w:spacing w:line="312" w:lineRule="auto" w:before="0" w:after="0"/>
-              <w:ind w:firstLine="0"/>
-              <w:jc w:val="left"/>
-            </w:pPr>
-            <w:r>
-              <w:rPr>
-                <w:rFonts w:ascii="Times New Roman" w:hAnsi="Times New Roman"/>
-                <w:color w:val="000000"/>
-                <w:sz w:val="24"/>
-              </w:rPr>
-              <w:t>International English Language Testing System</w:t>
-            </w:r>
-          </w:p>
-        </w:tc>
-        <w:tc>
-          <w:tcPr>
-            <w:tcW w:type="dxa" w:w="3969"/>
-            <w:tcMar>
-              <w:top w:w="80" w:type="dxa"/>
-              <w:bottom w:w="80" w:type="dxa"/>
-              <w:left w:w="120" w:type="dxa"/>
-              <w:right w:w="120" w:type="dxa"/>
-            </w:tcMar>
-            <w:tcBorders>
-              <w:top w:val="single" w:sz="4" w:space="0" w:color="000000"/>
-              <w:left w:val="single" w:sz="4" w:space="0" w:color="000000"/>
-              <w:bottom w:val="single" w:sz="4" w:space="0" w:color="000000"/>
-              <w:right w:val="single" w:sz="4" w:space="0" w:color="000000"/>
-            </w:tcBorders>
-          </w:tcPr>
-          <w:p>
-            <w:pPr>
-              <w:spacing w:line="312" w:lineRule="auto" w:before="0" w:after="0"/>
-              <w:ind w:firstLine="0"/>
-              <w:jc w:val="left"/>
-            </w:pPr>
-            <w:r>
-              <w:rPr>
-                <w:rFonts w:ascii="Times New Roman" w:hAnsi="Times New Roman"/>
-                <w:color w:val="000000"/>
-                <w:sz w:val="24"/>
-              </w:rPr>
-              <w:t>Hệ thống kiểm tra năng lực tiếng Anh quốc tế</w:t>
-            </w:r>
-          </w:p>
-        </w:tc>
-      </w:tr>
-      <w:tr>
-        <w:trPr>
-          <w:cantSplit/>
-        </w:trPr>
-        <w:tc>
-          <w:tcPr>
-            <w:tcW w:type="dxa" w:w="1417"/>
-            <w:tcMar>
-              <w:top w:w="80" w:type="dxa"/>
-              <w:bottom w:w="80" w:type="dxa"/>
-              <w:left w:w="120" w:type="dxa"/>
-              <w:right w:w="120" w:type="dxa"/>
-            </w:tcMar>
-            <w:tcBorders>
-              <w:top w:val="single" w:sz="4" w:space="0" w:color="000000"/>
-              <w:left w:val="single" w:sz="4" w:space="0" w:color="000000"/>
-              <w:bottom w:val="single" w:sz="4" w:space="0" w:color="000000"/>
-              <w:right w:val="single" w:sz="4" w:space="0" w:color="000000"/>
-            </w:tcBorders>
-          </w:tcPr>
-          <w:p>
-            <w:pPr>
-              <w:spacing w:line="312" w:lineRule="auto" w:before="0" w:after="0"/>
-              <w:ind w:firstLine="0"/>
-              <w:jc w:val="center"/>
-            </w:pPr>
-            <w:r>
-              <w:rPr>
-                <w:rFonts w:ascii="Times New Roman" w:hAnsi="Times New Roman"/>
-                <w:b/>
-                <w:color w:val="000000"/>
-                <w:sz w:val="24"/>
-              </w:rPr>
-              <w:t>IT</w:t>
-            </w:r>
-          </w:p>
-        </w:tc>
-        <w:tc>
-          <w:tcPr>
-            <w:tcW w:type="dxa" w:w="3118"/>
-            <w:tcMar>
-              <w:top w:w="80" w:type="dxa"/>
-              <w:bottom w:w="80" w:type="dxa"/>
-              <w:left w:w="120" w:type="dxa"/>
-              <w:right w:w="120" w:type="dxa"/>
-            </w:tcMar>
-            <w:tcBorders>
-              <w:top w:val="single" w:sz="4" w:space="0" w:color="000000"/>
-              <w:left w:val="single" w:sz="4" w:space="0" w:color="000000"/>
-              <w:bottom w:val="single" w:sz="4" w:space="0" w:color="000000"/>
-              <w:right w:val="single" w:sz="4" w:space="0" w:color="000000"/>
-            </w:tcBorders>
-          </w:tcPr>
-          <w:p>
-            <w:pPr>
-              <w:spacing w:line="312" w:lineRule="auto" w:before="0" w:after="0"/>
-              <w:ind w:firstLine="0"/>
-              <w:jc w:val="left"/>
-            </w:pPr>
-            <w:r>
-              <w:rPr>
-                <w:rFonts w:ascii="Times New Roman" w:hAnsi="Times New Roman"/>
-                <w:color w:val="000000"/>
-                <w:sz w:val="24"/>
-              </w:rPr>
-              <w:t>Information Technology</w:t>
-            </w:r>
-          </w:p>
-        </w:tc>
-        <w:tc>
-          <w:tcPr>
-            <w:tcW w:type="dxa" w:w="3969"/>
-            <w:tcMar>
-              <w:top w:w="80" w:type="dxa"/>
-              <w:bottom w:w="80" w:type="dxa"/>
-              <w:left w:w="120" w:type="dxa"/>
-              <w:right w:w="120" w:type="dxa"/>
-            </w:tcMar>
-            <w:tcBorders>
-              <w:top w:val="single" w:sz="4" w:space="0" w:color="000000"/>
-              <w:left w:val="single" w:sz="4" w:space="0" w:color="000000"/>
-              <w:bottom w:val="single" w:sz="4" w:space="0" w:color="000000"/>
-              <w:right w:val="single" w:sz="4" w:space="0" w:color="000000"/>
-            </w:tcBorders>
-          </w:tcPr>
-          <w:p>
-            <w:pPr>
-              <w:spacing w:line="312" w:lineRule="auto" w:before="0" w:after="0"/>
-              <w:ind w:firstLine="0"/>
-              <w:jc w:val="left"/>
-            </w:pPr>
-            <w:r>
-              <w:rPr>
-                <w:rFonts w:ascii="Times New Roman" w:hAnsi="Times New Roman"/>
-                <w:color w:val="000000"/>
-                <w:sz w:val="24"/>
+                <w:sz w:val="23"/>
               </w:rPr>
               <w:t>Công nghệ thông tin</w:t>
             </w:r>
@@ -2284,10 +1366,10 @@
           <w:tcPr>
             <w:tcW w:type="dxa" w:w="1417"/>
             <w:tcMar>
-              <w:top w:w="80" w:type="dxa"/>
-              <w:bottom w:w="80" w:type="dxa"/>
-              <w:left w:w="120" w:type="dxa"/>
-              <w:right w:w="120" w:type="dxa"/>
+              <w:top w:w="50" w:type="dxa"/>
+              <w:bottom w:w="50" w:type="dxa"/>
+              <w:left w:w="100" w:type="dxa"/>
+              <w:right w:w="100" w:type="dxa"/>
             </w:tcMar>
             <w:tcBorders>
               <w:top w:val="single" w:sz="4" w:space="0" w:color="000000"/>
@@ -2298,7 +1380,7 @@
           </w:tcPr>
           <w:p>
             <w:pPr>
-              <w:spacing w:line="312" w:lineRule="auto" w:before="0" w:after="0"/>
+              <w:spacing w:line="288" w:lineRule="auto" w:before="0" w:after="0"/>
               <w:ind w:firstLine="0"/>
               <w:jc w:val="center"/>
             </w:pPr>
@@ -2307,9 +1389,9 @@
                 <w:rFonts w:ascii="Times New Roman" w:hAnsi="Times New Roman"/>
                 <w:b/>
                 <w:color w:val="000000"/>
-                <w:sz w:val="24"/>
+                <w:sz w:val="23"/>
               </w:rPr>
-              <w:t>JSON</w:t>
+              <w:t>JSON / BSON</w:t>
             </w:r>
           </w:p>
         </w:tc>
@@ -2317,10 +1399,10 @@
           <w:tcPr>
             <w:tcW w:type="dxa" w:w="3118"/>
             <w:tcMar>
-              <w:top w:w="80" w:type="dxa"/>
-              <w:bottom w:w="80" w:type="dxa"/>
-              <w:left w:w="120" w:type="dxa"/>
-              <w:right w:w="120" w:type="dxa"/>
+              <w:top w:w="50" w:type="dxa"/>
+              <w:bottom w:w="50" w:type="dxa"/>
+              <w:left w:w="100" w:type="dxa"/>
+              <w:right w:w="100" w:type="dxa"/>
             </w:tcMar>
             <w:tcBorders>
               <w:top w:val="single" w:sz="4" w:space="0" w:color="000000"/>
@@ -2331,7 +1413,7 @@
           </w:tcPr>
           <w:p>
             <w:pPr>
-              <w:spacing w:line="312" w:lineRule="auto" w:before="0" w:after="0"/>
+              <w:spacing w:line="288" w:lineRule="auto" w:before="0" w:after="0"/>
               <w:ind w:firstLine="0"/>
               <w:jc w:val="left"/>
             </w:pPr>
@@ -2339,9 +1421,9 @@
               <w:rPr>
                 <w:rFonts w:ascii="Times New Roman" w:hAnsi="Times New Roman"/>
                 <w:color w:val="000000"/>
-                <w:sz w:val="24"/>
+                <w:sz w:val="23"/>
               </w:rPr>
-              <w:t>JavaScript Object Notation</w:t>
+              <w:t>JavaScript Object Notation / Binary JSON</w:t>
             </w:r>
           </w:p>
         </w:tc>
@@ -2349,10 +1431,10 @@
           <w:tcPr>
             <w:tcW w:type="dxa" w:w="3969"/>
             <w:tcMar>
-              <w:top w:w="80" w:type="dxa"/>
-              <w:bottom w:w="80" w:type="dxa"/>
-              <w:left w:w="120" w:type="dxa"/>
-              <w:right w:w="120" w:type="dxa"/>
+              <w:top w:w="50" w:type="dxa"/>
+              <w:bottom w:w="50" w:type="dxa"/>
+              <w:left w:w="100" w:type="dxa"/>
+              <w:right w:w="100" w:type="dxa"/>
             </w:tcMar>
             <w:tcBorders>
               <w:top w:val="single" w:sz="4" w:space="0" w:color="000000"/>
@@ -2363,7 +1445,7 @@
           </w:tcPr>
           <w:p>
             <w:pPr>
-              <w:spacing w:line="312" w:lineRule="auto" w:before="0" w:after="0"/>
+              <w:spacing w:line="288" w:lineRule="auto" w:before="0" w:after="0"/>
               <w:ind w:firstLine="0"/>
               <w:jc w:val="left"/>
             </w:pPr>
@@ -2371,9 +1453,9 @@
               <w:rPr>
                 <w:rFonts w:ascii="Times New Roman" w:hAnsi="Times New Roman"/>
                 <w:color w:val="000000"/>
-                <w:sz w:val="24"/>
+                <w:sz w:val="23"/>
               </w:rPr>
-              <w:t>Định dạng trao đổi dữ liệu dạng văn bản nhẹ</w:t>
+              <w:t>Định dạng trao đổi và lưu trữ tài liệu của MongoDB</w:t>
             </w:r>
           </w:p>
         </w:tc>
@@ -2386,10 +1468,10 @@
           <w:tcPr>
             <w:tcW w:type="dxa" w:w="1417"/>
             <w:tcMar>
-              <w:top w:w="80" w:type="dxa"/>
-              <w:bottom w:w="80" w:type="dxa"/>
-              <w:left w:w="120" w:type="dxa"/>
-              <w:right w:w="120" w:type="dxa"/>
+              <w:top w:w="50" w:type="dxa"/>
+              <w:bottom w:w="50" w:type="dxa"/>
+              <w:left w:w="100" w:type="dxa"/>
+              <w:right w:w="100" w:type="dxa"/>
             </w:tcMar>
             <w:tcBorders>
               <w:top w:val="single" w:sz="4" w:space="0" w:color="000000"/>
@@ -2400,7 +1482,7 @@
           </w:tcPr>
           <w:p>
             <w:pPr>
-              <w:spacing w:line="312" w:lineRule="auto" w:before="0" w:after="0"/>
+              <w:spacing w:line="288" w:lineRule="auto" w:before="0" w:after="0"/>
               <w:ind w:firstLine="0"/>
               <w:jc w:val="center"/>
             </w:pPr>
@@ -2409,7 +1491,7 @@
                 <w:rFonts w:ascii="Times New Roman" w:hAnsi="Times New Roman"/>
                 <w:b/>
                 <w:color w:val="000000"/>
-                <w:sz w:val="24"/>
+                <w:sz w:val="23"/>
               </w:rPr>
               <w:t>JWT</w:t>
             </w:r>
@@ -2419,10 +1501,10 @@
           <w:tcPr>
             <w:tcW w:type="dxa" w:w="3118"/>
             <w:tcMar>
-              <w:top w:w="80" w:type="dxa"/>
-              <w:bottom w:w="80" w:type="dxa"/>
-              <w:left w:w="120" w:type="dxa"/>
-              <w:right w:w="120" w:type="dxa"/>
+              <w:top w:w="50" w:type="dxa"/>
+              <w:bottom w:w="50" w:type="dxa"/>
+              <w:left w:w="100" w:type="dxa"/>
+              <w:right w:w="100" w:type="dxa"/>
             </w:tcMar>
             <w:tcBorders>
               <w:top w:val="single" w:sz="4" w:space="0" w:color="000000"/>
@@ -2433,7 +1515,7 @@
           </w:tcPr>
           <w:p>
             <w:pPr>
-              <w:spacing w:line="312" w:lineRule="auto" w:before="0" w:after="0"/>
+              <w:spacing w:line="288" w:lineRule="auto" w:before="0" w:after="0"/>
               <w:ind w:firstLine="0"/>
               <w:jc w:val="left"/>
             </w:pPr>
@@ -2441,7 +1523,7 @@
               <w:rPr>
                 <w:rFonts w:ascii="Times New Roman" w:hAnsi="Times New Roman"/>
                 <w:color w:val="000000"/>
-                <w:sz w:val="24"/>
+                <w:sz w:val="23"/>
               </w:rPr>
               <w:t>JSON Web Token</w:t>
             </w:r>
@@ -2451,10 +1533,10 @@
           <w:tcPr>
             <w:tcW w:type="dxa" w:w="3969"/>
             <w:tcMar>
-              <w:top w:w="80" w:type="dxa"/>
-              <w:bottom w:w="80" w:type="dxa"/>
-              <w:left w:w="120" w:type="dxa"/>
-              <w:right w:w="120" w:type="dxa"/>
+              <w:top w:w="50" w:type="dxa"/>
+              <w:bottom w:w="50" w:type="dxa"/>
+              <w:left w:w="100" w:type="dxa"/>
+              <w:right w:w="100" w:type="dxa"/>
             </w:tcMar>
             <w:tcBorders>
               <w:top w:val="single" w:sz="4" w:space="0" w:color="000000"/>
@@ -2465,7 +1547,7 @@
           </w:tcPr>
           <w:p>
             <w:pPr>
-              <w:spacing w:line="312" w:lineRule="auto" w:before="0" w:after="0"/>
+              <w:spacing w:line="288" w:lineRule="auto" w:before="0" w:after="0"/>
               <w:ind w:firstLine="0"/>
               <w:jc w:val="left"/>
             </w:pPr>
@@ -2473,9 +1555,9 @@
               <w:rPr>
                 <w:rFonts w:ascii="Times New Roman" w:hAnsi="Times New Roman"/>
                 <w:color w:val="000000"/>
-                <w:sz w:val="24"/>
+                <w:sz w:val="23"/>
               </w:rPr>
-              <w:t>Chuẩn mã hóa thẻ xác thực phiên đăng nhập phi trạng thái</w:t>
+              <w:t>Chuẩn mã hóa thẻ xác thực phiên đăng nhập</w:t>
             </w:r>
           </w:p>
         </w:tc>
@@ -2488,10 +1570,10 @@
           <w:tcPr>
             <w:tcW w:type="dxa" w:w="1417"/>
             <w:tcMar>
-              <w:top w:w="80" w:type="dxa"/>
-              <w:bottom w:w="80" w:type="dxa"/>
-              <w:left w:w="120" w:type="dxa"/>
-              <w:right w:w="120" w:type="dxa"/>
+              <w:top w:w="50" w:type="dxa"/>
+              <w:bottom w:w="50" w:type="dxa"/>
+              <w:left w:w="100" w:type="dxa"/>
+              <w:right w:w="100" w:type="dxa"/>
             </w:tcMar>
             <w:tcBorders>
               <w:top w:val="single" w:sz="4" w:space="0" w:color="000000"/>
@@ -2502,7 +1584,7 @@
           </w:tcPr>
           <w:p>
             <w:pPr>
-              <w:spacing w:line="312" w:lineRule="auto" w:before="0" w:after="0"/>
+              <w:spacing w:line="288" w:lineRule="auto" w:before="0" w:after="0"/>
               <w:ind w:firstLine="0"/>
               <w:jc w:val="center"/>
             </w:pPr>
@@ -2511,9 +1593,9 @@
                 <w:rFonts w:ascii="Times New Roman" w:hAnsi="Times New Roman"/>
                 <w:b/>
                 <w:color w:val="000000"/>
-                <w:sz w:val="24"/>
+                <w:sz w:val="23"/>
               </w:rPr>
-              <w:t>LMS</w:t>
+              <w:t>NFR</w:t>
             </w:r>
           </w:p>
         </w:tc>
@@ -2521,10 +1603,10 @@
           <w:tcPr>
             <w:tcW w:type="dxa" w:w="3118"/>
             <w:tcMar>
-              <w:top w:w="80" w:type="dxa"/>
-              <w:bottom w:w="80" w:type="dxa"/>
-              <w:left w:w="120" w:type="dxa"/>
-              <w:right w:w="120" w:type="dxa"/>
+              <w:top w:w="50" w:type="dxa"/>
+              <w:bottom w:w="50" w:type="dxa"/>
+              <w:left w:w="100" w:type="dxa"/>
+              <w:right w:w="100" w:type="dxa"/>
             </w:tcMar>
             <w:tcBorders>
               <w:top w:val="single" w:sz="4" w:space="0" w:color="000000"/>
@@ -2535,7 +1617,7 @@
           </w:tcPr>
           <w:p>
             <w:pPr>
-              <w:spacing w:line="312" w:lineRule="auto" w:before="0" w:after="0"/>
+              <w:spacing w:line="288" w:lineRule="auto" w:before="0" w:after="0"/>
               <w:ind w:firstLine="0"/>
               <w:jc w:val="left"/>
             </w:pPr>
@@ -2543,9 +1625,9 @@
               <w:rPr>
                 <w:rFonts w:ascii="Times New Roman" w:hAnsi="Times New Roman"/>
                 <w:color w:val="000000"/>
-                <w:sz w:val="24"/>
+                <w:sz w:val="23"/>
               </w:rPr>
-              <w:t>Learning Management System</w:t>
+              <w:t>Non-Functional Requirement</w:t>
             </w:r>
           </w:p>
         </w:tc>
@@ -2553,10 +1635,10 @@
           <w:tcPr>
             <w:tcW w:type="dxa" w:w="3969"/>
             <w:tcMar>
-              <w:top w:w="80" w:type="dxa"/>
-              <w:bottom w:w="80" w:type="dxa"/>
-              <w:left w:w="120" w:type="dxa"/>
-              <w:right w:w="120" w:type="dxa"/>
+              <w:top w:w="50" w:type="dxa"/>
+              <w:bottom w:w="50" w:type="dxa"/>
+              <w:left w:w="100" w:type="dxa"/>
+              <w:right w:w="100" w:type="dxa"/>
             </w:tcMar>
             <w:tcBorders>
               <w:top w:val="single" w:sz="4" w:space="0" w:color="000000"/>
@@ -2567,7 +1649,7 @@
           </w:tcPr>
           <w:p>
             <w:pPr>
-              <w:spacing w:line="312" w:lineRule="auto" w:before="0" w:after="0"/>
+              <w:spacing w:line="288" w:lineRule="auto" w:before="0" w:after="0"/>
               <w:ind w:firstLine="0"/>
               <w:jc w:val="left"/>
             </w:pPr>
@@ -2575,9 +1657,9 @@
               <w:rPr>
                 <w:rFonts w:ascii="Times New Roman" w:hAnsi="Times New Roman"/>
                 <w:color w:val="000000"/>
-                <w:sz w:val="24"/>
+                <w:sz w:val="23"/>
               </w:rPr>
-              <w:t>Hệ thống quản lý học tập trực tuyến</w:t>
+              <w:t>Yêu cầu phi chức năng (Hiệu năng, Sẵn sàng, Bảo mật)</w:t>
             </w:r>
           </w:p>
         </w:tc>
@@ -2590,10 +1672,10 @@
           <w:tcPr>
             <w:tcW w:type="dxa" w:w="1417"/>
             <w:tcMar>
-              <w:top w:w="80" w:type="dxa"/>
-              <w:bottom w:w="80" w:type="dxa"/>
-              <w:left w:w="120" w:type="dxa"/>
-              <w:right w:w="120" w:type="dxa"/>
+              <w:top w:w="50" w:type="dxa"/>
+              <w:bottom w:w="50" w:type="dxa"/>
+              <w:left w:w="100" w:type="dxa"/>
+              <w:right w:w="100" w:type="dxa"/>
             </w:tcMar>
             <w:tcBorders>
               <w:top w:val="single" w:sz="4" w:space="0" w:color="000000"/>
@@ -2604,7 +1686,7 @@
           </w:tcPr>
           <w:p>
             <w:pPr>
-              <w:spacing w:line="312" w:lineRule="auto" w:before="0" w:after="0"/>
+              <w:spacing w:line="288" w:lineRule="auto" w:before="0" w:after="0"/>
               <w:ind w:firstLine="0"/>
               <w:jc w:val="center"/>
             </w:pPr>
@@ -2613,9 +1695,9 @@
                 <w:rFonts w:ascii="Times New Roman" w:hAnsi="Times New Roman"/>
                 <w:b/>
                 <w:color w:val="000000"/>
-                <w:sz w:val="24"/>
+                <w:sz w:val="23"/>
               </w:rPr>
-              <w:t>LPG</w:t>
+              <w:t>NoSQL</w:t>
             </w:r>
           </w:p>
         </w:tc>
@@ -2623,10 +1705,10 @@
           <w:tcPr>
             <w:tcW w:type="dxa" w:w="3118"/>
             <w:tcMar>
-              <w:top w:w="80" w:type="dxa"/>
-              <w:bottom w:w="80" w:type="dxa"/>
-              <w:left w:w="120" w:type="dxa"/>
-              <w:right w:w="120" w:type="dxa"/>
+              <w:top w:w="50" w:type="dxa"/>
+              <w:bottom w:w="50" w:type="dxa"/>
+              <w:left w:w="100" w:type="dxa"/>
+              <w:right w:w="100" w:type="dxa"/>
             </w:tcMar>
             <w:tcBorders>
               <w:top w:val="single" w:sz="4" w:space="0" w:color="000000"/>
@@ -2637,7 +1719,7 @@
           </w:tcPr>
           <w:p>
             <w:pPr>
-              <w:spacing w:line="312" w:lineRule="auto" w:before="0" w:after="0"/>
+              <w:spacing w:line="288" w:lineRule="auto" w:before="0" w:after="0"/>
               <w:ind w:firstLine="0"/>
               <w:jc w:val="left"/>
             </w:pPr>
@@ -2645,9 +1727,9 @@
               <w:rPr>
                 <w:rFonts w:ascii="Times New Roman" w:hAnsi="Times New Roman"/>
                 <w:color w:val="000000"/>
-                <w:sz w:val="24"/>
+                <w:sz w:val="23"/>
               </w:rPr>
-              <w:t>Labeled Property Graph</w:t>
+              <w:t>Not Only SQL</w:t>
             </w:r>
           </w:p>
         </w:tc>
@@ -2655,10 +1737,10 @@
           <w:tcPr>
             <w:tcW w:type="dxa" w:w="3969"/>
             <w:tcMar>
-              <w:top w:w="80" w:type="dxa"/>
-              <w:bottom w:w="80" w:type="dxa"/>
-              <w:left w:w="120" w:type="dxa"/>
-              <w:right w:w="120" w:type="dxa"/>
+              <w:top w:w="50" w:type="dxa"/>
+              <w:bottom w:w="50" w:type="dxa"/>
+              <w:left w:w="100" w:type="dxa"/>
+              <w:right w:w="100" w:type="dxa"/>
             </w:tcMar>
             <w:tcBorders>
               <w:top w:val="single" w:sz="4" w:space="0" w:color="000000"/>
@@ -2669,7 +1751,7 @@
           </w:tcPr>
           <w:p>
             <w:pPr>
-              <w:spacing w:line="312" w:lineRule="auto" w:before="0" w:after="0"/>
+              <w:spacing w:line="288" w:lineRule="auto" w:before="0" w:after="0"/>
               <w:ind w:firstLine="0"/>
               <w:jc w:val="left"/>
             </w:pPr>
@@ -2677,9 +1759,9 @@
               <w:rPr>
                 <w:rFonts w:ascii="Times New Roman" w:hAnsi="Times New Roman"/>
                 <w:color w:val="000000"/>
-                <w:sz w:val="24"/>
+                <w:sz w:val="23"/>
               </w:rPr>
-              <w:t>Mô hình đồ thị thuộc tính có gán nhãn của hệ quản trị Neo4j</w:t>
+              <w:t>Các hệ quản trị cơ sở dữ liệu phi quan hệ</w:t>
             </w:r>
           </w:p>
         </w:tc>
@@ -2692,10 +1774,10 @@
           <w:tcPr>
             <w:tcW w:type="dxa" w:w="1417"/>
             <w:tcMar>
-              <w:top w:w="80" w:type="dxa"/>
-              <w:bottom w:w="80" w:type="dxa"/>
-              <w:left w:w="120" w:type="dxa"/>
-              <w:right w:w="120" w:type="dxa"/>
+              <w:top w:w="50" w:type="dxa"/>
+              <w:bottom w:w="50" w:type="dxa"/>
+              <w:left w:w="100" w:type="dxa"/>
+              <w:right w:w="100" w:type="dxa"/>
             </w:tcMar>
             <w:tcBorders>
               <w:top w:val="single" w:sz="4" w:space="0" w:color="000000"/>
@@ -2706,7 +1788,7 @@
           </w:tcPr>
           <w:p>
             <w:pPr>
-              <w:spacing w:line="312" w:lineRule="auto" w:before="0" w:after="0"/>
+              <w:spacing w:line="288" w:lineRule="auto" w:before="0" w:after="0"/>
               <w:ind w:firstLine="0"/>
               <w:jc w:val="center"/>
             </w:pPr>
@@ -2715,9 +1797,9 @@
                 <w:rFonts w:ascii="Times New Roman" w:hAnsi="Times New Roman"/>
                 <w:b/>
                 <w:color w:val="000000"/>
-                <w:sz w:val="24"/>
+                <w:sz w:val="23"/>
               </w:rPr>
-              <w:t>LSM-tree</w:t>
+              <w:t>PACELC</w:t>
             </w:r>
           </w:p>
         </w:tc>
@@ -2725,10 +1807,10 @@
           <w:tcPr>
             <w:tcW w:type="dxa" w:w="3118"/>
             <w:tcMar>
-              <w:top w:w="80" w:type="dxa"/>
-              <w:bottom w:w="80" w:type="dxa"/>
-              <w:left w:w="120" w:type="dxa"/>
-              <w:right w:w="120" w:type="dxa"/>
+              <w:top w:w="50" w:type="dxa"/>
+              <w:bottom w:w="50" w:type="dxa"/>
+              <w:left w:w="100" w:type="dxa"/>
+              <w:right w:w="100" w:type="dxa"/>
             </w:tcMar>
             <w:tcBorders>
               <w:top w:val="single" w:sz="4" w:space="0" w:color="000000"/>
@@ -2739,7 +1821,7 @@
           </w:tcPr>
           <w:p>
             <w:pPr>
-              <w:spacing w:line="312" w:lineRule="auto" w:before="0" w:after="0"/>
+              <w:spacing w:line="288" w:lineRule="auto" w:before="0" w:after="0"/>
               <w:ind w:firstLine="0"/>
               <w:jc w:val="left"/>
             </w:pPr>
@@ -2747,9 +1829,9 @@
               <w:rPr>
                 <w:rFonts w:ascii="Times New Roman" w:hAnsi="Times New Roman"/>
                 <w:color w:val="000000"/>
-                <w:sz w:val="24"/>
+                <w:sz w:val="23"/>
               </w:rPr>
-              <w:t>Log-Structured Merge-tree</w:t>
+              <w:t>Partition-Availability/Consistency-Else-Latency/Consistency</w:t>
             </w:r>
           </w:p>
         </w:tc>
@@ -2757,10 +1839,10 @@
           <w:tcPr>
             <w:tcW w:type="dxa" w:w="3969"/>
             <w:tcMar>
-              <w:top w:w="80" w:type="dxa"/>
-              <w:bottom w:w="80" w:type="dxa"/>
-              <w:left w:w="120" w:type="dxa"/>
-              <w:right w:w="120" w:type="dxa"/>
+              <w:top w:w="50" w:type="dxa"/>
+              <w:bottom w:w="50" w:type="dxa"/>
+              <w:left w:w="100" w:type="dxa"/>
+              <w:right w:w="100" w:type="dxa"/>
             </w:tcMar>
             <w:tcBorders>
               <w:top w:val="single" w:sz="4" w:space="0" w:color="000000"/>
@@ -2771,7 +1853,7 @@
           </w:tcPr>
           <w:p>
             <w:pPr>
-              <w:spacing w:line="312" w:lineRule="auto" w:before="0" w:after="0"/>
+              <w:spacing w:line="288" w:lineRule="auto" w:before="0" w:after="0"/>
               <w:ind w:firstLine="0"/>
               <w:jc w:val="left"/>
             </w:pPr>
@@ -2779,9 +1861,9 @@
               <w:rPr>
                 <w:rFonts w:ascii="Times New Roman" w:hAnsi="Times New Roman"/>
                 <w:color w:val="000000"/>
-                <w:sz w:val="24"/>
+                <w:sz w:val="23"/>
               </w:rPr>
-              <w:t>Cấu trúc dữ liệu tối ưu cho tải ghi dồn dập trong Apache Cassandra</w:t>
+              <w:t>Định lý mở rộng đánh đổi giữa Độ trễ và Nhất quán</w:t>
             </w:r>
           </w:p>
         </w:tc>
@@ -2794,10 +1876,10 @@
           <w:tcPr>
             <w:tcW w:type="dxa" w:w="1417"/>
             <w:tcMar>
-              <w:top w:w="80" w:type="dxa"/>
-              <w:bottom w:w="80" w:type="dxa"/>
-              <w:left w:w="120" w:type="dxa"/>
-              <w:right w:w="120" w:type="dxa"/>
+              <w:top w:w="50" w:type="dxa"/>
+              <w:bottom w:w="50" w:type="dxa"/>
+              <w:left w:w="100" w:type="dxa"/>
+              <w:right w:w="100" w:type="dxa"/>
             </w:tcMar>
             <w:tcBorders>
               <w:top w:val="single" w:sz="4" w:space="0" w:color="000000"/>
@@ -2808,7 +1890,7 @@
           </w:tcPr>
           <w:p>
             <w:pPr>
-              <w:spacing w:line="312" w:lineRule="auto" w:before="0" w:after="0"/>
+              <w:spacing w:line="288" w:lineRule="auto" w:before="0" w:after="0"/>
               <w:ind w:firstLine="0"/>
               <w:jc w:val="center"/>
             </w:pPr>
@@ -2817,9 +1899,9 @@
                 <w:rFonts w:ascii="Times New Roman" w:hAnsi="Times New Roman"/>
                 <w:b/>
                 <w:color w:val="000000"/>
-                <w:sz w:val="24"/>
+                <w:sz w:val="23"/>
               </w:rPr>
-              <w:t>NFR</w:t>
+              <w:t>RDBMS</w:t>
             </w:r>
           </w:p>
         </w:tc>
@@ -2827,10 +1909,10 @@
           <w:tcPr>
             <w:tcW w:type="dxa" w:w="3118"/>
             <w:tcMar>
-              <w:top w:w="80" w:type="dxa"/>
-              <w:bottom w:w="80" w:type="dxa"/>
-              <w:left w:w="120" w:type="dxa"/>
-              <w:right w:w="120" w:type="dxa"/>
+              <w:top w:w="50" w:type="dxa"/>
+              <w:bottom w:w="50" w:type="dxa"/>
+              <w:left w:w="100" w:type="dxa"/>
+              <w:right w:w="100" w:type="dxa"/>
             </w:tcMar>
             <w:tcBorders>
               <w:top w:val="single" w:sz="4" w:space="0" w:color="000000"/>
@@ -2841,7 +1923,7 @@
           </w:tcPr>
           <w:p>
             <w:pPr>
-              <w:spacing w:line="312" w:lineRule="auto" w:before="0" w:after="0"/>
+              <w:spacing w:line="288" w:lineRule="auto" w:before="0" w:after="0"/>
               <w:ind w:firstLine="0"/>
               <w:jc w:val="left"/>
             </w:pPr>
@@ -2849,9 +1931,9 @@
               <w:rPr>
                 <w:rFonts w:ascii="Times New Roman" w:hAnsi="Times New Roman"/>
                 <w:color w:val="000000"/>
-                <w:sz w:val="24"/>
+                <w:sz w:val="23"/>
               </w:rPr>
-              <w:t>Non-Functional Requirement</w:t>
+              <w:t>Relational Database Management System</w:t>
             </w:r>
           </w:p>
         </w:tc>
@@ -2859,10 +1941,10 @@
           <w:tcPr>
             <w:tcW w:type="dxa" w:w="3969"/>
             <w:tcMar>
-              <w:top w:w="80" w:type="dxa"/>
-              <w:bottom w:w="80" w:type="dxa"/>
-              <w:left w:w="120" w:type="dxa"/>
-              <w:right w:w="120" w:type="dxa"/>
+              <w:top w:w="50" w:type="dxa"/>
+              <w:bottom w:w="50" w:type="dxa"/>
+              <w:left w:w="100" w:type="dxa"/>
+              <w:right w:w="100" w:type="dxa"/>
             </w:tcMar>
             <w:tcBorders>
               <w:top w:val="single" w:sz="4" w:space="0" w:color="000000"/>
@@ -2873,7 +1955,7 @@
           </w:tcPr>
           <w:p>
             <w:pPr>
-              <w:spacing w:line="312" w:lineRule="auto" w:before="0" w:after="0"/>
+              <w:spacing w:line="288" w:lineRule="auto" w:before="0" w:after="0"/>
               <w:ind w:firstLine="0"/>
               <w:jc w:val="left"/>
             </w:pPr>
@@ -2881,9 +1963,9 @@
               <w:rPr>
                 <w:rFonts w:ascii="Times New Roman" w:hAnsi="Times New Roman"/>
                 <w:color w:val="000000"/>
-                <w:sz w:val="24"/>
+                <w:sz w:val="23"/>
               </w:rPr>
-              <w:t>Yêu cầu phi chức năng (Hiệu năng, Sẵn sàng, Bảo mật...)</w:t>
+              <w:t>Hệ quản trị cơ sở dữ liệu quan hệ</w:t>
             </w:r>
           </w:p>
         </w:tc>
@@ -2896,10 +1978,10 @@
           <w:tcPr>
             <w:tcW w:type="dxa" w:w="1417"/>
             <w:tcMar>
-              <w:top w:w="80" w:type="dxa"/>
-              <w:bottom w:w="80" w:type="dxa"/>
-              <w:left w:w="120" w:type="dxa"/>
-              <w:right w:w="120" w:type="dxa"/>
+              <w:top w:w="50" w:type="dxa"/>
+              <w:bottom w:w="50" w:type="dxa"/>
+              <w:left w:w="100" w:type="dxa"/>
+              <w:right w:w="100" w:type="dxa"/>
             </w:tcMar>
             <w:tcBorders>
               <w:top w:val="single" w:sz="4" w:space="0" w:color="000000"/>
@@ -2910,7 +1992,7 @@
           </w:tcPr>
           <w:p>
             <w:pPr>
-              <w:spacing w:line="312" w:lineRule="auto" w:before="0" w:after="0"/>
+              <w:spacing w:line="288" w:lineRule="auto" w:before="0" w:after="0"/>
               <w:ind w:firstLine="0"/>
               <w:jc w:val="center"/>
             </w:pPr>
@@ -2919,9 +2001,9 @@
                 <w:rFonts w:ascii="Times New Roman" w:hAnsi="Times New Roman"/>
                 <w:b/>
                 <w:color w:val="000000"/>
-                <w:sz w:val="24"/>
+                <w:sz w:val="23"/>
               </w:rPr>
-              <w:t>NoSQL</w:t>
+              <w:t>SRS / SDS</w:t>
             </w:r>
           </w:p>
         </w:tc>
@@ -2929,10 +2011,10 @@
           <w:tcPr>
             <w:tcW w:type="dxa" w:w="3118"/>
             <w:tcMar>
-              <w:top w:w="80" w:type="dxa"/>
-              <w:bottom w:w="80" w:type="dxa"/>
-              <w:left w:w="120" w:type="dxa"/>
-              <w:right w:w="120" w:type="dxa"/>
+              <w:top w:w="50" w:type="dxa"/>
+              <w:bottom w:w="50" w:type="dxa"/>
+              <w:left w:w="100" w:type="dxa"/>
+              <w:right w:w="100" w:type="dxa"/>
             </w:tcMar>
             <w:tcBorders>
               <w:top w:val="single" w:sz="4" w:space="0" w:color="000000"/>
@@ -2943,7 +2025,7 @@
           </w:tcPr>
           <w:p>
             <w:pPr>
-              <w:spacing w:line="312" w:lineRule="auto" w:before="0" w:after="0"/>
+              <w:spacing w:line="288" w:lineRule="auto" w:before="0" w:after="0"/>
               <w:ind w:firstLine="0"/>
               <w:jc w:val="left"/>
             </w:pPr>
@@ -2951,9 +2033,9 @@
               <w:rPr>
                 <w:rFonts w:ascii="Times New Roman" w:hAnsi="Times New Roman"/>
                 <w:color w:val="000000"/>
-                <w:sz w:val="24"/>
+                <w:sz w:val="23"/>
               </w:rPr>
-              <w:t>Not Only SQL</w:t>
+              <w:t>Software Requirements / Design Specification</w:t>
             </w:r>
           </w:p>
         </w:tc>
@@ -2961,10 +2043,10 @@
           <w:tcPr>
             <w:tcW w:type="dxa" w:w="3969"/>
             <w:tcMar>
-              <w:top w:w="80" w:type="dxa"/>
-              <w:bottom w:w="80" w:type="dxa"/>
-              <w:left w:w="120" w:type="dxa"/>
-              <w:right w:w="120" w:type="dxa"/>
+              <w:top w:w="50" w:type="dxa"/>
+              <w:bottom w:w="50" w:type="dxa"/>
+              <w:left w:w="100" w:type="dxa"/>
+              <w:right w:w="100" w:type="dxa"/>
             </w:tcMar>
             <w:tcBorders>
               <w:top w:val="single" w:sz="4" w:space="0" w:color="000000"/>
@@ -2975,7 +2057,7 @@
           </w:tcPr>
           <w:p>
             <w:pPr>
-              <w:spacing w:line="312" w:lineRule="auto" w:before="0" w:after="0"/>
+              <w:spacing w:line="288" w:lineRule="auto" w:before="0" w:after="0"/>
               <w:ind w:firstLine="0"/>
               <w:jc w:val="left"/>
             </w:pPr>
@@ -2983,9 +2065,9 @@
               <w:rPr>
                 <w:rFonts w:ascii="Times New Roman" w:hAnsi="Times New Roman"/>
                 <w:color w:val="000000"/>
-                <w:sz w:val="24"/>
+                <w:sz w:val="23"/>
               </w:rPr>
-              <w:t>Các hệ quản trị cơ sở dữ liệu phi quan hệ hiện đại</w:t>
+              <w:t>Tài liệu đặc tả yêu cầu / thiết kế phần mềm</w:t>
             </w:r>
           </w:p>
         </w:tc>
@@ -2998,10 +2080,10 @@
           <w:tcPr>
             <w:tcW w:type="dxa" w:w="1417"/>
             <w:tcMar>
-              <w:top w:w="80" w:type="dxa"/>
-              <w:bottom w:w="80" w:type="dxa"/>
-              <w:left w:w="120" w:type="dxa"/>
-              <w:right w:w="120" w:type="dxa"/>
+              <w:top w:w="50" w:type="dxa"/>
+              <w:bottom w:w="50" w:type="dxa"/>
+              <w:left w:w="100" w:type="dxa"/>
+              <w:right w:w="100" w:type="dxa"/>
             </w:tcMar>
             <w:tcBorders>
               <w:top w:val="single" w:sz="4" w:space="0" w:color="000000"/>
@@ -3012,7 +2094,7 @@
           </w:tcPr>
           <w:p>
             <w:pPr>
-              <w:spacing w:line="312" w:lineRule="auto" w:before="0" w:after="0"/>
+              <w:spacing w:line="288" w:lineRule="auto" w:before="0" w:after="0"/>
               <w:ind w:firstLine="0"/>
               <w:jc w:val="center"/>
             </w:pPr>
@@ -3021,9 +2103,9 @@
                 <w:rFonts w:ascii="Times New Roman" w:hAnsi="Times New Roman"/>
                 <w:b/>
                 <w:color w:val="000000"/>
-                <w:sz w:val="24"/>
+                <w:sz w:val="23"/>
               </w:rPr>
-              <w:t>PACELC</w:t>
+              <w:t>TC</w:t>
             </w:r>
           </w:p>
         </w:tc>
@@ -3031,10 +2113,10 @@
           <w:tcPr>
             <w:tcW w:type="dxa" w:w="3118"/>
             <w:tcMar>
-              <w:top w:w="80" w:type="dxa"/>
-              <w:bottom w:w="80" w:type="dxa"/>
-              <w:left w:w="120" w:type="dxa"/>
-              <w:right w:w="120" w:type="dxa"/>
+              <w:top w:w="50" w:type="dxa"/>
+              <w:bottom w:w="50" w:type="dxa"/>
+              <w:left w:w="100" w:type="dxa"/>
+              <w:right w:w="100" w:type="dxa"/>
             </w:tcMar>
             <w:tcBorders>
               <w:top w:val="single" w:sz="4" w:space="0" w:color="000000"/>
@@ -3045,7 +2127,7 @@
           </w:tcPr>
           <w:p>
             <w:pPr>
-              <w:spacing w:line="312" w:lineRule="auto" w:before="0" w:after="0"/>
+              <w:spacing w:line="288" w:lineRule="auto" w:before="0" w:after="0"/>
               <w:ind w:firstLine="0"/>
               <w:jc w:val="left"/>
             </w:pPr>
@@ -3053,9 +2135,9 @@
               <w:rPr>
                 <w:rFonts w:ascii="Times New Roman" w:hAnsi="Times New Roman"/>
                 <w:color w:val="000000"/>
-                <w:sz w:val="24"/>
+                <w:sz w:val="23"/>
               </w:rPr>
-              <w:t>Partition-Availability/Consistency-Else-Latency/Consistency</w:t>
+              <w:t>Test Case</w:t>
             </w:r>
           </w:p>
         </w:tc>
@@ -3063,10 +2145,10 @@
           <w:tcPr>
             <w:tcW w:type="dxa" w:w="3969"/>
             <w:tcMar>
-              <w:top w:w="80" w:type="dxa"/>
-              <w:bottom w:w="80" w:type="dxa"/>
-              <w:left w:w="120" w:type="dxa"/>
-              <w:right w:w="120" w:type="dxa"/>
+              <w:top w:w="50" w:type="dxa"/>
+              <w:bottom w:w="50" w:type="dxa"/>
+              <w:left w:w="100" w:type="dxa"/>
+              <w:right w:w="100" w:type="dxa"/>
             </w:tcMar>
             <w:tcBorders>
               <w:top w:val="single" w:sz="4" w:space="0" w:color="000000"/>
@@ -3077,7 +2159,7 @@
           </w:tcPr>
           <w:p>
             <w:pPr>
-              <w:spacing w:line="312" w:lineRule="auto" w:before="0" w:after="0"/>
+              <w:spacing w:line="288" w:lineRule="auto" w:before="0" w:after="0"/>
               <w:ind w:firstLine="0"/>
               <w:jc w:val="left"/>
             </w:pPr>
@@ -3085,823 +2167,7 @@
               <w:rPr>
                 <w:rFonts w:ascii="Times New Roman" w:hAnsi="Times New Roman"/>
                 <w:color w:val="000000"/>
-                <w:sz w:val="24"/>
-              </w:rPr>
-              <w:t>Định lý mở rộng của CAP giải thích sự đánh đổi giữa Độ trễ và Nhất quán khi mạng bình thường</w:t>
-            </w:r>
-          </w:p>
-        </w:tc>
-      </w:tr>
-      <w:tr>
-        <w:trPr>
-          <w:cantSplit/>
-        </w:trPr>
-        <w:tc>
-          <w:tcPr>
-            <w:tcW w:type="dxa" w:w="1417"/>
-            <w:tcMar>
-              <w:top w:w="80" w:type="dxa"/>
-              <w:bottom w:w="80" w:type="dxa"/>
-              <w:left w:w="120" w:type="dxa"/>
-              <w:right w:w="120" w:type="dxa"/>
-            </w:tcMar>
-            <w:tcBorders>
-              <w:top w:val="single" w:sz="4" w:space="0" w:color="000000"/>
-              <w:left w:val="single" w:sz="4" w:space="0" w:color="000000"/>
-              <w:bottom w:val="single" w:sz="4" w:space="0" w:color="000000"/>
-              <w:right w:val="single" w:sz="4" w:space="0" w:color="000000"/>
-            </w:tcBorders>
-          </w:tcPr>
-          <w:p>
-            <w:pPr>
-              <w:spacing w:line="312" w:lineRule="auto" w:before="0" w:after="0"/>
-              <w:ind w:firstLine="0"/>
-              <w:jc w:val="center"/>
-            </w:pPr>
-            <w:r>
-              <w:rPr>
-                <w:rFonts w:ascii="Times New Roman" w:hAnsi="Times New Roman"/>
-                <w:b/>
-                <w:color w:val="000000"/>
-                <w:sz w:val="24"/>
-              </w:rPr>
-              <w:t>RDB</w:t>
-            </w:r>
-          </w:p>
-        </w:tc>
-        <w:tc>
-          <w:tcPr>
-            <w:tcW w:type="dxa" w:w="3118"/>
-            <w:tcMar>
-              <w:top w:w="80" w:type="dxa"/>
-              <w:bottom w:w="80" w:type="dxa"/>
-              <w:left w:w="120" w:type="dxa"/>
-              <w:right w:w="120" w:type="dxa"/>
-            </w:tcMar>
-            <w:tcBorders>
-              <w:top w:val="single" w:sz="4" w:space="0" w:color="000000"/>
-              <w:left w:val="single" w:sz="4" w:space="0" w:color="000000"/>
-              <w:bottom w:val="single" w:sz="4" w:space="0" w:color="000000"/>
-              <w:right w:val="single" w:sz="4" w:space="0" w:color="000000"/>
-            </w:tcBorders>
-          </w:tcPr>
-          <w:p>
-            <w:pPr>
-              <w:spacing w:line="312" w:lineRule="auto" w:before="0" w:after="0"/>
-              <w:ind w:firstLine="0"/>
-              <w:jc w:val="left"/>
-            </w:pPr>
-            <w:r>
-              <w:rPr>
-                <w:rFonts w:ascii="Times New Roman" w:hAnsi="Times New Roman"/>
-                <w:color w:val="000000"/>
-                <w:sz w:val="24"/>
-              </w:rPr>
-              <w:t>Redis Database Backup</w:t>
-            </w:r>
-          </w:p>
-        </w:tc>
-        <w:tc>
-          <w:tcPr>
-            <w:tcW w:type="dxa" w:w="3969"/>
-            <w:tcMar>
-              <w:top w:w="80" w:type="dxa"/>
-              <w:bottom w:w="80" w:type="dxa"/>
-              <w:left w:w="120" w:type="dxa"/>
-              <w:right w:w="120" w:type="dxa"/>
-            </w:tcMar>
-            <w:tcBorders>
-              <w:top w:val="single" w:sz="4" w:space="0" w:color="000000"/>
-              <w:left w:val="single" w:sz="4" w:space="0" w:color="000000"/>
-              <w:bottom w:val="single" w:sz="4" w:space="0" w:color="000000"/>
-              <w:right w:val="single" w:sz="4" w:space="0" w:color="000000"/>
-            </w:tcBorders>
-          </w:tcPr>
-          <w:p>
-            <w:pPr>
-              <w:spacing w:line="312" w:lineRule="auto" w:before="0" w:after="0"/>
-              <w:ind w:firstLine="0"/>
-              <w:jc w:val="left"/>
-            </w:pPr>
-            <w:r>
-              <w:rPr>
-                <w:rFonts w:ascii="Times New Roman" w:hAnsi="Times New Roman"/>
-                <w:color w:val="000000"/>
-                <w:sz w:val="24"/>
-              </w:rPr>
-              <w:t>Cơ chế sao lưu chụp ảnh bộ nhớ RAM của Redis định kỳ xuống đĩa</w:t>
-            </w:r>
-          </w:p>
-        </w:tc>
-      </w:tr>
-      <w:tr>
-        <w:trPr>
-          <w:cantSplit/>
-        </w:trPr>
-        <w:tc>
-          <w:tcPr>
-            <w:tcW w:type="dxa" w:w="1417"/>
-            <w:tcMar>
-              <w:top w:w="80" w:type="dxa"/>
-              <w:bottom w:w="80" w:type="dxa"/>
-              <w:left w:w="120" w:type="dxa"/>
-              <w:right w:w="120" w:type="dxa"/>
-            </w:tcMar>
-            <w:tcBorders>
-              <w:top w:val="single" w:sz="4" w:space="0" w:color="000000"/>
-              <w:left w:val="single" w:sz="4" w:space="0" w:color="000000"/>
-              <w:bottom w:val="single" w:sz="4" w:space="0" w:color="000000"/>
-              <w:right w:val="single" w:sz="4" w:space="0" w:color="000000"/>
-            </w:tcBorders>
-          </w:tcPr>
-          <w:p>
-            <w:pPr>
-              <w:spacing w:line="312" w:lineRule="auto" w:before="0" w:after="0"/>
-              <w:ind w:firstLine="0"/>
-              <w:jc w:val="center"/>
-            </w:pPr>
-            <w:r>
-              <w:rPr>
-                <w:rFonts w:ascii="Times New Roman" w:hAnsi="Times New Roman"/>
-                <w:b/>
-                <w:color w:val="000000"/>
-                <w:sz w:val="24"/>
-              </w:rPr>
-              <w:t>RDBMS</w:t>
-            </w:r>
-          </w:p>
-        </w:tc>
-        <w:tc>
-          <w:tcPr>
-            <w:tcW w:type="dxa" w:w="3118"/>
-            <w:tcMar>
-              <w:top w:w="80" w:type="dxa"/>
-              <w:bottom w:w="80" w:type="dxa"/>
-              <w:left w:w="120" w:type="dxa"/>
-              <w:right w:w="120" w:type="dxa"/>
-            </w:tcMar>
-            <w:tcBorders>
-              <w:top w:val="single" w:sz="4" w:space="0" w:color="000000"/>
-              <w:left w:val="single" w:sz="4" w:space="0" w:color="000000"/>
-              <w:bottom w:val="single" w:sz="4" w:space="0" w:color="000000"/>
-              <w:right w:val="single" w:sz="4" w:space="0" w:color="000000"/>
-            </w:tcBorders>
-          </w:tcPr>
-          <w:p>
-            <w:pPr>
-              <w:spacing w:line="312" w:lineRule="auto" w:before="0" w:after="0"/>
-              <w:ind w:firstLine="0"/>
-              <w:jc w:val="left"/>
-            </w:pPr>
-            <w:r>
-              <w:rPr>
-                <w:rFonts w:ascii="Times New Roman" w:hAnsi="Times New Roman"/>
-                <w:color w:val="000000"/>
-                <w:sz w:val="24"/>
-              </w:rPr>
-              <w:t>Relational Database Management System</w:t>
-            </w:r>
-          </w:p>
-        </w:tc>
-        <w:tc>
-          <w:tcPr>
-            <w:tcW w:type="dxa" w:w="3969"/>
-            <w:tcMar>
-              <w:top w:w="80" w:type="dxa"/>
-              <w:bottom w:w="80" w:type="dxa"/>
-              <w:left w:w="120" w:type="dxa"/>
-              <w:right w:w="120" w:type="dxa"/>
-            </w:tcMar>
-            <w:tcBorders>
-              <w:top w:val="single" w:sz="4" w:space="0" w:color="000000"/>
-              <w:left w:val="single" w:sz="4" w:space="0" w:color="000000"/>
-              <w:bottom w:val="single" w:sz="4" w:space="0" w:color="000000"/>
-              <w:right w:val="single" w:sz="4" w:space="0" w:color="000000"/>
-            </w:tcBorders>
-          </w:tcPr>
-          <w:p>
-            <w:pPr>
-              <w:spacing w:line="312" w:lineRule="auto" w:before="0" w:after="0"/>
-              <w:ind w:firstLine="0"/>
-              <w:jc w:val="left"/>
-            </w:pPr>
-            <w:r>
-              <w:rPr>
-                <w:rFonts w:ascii="Times New Roman" w:hAnsi="Times New Roman"/>
-                <w:color w:val="000000"/>
-                <w:sz w:val="24"/>
-              </w:rPr>
-              <w:t>Hệ quản trị cơ sở dữ liệu quan hệ truyền thống</w:t>
-            </w:r>
-          </w:p>
-        </w:tc>
-      </w:tr>
-      <w:tr>
-        <w:trPr>
-          <w:cantSplit/>
-        </w:trPr>
-        <w:tc>
-          <w:tcPr>
-            <w:tcW w:type="dxa" w:w="1417"/>
-            <w:tcMar>
-              <w:top w:w="80" w:type="dxa"/>
-              <w:bottom w:w="80" w:type="dxa"/>
-              <w:left w:w="120" w:type="dxa"/>
-              <w:right w:w="120" w:type="dxa"/>
-            </w:tcMar>
-            <w:tcBorders>
-              <w:top w:val="single" w:sz="4" w:space="0" w:color="000000"/>
-              <w:left w:val="single" w:sz="4" w:space="0" w:color="000000"/>
-              <w:bottom w:val="single" w:sz="4" w:space="0" w:color="000000"/>
-              <w:right w:val="single" w:sz="4" w:space="0" w:color="000000"/>
-            </w:tcBorders>
-          </w:tcPr>
-          <w:p>
-            <w:pPr>
-              <w:spacing w:line="312" w:lineRule="auto" w:before="0" w:after="0"/>
-              <w:ind w:firstLine="0"/>
-              <w:jc w:val="center"/>
-            </w:pPr>
-            <w:r>
-              <w:rPr>
-                <w:rFonts w:ascii="Times New Roman" w:hAnsi="Times New Roman"/>
-                <w:b/>
-                <w:color w:val="000000"/>
-                <w:sz w:val="24"/>
-              </w:rPr>
-              <w:t>REST</w:t>
-            </w:r>
-          </w:p>
-        </w:tc>
-        <w:tc>
-          <w:tcPr>
-            <w:tcW w:type="dxa" w:w="3118"/>
-            <w:tcMar>
-              <w:top w:w="80" w:type="dxa"/>
-              <w:bottom w:w="80" w:type="dxa"/>
-              <w:left w:w="120" w:type="dxa"/>
-              <w:right w:w="120" w:type="dxa"/>
-            </w:tcMar>
-            <w:tcBorders>
-              <w:top w:val="single" w:sz="4" w:space="0" w:color="000000"/>
-              <w:left w:val="single" w:sz="4" w:space="0" w:color="000000"/>
-              <w:bottom w:val="single" w:sz="4" w:space="0" w:color="000000"/>
-              <w:right w:val="single" w:sz="4" w:space="0" w:color="000000"/>
-            </w:tcBorders>
-          </w:tcPr>
-          <w:p>
-            <w:pPr>
-              <w:spacing w:line="312" w:lineRule="auto" w:before="0" w:after="0"/>
-              <w:ind w:firstLine="0"/>
-              <w:jc w:val="left"/>
-            </w:pPr>
-            <w:r>
-              <w:rPr>
-                <w:rFonts w:ascii="Times New Roman" w:hAnsi="Times New Roman"/>
-                <w:color w:val="000000"/>
-                <w:sz w:val="24"/>
-              </w:rPr>
-              <w:t>Representational State Transfer</w:t>
-            </w:r>
-          </w:p>
-        </w:tc>
-        <w:tc>
-          <w:tcPr>
-            <w:tcW w:type="dxa" w:w="3969"/>
-            <w:tcMar>
-              <w:top w:w="80" w:type="dxa"/>
-              <w:bottom w:w="80" w:type="dxa"/>
-              <w:left w:w="120" w:type="dxa"/>
-              <w:right w:w="120" w:type="dxa"/>
-            </w:tcMar>
-            <w:tcBorders>
-              <w:top w:val="single" w:sz="4" w:space="0" w:color="000000"/>
-              <w:left w:val="single" w:sz="4" w:space="0" w:color="000000"/>
-              <w:bottom w:val="single" w:sz="4" w:space="0" w:color="000000"/>
-              <w:right w:val="single" w:sz="4" w:space="0" w:color="000000"/>
-            </w:tcBorders>
-          </w:tcPr>
-          <w:p>
-            <w:pPr>
-              <w:spacing w:line="312" w:lineRule="auto" w:before="0" w:after="0"/>
-              <w:ind w:firstLine="0"/>
-              <w:jc w:val="left"/>
-            </w:pPr>
-            <w:r>
-              <w:rPr>
-                <w:rFonts w:ascii="Times New Roman" w:hAnsi="Times New Roman"/>
-                <w:color w:val="000000"/>
-                <w:sz w:val="24"/>
-              </w:rPr>
-              <w:t>Kiểu kiến trúc truyền dữ liệu phi trạng thái qua giao thức HTTP</w:t>
-            </w:r>
-          </w:p>
-        </w:tc>
-      </w:tr>
-      <w:tr>
-        <w:trPr>
-          <w:cantSplit/>
-        </w:trPr>
-        <w:tc>
-          <w:tcPr>
-            <w:tcW w:type="dxa" w:w="1417"/>
-            <w:tcMar>
-              <w:top w:w="80" w:type="dxa"/>
-              <w:bottom w:w="80" w:type="dxa"/>
-              <w:left w:w="120" w:type="dxa"/>
-              <w:right w:w="120" w:type="dxa"/>
-            </w:tcMar>
-            <w:tcBorders>
-              <w:top w:val="single" w:sz="4" w:space="0" w:color="000000"/>
-              <w:left w:val="single" w:sz="4" w:space="0" w:color="000000"/>
-              <w:bottom w:val="single" w:sz="4" w:space="0" w:color="000000"/>
-              <w:right w:val="single" w:sz="4" w:space="0" w:color="000000"/>
-            </w:tcBorders>
-          </w:tcPr>
-          <w:p>
-            <w:pPr>
-              <w:spacing w:line="312" w:lineRule="auto" w:before="0" w:after="0"/>
-              <w:ind w:firstLine="0"/>
-              <w:jc w:val="center"/>
-            </w:pPr>
-            <w:r>
-              <w:rPr>
-                <w:rFonts w:ascii="Times New Roman" w:hAnsi="Times New Roman"/>
-                <w:b/>
-                <w:color w:val="000000"/>
-                <w:sz w:val="24"/>
-              </w:rPr>
-              <w:t>SDS</w:t>
-            </w:r>
-          </w:p>
-        </w:tc>
-        <w:tc>
-          <w:tcPr>
-            <w:tcW w:type="dxa" w:w="3118"/>
-            <w:tcMar>
-              <w:top w:w="80" w:type="dxa"/>
-              <w:bottom w:w="80" w:type="dxa"/>
-              <w:left w:w="120" w:type="dxa"/>
-              <w:right w:w="120" w:type="dxa"/>
-            </w:tcMar>
-            <w:tcBorders>
-              <w:top w:val="single" w:sz="4" w:space="0" w:color="000000"/>
-              <w:left w:val="single" w:sz="4" w:space="0" w:color="000000"/>
-              <w:bottom w:val="single" w:sz="4" w:space="0" w:color="000000"/>
-              <w:right w:val="single" w:sz="4" w:space="0" w:color="000000"/>
-            </w:tcBorders>
-          </w:tcPr>
-          <w:p>
-            <w:pPr>
-              <w:spacing w:line="312" w:lineRule="auto" w:before="0" w:after="0"/>
-              <w:ind w:firstLine="0"/>
-              <w:jc w:val="left"/>
-            </w:pPr>
-            <w:r>
-              <w:rPr>
-                <w:rFonts w:ascii="Times New Roman" w:hAnsi="Times New Roman"/>
-                <w:color w:val="000000"/>
-                <w:sz w:val="24"/>
-              </w:rPr>
-              <w:t>Software Design Specification</w:t>
-            </w:r>
-          </w:p>
-        </w:tc>
-        <w:tc>
-          <w:tcPr>
-            <w:tcW w:type="dxa" w:w="3969"/>
-            <w:tcMar>
-              <w:top w:w="80" w:type="dxa"/>
-              <w:bottom w:w="80" w:type="dxa"/>
-              <w:left w:w="120" w:type="dxa"/>
-              <w:right w:w="120" w:type="dxa"/>
-            </w:tcMar>
-            <w:tcBorders>
-              <w:top w:val="single" w:sz="4" w:space="0" w:color="000000"/>
-              <w:left w:val="single" w:sz="4" w:space="0" w:color="000000"/>
-              <w:bottom w:val="single" w:sz="4" w:space="0" w:color="000000"/>
-              <w:right w:val="single" w:sz="4" w:space="0" w:color="000000"/>
-            </w:tcBorders>
-          </w:tcPr>
-          <w:p>
-            <w:pPr>
-              <w:spacing w:line="312" w:lineRule="auto" w:before="0" w:after="0"/>
-              <w:ind w:firstLine="0"/>
-              <w:jc w:val="left"/>
-            </w:pPr>
-            <w:r>
-              <w:rPr>
-                <w:rFonts w:ascii="Times New Roman" w:hAnsi="Times New Roman"/>
-                <w:color w:val="000000"/>
-                <w:sz w:val="24"/>
-              </w:rPr>
-              <w:t>Tài liệu đặc tả thiết kế phần mềm theo chuẩn IEEE 1016</w:t>
-            </w:r>
-          </w:p>
-        </w:tc>
-      </w:tr>
-      <w:tr>
-        <w:trPr>
-          <w:cantSplit/>
-        </w:trPr>
-        <w:tc>
-          <w:tcPr>
-            <w:tcW w:type="dxa" w:w="1417"/>
-            <w:tcMar>
-              <w:top w:w="80" w:type="dxa"/>
-              <w:bottom w:w="80" w:type="dxa"/>
-              <w:left w:w="120" w:type="dxa"/>
-              <w:right w:w="120" w:type="dxa"/>
-            </w:tcMar>
-            <w:tcBorders>
-              <w:top w:val="single" w:sz="4" w:space="0" w:color="000000"/>
-              <w:left w:val="single" w:sz="4" w:space="0" w:color="000000"/>
-              <w:bottom w:val="single" w:sz="4" w:space="0" w:color="000000"/>
-              <w:right w:val="single" w:sz="4" w:space="0" w:color="000000"/>
-            </w:tcBorders>
-          </w:tcPr>
-          <w:p>
-            <w:pPr>
-              <w:spacing w:line="312" w:lineRule="auto" w:before="0" w:after="0"/>
-              <w:ind w:firstLine="0"/>
-              <w:jc w:val="center"/>
-            </w:pPr>
-            <w:r>
-              <w:rPr>
-                <w:rFonts w:ascii="Times New Roman" w:hAnsi="Times New Roman"/>
-                <w:b/>
-                <w:color w:val="000000"/>
-                <w:sz w:val="24"/>
-              </w:rPr>
-              <w:t>SRS</w:t>
-            </w:r>
-          </w:p>
-        </w:tc>
-        <w:tc>
-          <w:tcPr>
-            <w:tcW w:type="dxa" w:w="3118"/>
-            <w:tcMar>
-              <w:top w:w="80" w:type="dxa"/>
-              <w:bottom w:w="80" w:type="dxa"/>
-              <w:left w:w="120" w:type="dxa"/>
-              <w:right w:w="120" w:type="dxa"/>
-            </w:tcMar>
-            <w:tcBorders>
-              <w:top w:val="single" w:sz="4" w:space="0" w:color="000000"/>
-              <w:left w:val="single" w:sz="4" w:space="0" w:color="000000"/>
-              <w:bottom w:val="single" w:sz="4" w:space="0" w:color="000000"/>
-              <w:right w:val="single" w:sz="4" w:space="0" w:color="000000"/>
-            </w:tcBorders>
-          </w:tcPr>
-          <w:p>
-            <w:pPr>
-              <w:spacing w:line="312" w:lineRule="auto" w:before="0" w:after="0"/>
-              <w:ind w:firstLine="0"/>
-              <w:jc w:val="left"/>
-            </w:pPr>
-            <w:r>
-              <w:rPr>
-                <w:rFonts w:ascii="Times New Roman" w:hAnsi="Times New Roman"/>
-                <w:color w:val="000000"/>
-                <w:sz w:val="24"/>
-              </w:rPr>
-              <w:t>Software Requirements Specification</w:t>
-            </w:r>
-          </w:p>
-        </w:tc>
-        <w:tc>
-          <w:tcPr>
-            <w:tcW w:type="dxa" w:w="3969"/>
-            <w:tcMar>
-              <w:top w:w="80" w:type="dxa"/>
-              <w:bottom w:w="80" w:type="dxa"/>
-              <w:left w:w="120" w:type="dxa"/>
-              <w:right w:w="120" w:type="dxa"/>
-            </w:tcMar>
-            <w:tcBorders>
-              <w:top w:val="single" w:sz="4" w:space="0" w:color="000000"/>
-              <w:left w:val="single" w:sz="4" w:space="0" w:color="000000"/>
-              <w:bottom w:val="single" w:sz="4" w:space="0" w:color="000000"/>
-              <w:right w:val="single" w:sz="4" w:space="0" w:color="000000"/>
-            </w:tcBorders>
-          </w:tcPr>
-          <w:p>
-            <w:pPr>
-              <w:spacing w:line="312" w:lineRule="auto" w:before="0" w:after="0"/>
-              <w:ind w:firstLine="0"/>
-              <w:jc w:val="left"/>
-            </w:pPr>
-            <w:r>
-              <w:rPr>
-                <w:rFonts w:ascii="Times New Roman" w:hAnsi="Times New Roman"/>
-                <w:color w:val="000000"/>
-                <w:sz w:val="24"/>
-              </w:rPr>
-              <w:t>Tài liệu đặc tả yêu cầu phần mềm theo chuẩn IEEE 830 / ISO 29148</w:t>
-            </w:r>
-          </w:p>
-        </w:tc>
-      </w:tr>
-      <w:tr>
-        <w:trPr>
-          <w:cantSplit/>
-        </w:trPr>
-        <w:tc>
-          <w:tcPr>
-            <w:tcW w:type="dxa" w:w="1417"/>
-            <w:tcMar>
-              <w:top w:w="80" w:type="dxa"/>
-              <w:bottom w:w="80" w:type="dxa"/>
-              <w:left w:w="120" w:type="dxa"/>
-              <w:right w:w="120" w:type="dxa"/>
-            </w:tcMar>
-            <w:tcBorders>
-              <w:top w:val="single" w:sz="4" w:space="0" w:color="000000"/>
-              <w:left w:val="single" w:sz="4" w:space="0" w:color="000000"/>
-              <w:bottom w:val="single" w:sz="4" w:space="0" w:color="000000"/>
-              <w:right w:val="single" w:sz="4" w:space="0" w:color="000000"/>
-            </w:tcBorders>
-          </w:tcPr>
-          <w:p>
-            <w:pPr>
-              <w:spacing w:line="312" w:lineRule="auto" w:before="0" w:after="0"/>
-              <w:ind w:firstLine="0"/>
-              <w:jc w:val="center"/>
-            </w:pPr>
-            <w:r>
-              <w:rPr>
-                <w:rFonts w:ascii="Times New Roman" w:hAnsi="Times New Roman"/>
-                <w:b/>
-                <w:color w:val="000000"/>
-                <w:sz w:val="24"/>
-              </w:rPr>
-              <w:t>SSTable</w:t>
-            </w:r>
-          </w:p>
-        </w:tc>
-        <w:tc>
-          <w:tcPr>
-            <w:tcW w:type="dxa" w:w="3118"/>
-            <w:tcMar>
-              <w:top w:w="80" w:type="dxa"/>
-              <w:bottom w:w="80" w:type="dxa"/>
-              <w:left w:w="120" w:type="dxa"/>
-              <w:right w:w="120" w:type="dxa"/>
-            </w:tcMar>
-            <w:tcBorders>
-              <w:top w:val="single" w:sz="4" w:space="0" w:color="000000"/>
-              <w:left w:val="single" w:sz="4" w:space="0" w:color="000000"/>
-              <w:bottom w:val="single" w:sz="4" w:space="0" w:color="000000"/>
-              <w:right w:val="single" w:sz="4" w:space="0" w:color="000000"/>
-            </w:tcBorders>
-          </w:tcPr>
-          <w:p>
-            <w:pPr>
-              <w:spacing w:line="312" w:lineRule="auto" w:before="0" w:after="0"/>
-              <w:ind w:firstLine="0"/>
-              <w:jc w:val="left"/>
-            </w:pPr>
-            <w:r>
-              <w:rPr>
-                <w:rFonts w:ascii="Times New Roman" w:hAnsi="Times New Roman"/>
-                <w:color w:val="000000"/>
-                <w:sz w:val="24"/>
-              </w:rPr>
-              <w:t>Sorted String Table</w:t>
-            </w:r>
-          </w:p>
-        </w:tc>
-        <w:tc>
-          <w:tcPr>
-            <w:tcW w:type="dxa" w:w="3969"/>
-            <w:tcMar>
-              <w:top w:w="80" w:type="dxa"/>
-              <w:bottom w:w="80" w:type="dxa"/>
-              <w:left w:w="120" w:type="dxa"/>
-              <w:right w:w="120" w:type="dxa"/>
-            </w:tcMar>
-            <w:tcBorders>
-              <w:top w:val="single" w:sz="4" w:space="0" w:color="000000"/>
-              <w:left w:val="single" w:sz="4" w:space="0" w:color="000000"/>
-              <w:bottom w:val="single" w:sz="4" w:space="0" w:color="000000"/>
-              <w:right w:val="single" w:sz="4" w:space="0" w:color="000000"/>
-            </w:tcBorders>
-          </w:tcPr>
-          <w:p>
-            <w:pPr>
-              <w:spacing w:line="312" w:lineRule="auto" w:before="0" w:after="0"/>
-              <w:ind w:firstLine="0"/>
-              <w:jc w:val="left"/>
-            </w:pPr>
-            <w:r>
-              <w:rPr>
-                <w:rFonts w:ascii="Times New Roman" w:hAnsi="Times New Roman"/>
-                <w:color w:val="000000"/>
-                <w:sz w:val="24"/>
-              </w:rPr>
-              <w:t>Tệp lưu trữ bảng chuỗi có thứ tự bất biến trên đĩa của Cassandra</w:t>
-            </w:r>
-          </w:p>
-        </w:tc>
-      </w:tr>
-      <w:tr>
-        <w:trPr>
-          <w:cantSplit/>
-        </w:trPr>
-        <w:tc>
-          <w:tcPr>
-            <w:tcW w:type="dxa" w:w="1417"/>
-            <w:tcMar>
-              <w:top w:w="80" w:type="dxa"/>
-              <w:bottom w:w="80" w:type="dxa"/>
-              <w:left w:w="120" w:type="dxa"/>
-              <w:right w:w="120" w:type="dxa"/>
-            </w:tcMar>
-            <w:tcBorders>
-              <w:top w:val="single" w:sz="4" w:space="0" w:color="000000"/>
-              <w:left w:val="single" w:sz="4" w:space="0" w:color="000000"/>
-              <w:bottom w:val="single" w:sz="4" w:space="0" w:color="000000"/>
-              <w:right w:val="single" w:sz="4" w:space="0" w:color="000000"/>
-            </w:tcBorders>
-          </w:tcPr>
-          <w:p>
-            <w:pPr>
-              <w:spacing w:line="312" w:lineRule="auto" w:before="0" w:after="0"/>
-              <w:ind w:firstLine="0"/>
-              <w:jc w:val="center"/>
-            </w:pPr>
-            <w:r>
-              <w:rPr>
-                <w:rFonts w:ascii="Times New Roman" w:hAnsi="Times New Roman"/>
-                <w:b/>
-                <w:color w:val="000000"/>
-                <w:sz w:val="24"/>
-              </w:rPr>
-              <w:t>SQL</w:t>
-            </w:r>
-          </w:p>
-        </w:tc>
-        <w:tc>
-          <w:tcPr>
-            <w:tcW w:type="dxa" w:w="3118"/>
-            <w:tcMar>
-              <w:top w:w="80" w:type="dxa"/>
-              <w:bottom w:w="80" w:type="dxa"/>
-              <w:left w:w="120" w:type="dxa"/>
-              <w:right w:w="120" w:type="dxa"/>
-            </w:tcMar>
-            <w:tcBorders>
-              <w:top w:val="single" w:sz="4" w:space="0" w:color="000000"/>
-              <w:left w:val="single" w:sz="4" w:space="0" w:color="000000"/>
-              <w:bottom w:val="single" w:sz="4" w:space="0" w:color="000000"/>
-              <w:right w:val="single" w:sz="4" w:space="0" w:color="000000"/>
-            </w:tcBorders>
-          </w:tcPr>
-          <w:p>
-            <w:pPr>
-              <w:spacing w:line="312" w:lineRule="auto" w:before="0" w:after="0"/>
-              <w:ind w:firstLine="0"/>
-              <w:jc w:val="left"/>
-            </w:pPr>
-            <w:r>
-              <w:rPr>
-                <w:rFonts w:ascii="Times New Roman" w:hAnsi="Times New Roman"/>
-                <w:color w:val="000000"/>
-                <w:sz w:val="24"/>
-              </w:rPr>
-              <w:t>Structured Query Language</w:t>
-            </w:r>
-          </w:p>
-        </w:tc>
-        <w:tc>
-          <w:tcPr>
-            <w:tcW w:type="dxa" w:w="3969"/>
-            <w:tcMar>
-              <w:top w:w="80" w:type="dxa"/>
-              <w:bottom w:w="80" w:type="dxa"/>
-              <w:left w:w="120" w:type="dxa"/>
-              <w:right w:w="120" w:type="dxa"/>
-            </w:tcMar>
-            <w:tcBorders>
-              <w:top w:val="single" w:sz="4" w:space="0" w:color="000000"/>
-              <w:left w:val="single" w:sz="4" w:space="0" w:color="000000"/>
-              <w:bottom w:val="single" w:sz="4" w:space="0" w:color="000000"/>
-              <w:right w:val="single" w:sz="4" w:space="0" w:color="000000"/>
-            </w:tcBorders>
-          </w:tcPr>
-          <w:p>
-            <w:pPr>
-              <w:spacing w:line="312" w:lineRule="auto" w:before="0" w:after="0"/>
-              <w:ind w:firstLine="0"/>
-              <w:jc w:val="left"/>
-            </w:pPr>
-            <w:r>
-              <w:rPr>
-                <w:rFonts w:ascii="Times New Roman" w:hAnsi="Times New Roman"/>
-                <w:color w:val="000000"/>
-                <w:sz w:val="24"/>
-              </w:rPr>
-              <w:t>Ngôn ngữ truy vấn có cấu trúc</w:t>
-            </w:r>
-          </w:p>
-        </w:tc>
-      </w:tr>
-      <w:tr>
-        <w:trPr>
-          <w:cantSplit/>
-        </w:trPr>
-        <w:tc>
-          <w:tcPr>
-            <w:tcW w:type="dxa" w:w="1417"/>
-            <w:tcMar>
-              <w:top w:w="80" w:type="dxa"/>
-              <w:bottom w:w="80" w:type="dxa"/>
-              <w:left w:w="120" w:type="dxa"/>
-              <w:right w:w="120" w:type="dxa"/>
-            </w:tcMar>
-            <w:tcBorders>
-              <w:top w:val="single" w:sz="4" w:space="0" w:color="000000"/>
-              <w:left w:val="single" w:sz="4" w:space="0" w:color="000000"/>
-              <w:bottom w:val="single" w:sz="4" w:space="0" w:color="000000"/>
-              <w:right w:val="single" w:sz="4" w:space="0" w:color="000000"/>
-            </w:tcBorders>
-          </w:tcPr>
-          <w:p>
-            <w:pPr>
-              <w:spacing w:line="312" w:lineRule="auto" w:before="0" w:after="0"/>
-              <w:ind w:firstLine="0"/>
-              <w:jc w:val="center"/>
-            </w:pPr>
-            <w:r>
-              <w:rPr>
-                <w:rFonts w:ascii="Times New Roman" w:hAnsi="Times New Roman"/>
-                <w:b/>
-                <w:color w:val="000000"/>
-                <w:sz w:val="24"/>
-              </w:rPr>
-              <w:t>TC</w:t>
-            </w:r>
-          </w:p>
-        </w:tc>
-        <w:tc>
-          <w:tcPr>
-            <w:tcW w:type="dxa" w:w="3118"/>
-            <w:tcMar>
-              <w:top w:w="80" w:type="dxa"/>
-              <w:bottom w:w="80" w:type="dxa"/>
-              <w:left w:w="120" w:type="dxa"/>
-              <w:right w:w="120" w:type="dxa"/>
-            </w:tcMar>
-            <w:tcBorders>
-              <w:top w:val="single" w:sz="4" w:space="0" w:color="000000"/>
-              <w:left w:val="single" w:sz="4" w:space="0" w:color="000000"/>
-              <w:bottom w:val="single" w:sz="4" w:space="0" w:color="000000"/>
-              <w:right w:val="single" w:sz="4" w:space="0" w:color="000000"/>
-            </w:tcBorders>
-          </w:tcPr>
-          <w:p>
-            <w:pPr>
-              <w:spacing w:line="312" w:lineRule="auto" w:before="0" w:after="0"/>
-              <w:ind w:firstLine="0"/>
-              <w:jc w:val="left"/>
-            </w:pPr>
-            <w:r>
-              <w:rPr>
-                <w:rFonts w:ascii="Times New Roman" w:hAnsi="Times New Roman"/>
-                <w:color w:val="000000"/>
-                <w:sz w:val="24"/>
-              </w:rPr>
-              <w:t>Test Case</w:t>
-            </w:r>
-          </w:p>
-        </w:tc>
-        <w:tc>
-          <w:tcPr>
-            <w:tcW w:type="dxa" w:w="3969"/>
-            <w:tcMar>
-              <w:top w:w="80" w:type="dxa"/>
-              <w:bottom w:w="80" w:type="dxa"/>
-              <w:left w:w="120" w:type="dxa"/>
-              <w:right w:w="120" w:type="dxa"/>
-            </w:tcMar>
-            <w:tcBorders>
-              <w:top w:val="single" w:sz="4" w:space="0" w:color="000000"/>
-              <w:left w:val="single" w:sz="4" w:space="0" w:color="000000"/>
-              <w:bottom w:val="single" w:sz="4" w:space="0" w:color="000000"/>
-              <w:right w:val="single" w:sz="4" w:space="0" w:color="000000"/>
-            </w:tcBorders>
-          </w:tcPr>
-          <w:p>
-            <w:pPr>
-              <w:spacing w:line="312" w:lineRule="auto" w:before="0" w:after="0"/>
-              <w:ind w:firstLine="0"/>
-              <w:jc w:val="left"/>
-            </w:pPr>
-            <w:r>
-              <w:rPr>
-                <w:rFonts w:ascii="Times New Roman" w:hAnsi="Times New Roman"/>
-                <w:color w:val="000000"/>
-                <w:sz w:val="24"/>
+                <w:sz w:val="23"/>
               </w:rPr>
               <w:t>Trường hợp kiểm thử phần mềm</w:t>
             </w:r>
@@ -3916,10 +2182,10 @@
           <w:tcPr>
             <w:tcW w:type="dxa" w:w="1417"/>
             <w:tcMar>
-              <w:top w:w="80" w:type="dxa"/>
-              <w:bottom w:w="80" w:type="dxa"/>
-              <w:left w:w="120" w:type="dxa"/>
-              <w:right w:w="120" w:type="dxa"/>
+              <w:top w:w="50" w:type="dxa"/>
+              <w:bottom w:w="50" w:type="dxa"/>
+              <w:left w:w="100" w:type="dxa"/>
+              <w:right w:w="100" w:type="dxa"/>
             </w:tcMar>
             <w:tcBorders>
               <w:top w:val="single" w:sz="4" w:space="0" w:color="000000"/>
@@ -3930,7 +2196,7 @@
           </w:tcPr>
           <w:p>
             <w:pPr>
-              <w:spacing w:line="312" w:lineRule="auto" w:before="0" w:after="0"/>
+              <w:spacing w:line="288" w:lineRule="auto" w:before="0" w:after="0"/>
               <w:ind w:firstLine="0"/>
               <w:jc w:val="center"/>
             </w:pPr>
@@ -3939,9 +2205,9 @@
                 <w:rFonts w:ascii="Times New Roman" w:hAnsi="Times New Roman"/>
                 <w:b/>
                 <w:color w:val="000000"/>
-                <w:sz w:val="24"/>
+                <w:sz w:val="23"/>
               </w:rPr>
-              <w:t>TOEIC</w:t>
+              <w:t>TTL</w:t>
             </w:r>
           </w:p>
         </w:tc>
@@ -3949,10 +2215,10 @@
           <w:tcPr>
             <w:tcW w:type="dxa" w:w="3118"/>
             <w:tcMar>
-              <w:top w:w="80" w:type="dxa"/>
-              <w:bottom w:w="80" w:type="dxa"/>
-              <w:left w:w="120" w:type="dxa"/>
-              <w:right w:w="120" w:type="dxa"/>
+              <w:top w:w="50" w:type="dxa"/>
+              <w:bottom w:w="50" w:type="dxa"/>
+              <w:left w:w="100" w:type="dxa"/>
+              <w:right w:w="100" w:type="dxa"/>
             </w:tcMar>
             <w:tcBorders>
               <w:top w:val="single" w:sz="4" w:space="0" w:color="000000"/>
@@ -3963,7 +2229,7 @@
           </w:tcPr>
           <w:p>
             <w:pPr>
-              <w:spacing w:line="312" w:lineRule="auto" w:before="0" w:after="0"/>
+              <w:spacing w:line="288" w:lineRule="auto" w:before="0" w:after="0"/>
               <w:ind w:firstLine="0"/>
               <w:jc w:val="left"/>
             </w:pPr>
@@ -3971,9 +2237,9 @@
               <w:rPr>
                 <w:rFonts w:ascii="Times New Roman" w:hAnsi="Times New Roman"/>
                 <w:color w:val="000000"/>
-                <w:sz w:val="24"/>
+                <w:sz w:val="23"/>
               </w:rPr>
-              <w:t>Test of English for International Communication</w:t>
+              <w:t>Time To Live</w:t>
             </w:r>
           </w:p>
         </w:tc>
@@ -3981,10 +2247,10 @@
           <w:tcPr>
             <w:tcW w:type="dxa" w:w="3969"/>
             <w:tcMar>
-              <w:top w:w="80" w:type="dxa"/>
-              <w:bottom w:w="80" w:type="dxa"/>
-              <w:left w:w="120" w:type="dxa"/>
-              <w:right w:w="120" w:type="dxa"/>
+              <w:top w:w="50" w:type="dxa"/>
+              <w:bottom w:w="50" w:type="dxa"/>
+              <w:left w:w="100" w:type="dxa"/>
+              <w:right w:w="100" w:type="dxa"/>
             </w:tcMar>
             <w:tcBorders>
               <w:top w:val="single" w:sz="4" w:space="0" w:color="000000"/>
@@ -3995,7 +2261,7 @@
           </w:tcPr>
           <w:p>
             <w:pPr>
-              <w:spacing w:line="312" w:lineRule="auto" w:before="0" w:after="0"/>
+              <w:spacing w:line="288" w:lineRule="auto" w:before="0" w:after="0"/>
               <w:ind w:firstLine="0"/>
               <w:jc w:val="left"/>
             </w:pPr>
@@ -4003,519 +2269,9 @@
               <w:rPr>
                 <w:rFonts w:ascii="Times New Roman" w:hAnsi="Times New Roman"/>
                 <w:color w:val="000000"/>
-                <w:sz w:val="24"/>
+                <w:sz w:val="23"/>
               </w:rPr>
-              <w:t>Bài kiểm tra tiếng Anh giao tiếp quốc tế</w:t>
-            </w:r>
-          </w:p>
-        </w:tc>
-      </w:tr>
-      <w:tr>
-        <w:trPr>
-          <w:cantSplit/>
-        </w:trPr>
-        <w:tc>
-          <w:tcPr>
-            <w:tcW w:type="dxa" w:w="1417"/>
-            <w:tcMar>
-              <w:top w:w="80" w:type="dxa"/>
-              <w:bottom w:w="80" w:type="dxa"/>
-              <w:left w:w="120" w:type="dxa"/>
-              <w:right w:w="120" w:type="dxa"/>
-            </w:tcMar>
-            <w:tcBorders>
-              <w:top w:val="single" w:sz="4" w:space="0" w:color="000000"/>
-              <w:left w:val="single" w:sz="4" w:space="0" w:color="000000"/>
-              <w:bottom w:val="single" w:sz="4" w:space="0" w:color="000000"/>
-              <w:right w:val="single" w:sz="4" w:space="0" w:color="000000"/>
-            </w:tcBorders>
-          </w:tcPr>
-          <w:p>
-            <w:pPr>
-              <w:spacing w:line="312" w:lineRule="auto" w:before="0" w:after="0"/>
-              <w:ind w:firstLine="0"/>
-              <w:jc w:val="center"/>
-            </w:pPr>
-            <w:r>
-              <w:rPr>
-                <w:rFonts w:ascii="Times New Roman" w:hAnsi="Times New Roman"/>
-                <w:b/>
-                <w:color w:val="000000"/>
-                <w:sz w:val="24"/>
-              </w:rPr>
-              <w:t>TTL</w:t>
-            </w:r>
-          </w:p>
-        </w:tc>
-        <w:tc>
-          <w:tcPr>
-            <w:tcW w:type="dxa" w:w="3118"/>
-            <w:tcMar>
-              <w:top w:w="80" w:type="dxa"/>
-              <w:bottom w:w="80" w:type="dxa"/>
-              <w:left w:w="120" w:type="dxa"/>
-              <w:right w:w="120" w:type="dxa"/>
-            </w:tcMar>
-            <w:tcBorders>
-              <w:top w:val="single" w:sz="4" w:space="0" w:color="000000"/>
-              <w:left w:val="single" w:sz="4" w:space="0" w:color="000000"/>
-              <w:bottom w:val="single" w:sz="4" w:space="0" w:color="000000"/>
-              <w:right w:val="single" w:sz="4" w:space="0" w:color="000000"/>
-            </w:tcBorders>
-          </w:tcPr>
-          <w:p>
-            <w:pPr>
-              <w:spacing w:line="312" w:lineRule="auto" w:before="0" w:after="0"/>
-              <w:ind w:firstLine="0"/>
-              <w:jc w:val="left"/>
-            </w:pPr>
-            <w:r>
-              <w:rPr>
-                <w:rFonts w:ascii="Times New Roman" w:hAnsi="Times New Roman"/>
-                <w:color w:val="000000"/>
-                <w:sz w:val="24"/>
-              </w:rPr>
-              <w:t>Time To Live</w:t>
-            </w:r>
-          </w:p>
-        </w:tc>
-        <w:tc>
-          <w:tcPr>
-            <w:tcW w:type="dxa" w:w="3969"/>
-            <w:tcMar>
-              <w:top w:w="80" w:type="dxa"/>
-              <w:bottom w:w="80" w:type="dxa"/>
-              <w:left w:w="120" w:type="dxa"/>
-              <w:right w:w="120" w:type="dxa"/>
-            </w:tcMar>
-            <w:tcBorders>
-              <w:top w:val="single" w:sz="4" w:space="0" w:color="000000"/>
-              <w:left w:val="single" w:sz="4" w:space="0" w:color="000000"/>
-              <w:bottom w:val="single" w:sz="4" w:space="0" w:color="000000"/>
-              <w:right w:val="single" w:sz="4" w:space="0" w:color="000000"/>
-            </w:tcBorders>
-          </w:tcPr>
-          <w:p>
-            <w:pPr>
-              <w:spacing w:line="312" w:lineRule="auto" w:before="0" w:after="0"/>
-              <w:ind w:firstLine="0"/>
-              <w:jc w:val="left"/>
-            </w:pPr>
-            <w:r>
-              <w:rPr>
-                <w:rFonts w:ascii="Times New Roman" w:hAnsi="Times New Roman"/>
-                <w:color w:val="000000"/>
-                <w:sz w:val="24"/>
-              </w:rPr>
-              <w:t>Thời gian sống tự động hết hạn của dữ liệu trong Redis và Cassandra</w:t>
-            </w:r>
-          </w:p>
-        </w:tc>
-      </w:tr>
-      <w:tr>
-        <w:trPr>
-          <w:cantSplit/>
-        </w:trPr>
-        <w:tc>
-          <w:tcPr>
-            <w:tcW w:type="dxa" w:w="1417"/>
-            <w:tcMar>
-              <w:top w:w="80" w:type="dxa"/>
-              <w:bottom w:w="80" w:type="dxa"/>
-              <w:left w:w="120" w:type="dxa"/>
-              <w:right w:w="120" w:type="dxa"/>
-            </w:tcMar>
-            <w:tcBorders>
-              <w:top w:val="single" w:sz="4" w:space="0" w:color="000000"/>
-              <w:left w:val="single" w:sz="4" w:space="0" w:color="000000"/>
-              <w:bottom w:val="single" w:sz="4" w:space="0" w:color="000000"/>
-              <w:right w:val="single" w:sz="4" w:space="0" w:color="000000"/>
-            </w:tcBorders>
-          </w:tcPr>
-          <w:p>
-            <w:pPr>
-              <w:spacing w:line="312" w:lineRule="auto" w:before="0" w:after="0"/>
-              <w:ind w:firstLine="0"/>
-              <w:jc w:val="center"/>
-            </w:pPr>
-            <w:r>
-              <w:rPr>
-                <w:rFonts w:ascii="Times New Roman" w:hAnsi="Times New Roman"/>
-                <w:b/>
-                <w:color w:val="000000"/>
-                <w:sz w:val="24"/>
-              </w:rPr>
-              <w:t>TWCS</w:t>
-            </w:r>
-          </w:p>
-        </w:tc>
-        <w:tc>
-          <w:tcPr>
-            <w:tcW w:type="dxa" w:w="3118"/>
-            <w:tcMar>
-              <w:top w:w="80" w:type="dxa"/>
-              <w:bottom w:w="80" w:type="dxa"/>
-              <w:left w:w="120" w:type="dxa"/>
-              <w:right w:w="120" w:type="dxa"/>
-            </w:tcMar>
-            <w:tcBorders>
-              <w:top w:val="single" w:sz="4" w:space="0" w:color="000000"/>
-              <w:left w:val="single" w:sz="4" w:space="0" w:color="000000"/>
-              <w:bottom w:val="single" w:sz="4" w:space="0" w:color="000000"/>
-              <w:right w:val="single" w:sz="4" w:space="0" w:color="000000"/>
-            </w:tcBorders>
-          </w:tcPr>
-          <w:p>
-            <w:pPr>
-              <w:spacing w:line="312" w:lineRule="auto" w:before="0" w:after="0"/>
-              <w:ind w:firstLine="0"/>
-              <w:jc w:val="left"/>
-            </w:pPr>
-            <w:r>
-              <w:rPr>
-                <w:rFonts w:ascii="Times New Roman" w:hAnsi="Times New Roman"/>
-                <w:color w:val="000000"/>
-                <w:sz w:val="24"/>
-              </w:rPr>
-              <w:t>Time Window Compaction Strategy</w:t>
-            </w:r>
-          </w:p>
-        </w:tc>
-        <w:tc>
-          <w:tcPr>
-            <w:tcW w:type="dxa" w:w="3969"/>
-            <w:tcMar>
-              <w:top w:w="80" w:type="dxa"/>
-              <w:bottom w:w="80" w:type="dxa"/>
-              <w:left w:w="120" w:type="dxa"/>
-              <w:right w:w="120" w:type="dxa"/>
-            </w:tcMar>
-            <w:tcBorders>
-              <w:top w:val="single" w:sz="4" w:space="0" w:color="000000"/>
-              <w:left w:val="single" w:sz="4" w:space="0" w:color="000000"/>
-              <w:bottom w:val="single" w:sz="4" w:space="0" w:color="000000"/>
-              <w:right w:val="single" w:sz="4" w:space="0" w:color="000000"/>
-            </w:tcBorders>
-          </w:tcPr>
-          <w:p>
-            <w:pPr>
-              <w:spacing w:line="312" w:lineRule="auto" w:before="0" w:after="0"/>
-              <w:ind w:firstLine="0"/>
-              <w:jc w:val="left"/>
-            </w:pPr>
-            <w:r>
-              <w:rPr>
-                <w:rFonts w:ascii="Times New Roman" w:hAnsi="Times New Roman"/>
-                <w:color w:val="000000"/>
-                <w:sz w:val="24"/>
-              </w:rPr>
-              <w:t>Chiến lược nén ghép nối tệp dữ liệu theo cửa sổ thời gian trong Cassandra</w:t>
-            </w:r>
-          </w:p>
-        </w:tc>
-      </w:tr>
-      <w:tr>
-        <w:trPr>
-          <w:cantSplit/>
-        </w:trPr>
-        <w:tc>
-          <w:tcPr>
-            <w:tcW w:type="dxa" w:w="1417"/>
-            <w:tcMar>
-              <w:top w:w="80" w:type="dxa"/>
-              <w:bottom w:w="80" w:type="dxa"/>
-              <w:left w:w="120" w:type="dxa"/>
-              <w:right w:w="120" w:type="dxa"/>
-            </w:tcMar>
-            <w:tcBorders>
-              <w:top w:val="single" w:sz="4" w:space="0" w:color="000000"/>
-              <w:left w:val="single" w:sz="4" w:space="0" w:color="000000"/>
-              <w:bottom w:val="single" w:sz="4" w:space="0" w:color="000000"/>
-              <w:right w:val="single" w:sz="4" w:space="0" w:color="000000"/>
-            </w:tcBorders>
-          </w:tcPr>
-          <w:p>
-            <w:pPr>
-              <w:spacing w:line="312" w:lineRule="auto" w:before="0" w:after="0"/>
-              <w:ind w:firstLine="0"/>
-              <w:jc w:val="center"/>
-            </w:pPr>
-            <w:r>
-              <w:rPr>
-                <w:rFonts w:ascii="Times New Roman" w:hAnsi="Times New Roman"/>
-                <w:b/>
-                <w:color w:val="000000"/>
-                <w:sz w:val="24"/>
-              </w:rPr>
-              <w:t>UI</w:t>
-            </w:r>
-          </w:p>
-        </w:tc>
-        <w:tc>
-          <w:tcPr>
-            <w:tcW w:type="dxa" w:w="3118"/>
-            <w:tcMar>
-              <w:top w:w="80" w:type="dxa"/>
-              <w:bottom w:w="80" w:type="dxa"/>
-              <w:left w:w="120" w:type="dxa"/>
-              <w:right w:w="120" w:type="dxa"/>
-            </w:tcMar>
-            <w:tcBorders>
-              <w:top w:val="single" w:sz="4" w:space="0" w:color="000000"/>
-              <w:left w:val="single" w:sz="4" w:space="0" w:color="000000"/>
-              <w:bottom w:val="single" w:sz="4" w:space="0" w:color="000000"/>
-              <w:right w:val="single" w:sz="4" w:space="0" w:color="000000"/>
-            </w:tcBorders>
-          </w:tcPr>
-          <w:p>
-            <w:pPr>
-              <w:spacing w:line="312" w:lineRule="auto" w:before="0" w:after="0"/>
-              <w:ind w:firstLine="0"/>
-              <w:jc w:val="left"/>
-            </w:pPr>
-            <w:r>
-              <w:rPr>
-                <w:rFonts w:ascii="Times New Roman" w:hAnsi="Times New Roman"/>
-                <w:color w:val="000000"/>
-                <w:sz w:val="24"/>
-              </w:rPr>
-              <w:t>User Interface</w:t>
-            </w:r>
-          </w:p>
-        </w:tc>
-        <w:tc>
-          <w:tcPr>
-            <w:tcW w:type="dxa" w:w="3969"/>
-            <w:tcMar>
-              <w:top w:w="80" w:type="dxa"/>
-              <w:bottom w:w="80" w:type="dxa"/>
-              <w:left w:w="120" w:type="dxa"/>
-              <w:right w:w="120" w:type="dxa"/>
-            </w:tcMar>
-            <w:tcBorders>
-              <w:top w:val="single" w:sz="4" w:space="0" w:color="000000"/>
-              <w:left w:val="single" w:sz="4" w:space="0" w:color="000000"/>
-              <w:bottom w:val="single" w:sz="4" w:space="0" w:color="000000"/>
-              <w:right w:val="single" w:sz="4" w:space="0" w:color="000000"/>
-            </w:tcBorders>
-          </w:tcPr>
-          <w:p>
-            <w:pPr>
-              <w:spacing w:line="312" w:lineRule="auto" w:before="0" w:after="0"/>
-              <w:ind w:firstLine="0"/>
-              <w:jc w:val="left"/>
-            </w:pPr>
-            <w:r>
-              <w:rPr>
-                <w:rFonts w:ascii="Times New Roman" w:hAnsi="Times New Roman"/>
-                <w:color w:val="000000"/>
-                <w:sz w:val="24"/>
-              </w:rPr>
-              <w:t>Giao diện người dùng</w:t>
-            </w:r>
-          </w:p>
-        </w:tc>
-      </w:tr>
-      <w:tr>
-        <w:trPr>
-          <w:cantSplit/>
-        </w:trPr>
-        <w:tc>
-          <w:tcPr>
-            <w:tcW w:type="dxa" w:w="1417"/>
-            <w:tcMar>
-              <w:top w:w="80" w:type="dxa"/>
-              <w:bottom w:w="80" w:type="dxa"/>
-              <w:left w:w="120" w:type="dxa"/>
-              <w:right w:w="120" w:type="dxa"/>
-            </w:tcMar>
-            <w:tcBorders>
-              <w:top w:val="single" w:sz="4" w:space="0" w:color="000000"/>
-              <w:left w:val="single" w:sz="4" w:space="0" w:color="000000"/>
-              <w:bottom w:val="single" w:sz="4" w:space="0" w:color="000000"/>
-              <w:right w:val="single" w:sz="4" w:space="0" w:color="000000"/>
-            </w:tcBorders>
-          </w:tcPr>
-          <w:p>
-            <w:pPr>
-              <w:spacing w:line="312" w:lineRule="auto" w:before="0" w:after="0"/>
-              <w:ind w:firstLine="0"/>
-              <w:jc w:val="center"/>
-            </w:pPr>
-            <w:r>
-              <w:rPr>
-                <w:rFonts w:ascii="Times New Roman" w:hAnsi="Times New Roman"/>
-                <w:b/>
-                <w:color w:val="000000"/>
-                <w:sz w:val="24"/>
-              </w:rPr>
-              <w:t>UX</w:t>
-            </w:r>
-          </w:p>
-        </w:tc>
-        <w:tc>
-          <w:tcPr>
-            <w:tcW w:type="dxa" w:w="3118"/>
-            <w:tcMar>
-              <w:top w:w="80" w:type="dxa"/>
-              <w:bottom w:w="80" w:type="dxa"/>
-              <w:left w:w="120" w:type="dxa"/>
-              <w:right w:w="120" w:type="dxa"/>
-            </w:tcMar>
-            <w:tcBorders>
-              <w:top w:val="single" w:sz="4" w:space="0" w:color="000000"/>
-              <w:left w:val="single" w:sz="4" w:space="0" w:color="000000"/>
-              <w:bottom w:val="single" w:sz="4" w:space="0" w:color="000000"/>
-              <w:right w:val="single" w:sz="4" w:space="0" w:color="000000"/>
-            </w:tcBorders>
-          </w:tcPr>
-          <w:p>
-            <w:pPr>
-              <w:spacing w:line="312" w:lineRule="auto" w:before="0" w:after="0"/>
-              <w:ind w:firstLine="0"/>
-              <w:jc w:val="left"/>
-            </w:pPr>
-            <w:r>
-              <w:rPr>
-                <w:rFonts w:ascii="Times New Roman" w:hAnsi="Times New Roman"/>
-                <w:color w:val="000000"/>
-                <w:sz w:val="24"/>
-              </w:rPr>
-              <w:t>User Experience</w:t>
-            </w:r>
-          </w:p>
-        </w:tc>
-        <w:tc>
-          <w:tcPr>
-            <w:tcW w:type="dxa" w:w="3969"/>
-            <w:tcMar>
-              <w:top w:w="80" w:type="dxa"/>
-              <w:bottom w:w="80" w:type="dxa"/>
-              <w:left w:w="120" w:type="dxa"/>
-              <w:right w:w="120" w:type="dxa"/>
-            </w:tcMar>
-            <w:tcBorders>
-              <w:top w:val="single" w:sz="4" w:space="0" w:color="000000"/>
-              <w:left w:val="single" w:sz="4" w:space="0" w:color="000000"/>
-              <w:bottom w:val="single" w:sz="4" w:space="0" w:color="000000"/>
-              <w:right w:val="single" w:sz="4" w:space="0" w:color="000000"/>
-            </w:tcBorders>
-          </w:tcPr>
-          <w:p>
-            <w:pPr>
-              <w:spacing w:line="312" w:lineRule="auto" w:before="0" w:after="0"/>
-              <w:ind w:firstLine="0"/>
-              <w:jc w:val="left"/>
-            </w:pPr>
-            <w:r>
-              <w:rPr>
-                <w:rFonts w:ascii="Times New Roman" w:hAnsi="Times New Roman"/>
-                <w:color w:val="000000"/>
-                <w:sz w:val="24"/>
-              </w:rPr>
-              <w:t>Trải nghiệm người dùng</w:t>
-            </w:r>
-          </w:p>
-        </w:tc>
-      </w:tr>
-      <w:tr>
-        <w:trPr>
-          <w:cantSplit/>
-        </w:trPr>
-        <w:tc>
-          <w:tcPr>
-            <w:tcW w:type="dxa" w:w="1417"/>
-            <w:tcMar>
-              <w:top w:w="80" w:type="dxa"/>
-              <w:bottom w:w="80" w:type="dxa"/>
-              <w:left w:w="120" w:type="dxa"/>
-              <w:right w:w="120" w:type="dxa"/>
-            </w:tcMar>
-            <w:tcBorders>
-              <w:top w:val="single" w:sz="4" w:space="0" w:color="000000"/>
-              <w:left w:val="single" w:sz="4" w:space="0" w:color="000000"/>
-              <w:bottom w:val="single" w:sz="4" w:space="0" w:color="000000"/>
-              <w:right w:val="single" w:sz="4" w:space="0" w:color="000000"/>
-            </w:tcBorders>
-          </w:tcPr>
-          <w:p>
-            <w:pPr>
-              <w:spacing w:line="312" w:lineRule="auto" w:before="0" w:after="0"/>
-              <w:ind w:firstLine="0"/>
-              <w:jc w:val="center"/>
-            </w:pPr>
-            <w:r>
-              <w:rPr>
-                <w:rFonts w:ascii="Times New Roman" w:hAnsi="Times New Roman"/>
-                <w:b/>
-                <w:color w:val="000000"/>
-                <w:sz w:val="24"/>
-              </w:rPr>
-              <w:t>XP</w:t>
-            </w:r>
-          </w:p>
-        </w:tc>
-        <w:tc>
-          <w:tcPr>
-            <w:tcW w:type="dxa" w:w="3118"/>
-            <w:tcMar>
-              <w:top w:w="80" w:type="dxa"/>
-              <w:bottom w:w="80" w:type="dxa"/>
-              <w:left w:w="120" w:type="dxa"/>
-              <w:right w:w="120" w:type="dxa"/>
-            </w:tcMar>
-            <w:tcBorders>
-              <w:top w:val="single" w:sz="4" w:space="0" w:color="000000"/>
-              <w:left w:val="single" w:sz="4" w:space="0" w:color="000000"/>
-              <w:bottom w:val="single" w:sz="4" w:space="0" w:color="000000"/>
-              <w:right w:val="single" w:sz="4" w:space="0" w:color="000000"/>
-            </w:tcBorders>
-          </w:tcPr>
-          <w:p>
-            <w:pPr>
-              <w:spacing w:line="312" w:lineRule="auto" w:before="0" w:after="0"/>
-              <w:ind w:firstLine="0"/>
-              <w:jc w:val="left"/>
-            </w:pPr>
-            <w:r>
-              <w:rPr>
-                <w:rFonts w:ascii="Times New Roman" w:hAnsi="Times New Roman"/>
-                <w:color w:val="000000"/>
-                <w:sz w:val="24"/>
-              </w:rPr>
-              <w:t>Experience Point</w:t>
-            </w:r>
-          </w:p>
-        </w:tc>
-        <w:tc>
-          <w:tcPr>
-            <w:tcW w:type="dxa" w:w="3969"/>
-            <w:tcMar>
-              <w:top w:w="80" w:type="dxa"/>
-              <w:bottom w:w="80" w:type="dxa"/>
-              <w:left w:w="120" w:type="dxa"/>
-              <w:right w:w="120" w:type="dxa"/>
-            </w:tcMar>
-            <w:tcBorders>
-              <w:top w:val="single" w:sz="4" w:space="0" w:color="000000"/>
-              <w:left w:val="single" w:sz="4" w:space="0" w:color="000000"/>
-              <w:bottom w:val="single" w:sz="4" w:space="0" w:color="000000"/>
-              <w:right w:val="single" w:sz="4" w:space="0" w:color="000000"/>
-            </w:tcBorders>
-          </w:tcPr>
-          <w:p>
-            <w:pPr>
-              <w:spacing w:line="312" w:lineRule="auto" w:before="0" w:after="0"/>
-              <w:ind w:firstLine="0"/>
-              <w:jc w:val="left"/>
-            </w:pPr>
-            <w:r>
-              <w:rPr>
-                <w:rFonts w:ascii="Times New Roman" w:hAnsi="Times New Roman"/>
-                <w:color w:val="000000"/>
-                <w:sz w:val="24"/>
-              </w:rPr>
-              <w:t>Điểm kinh nghiệm tích lũy qua hoạt động học tập dùng đổi quà Gamification</w:t>
+              <w:t>Thời gian tồn tại tự động hết hạn của dữ liệu</w:t>
             </w:r>
           </w:p>
         </w:tc>
@@ -4523,6 +2279,7 @@
     </w:tbl>
     <w:sectPr>
       <w:headerReference w:type="default" r:id="rId9"/>
+      <w:footerReference w:type="default" r:id="rId10"/>
       <w:pgSz w:w="11906" w:h="16838"/>
       <w:pgMar w:top="1417" w:right="1417" w:bottom="1417" w:left="1984" w:header="720" w:footer="720" w:gutter="0"/>
       <w:cols w:space="720"/>
@@ -4530,6 +2287,17 @@
     </w:sectPr>
   </w:body>
 </w:document>
+</file>
+
+<file path=word/footer1.xml><?xml version="1.0" encoding="utf-8"?>
+<w:ftr xmlns:m="http://schemas.openxmlformats.org/officeDocument/2006/math" xmlns:mc="http://schemas.openxmlformats.org/markup-compatibility/2006" xmlns:mo="http://schemas.microsoft.com/office/mac/office/2008/main" xmlns:mv="urn:schemas-microsoft-com:mac:vml" xmlns:o="urn:schemas-microsoft-com:office:office" xmlns:r="http://schemas.openxmlformats.org/officeDocument/2006/relationships" xmlns:v="urn:schemas-microsoft-com:vml" xmlns:w10="urn:schemas-microsoft-com:office:word" xmlns:w14="http://schemas.microsoft.com/office/word/2010/wordml" xmlns:w="http://schemas.openxmlformats.org/wordprocessingml/2006/main" xmlns:wne="http://schemas.microsoft.com/office/word/2006/wordml" xmlns:wp14="http://schemas.microsoft.com/office/word/2010/wordprocessingDrawing" xmlns:wp="http://schemas.openxmlformats.org/drawingml/2006/wordprocessingDrawing" xmlns:wpc="http://schemas.microsoft.com/office/word/2010/wordprocessingCanvas" xmlns:wpg="http://schemas.microsoft.com/office/word/2010/wordprocessingGroup" xmlns:wpi="http://schemas.microsoft.com/office/word/2010/wordprocessingInk" xmlns:wps="http://schemas.microsoft.com/office/word/2010/wordprocessingShape" mc:Ignorable="w14 wp14">
+  <w:p>
+    <w:pPr>
+      <w:pStyle w:val="Footer"/>
+    </w:pPr>
+    <w:r/>
+  </w:p>
+</w:ftr>
 </file>
 
 <file path=word/header1.xml><?xml version="1.0" encoding="utf-8"?>

</xml_diff>